<commit_message>
hill_template added (with jinja templating)
</commit_message>
<xml_diff>
--- a/outputs/Kiran_CV.docx
+++ b/outputs/Kiran_CV.docx
@@ -1,6 +1,6 @@
 
 <file path=word/document.xml><?xml version="1.0" encoding="utf-8"?>
-<w:document xmlns:wpc="http://schemas.microsoft.com/office/word/2010/wordprocessingCanvas" xmlns:cx="http://schemas.microsoft.com/office/drawing/2014/chartex" xmlns:cx1="http://schemas.microsoft.com/office/drawing/2015/9/8/chartex" xmlns:cx2="http://schemas.microsoft.com/office/drawing/2015/10/21/chartex" xmlns:cx3="http://schemas.microsoft.com/office/drawing/2016/5/9/chartex" xmlns:cx4="http://schemas.microsoft.com/office/drawing/2016/5/10/chartex" xmlns:cx5="http://schemas.microsoft.com/office/drawing/2016/5/11/chartex" xmlns:cx6="http://schemas.microsoft.com/office/drawing/2016/5/12/chartex" xmlns:cx7="http://schemas.microsoft.com/office/drawing/2016/5/13/chartex" xmlns:cx8="http://schemas.microsoft.com/office/drawing/2016/5/14/chartex" xmlns:mc="http://schemas.openxmlformats.org/markup-compatibility/2006" xmlns:aink="http://schemas.microsoft.com/office/drawing/2016/ink" xmlns:am3d="http://schemas.microsoft.com/office/drawing/2017/model3d" xmlns:o="urn:schemas-microsoft-com:office:office" xmlns:oel="http://schemas.microsoft.com/office/2019/extlst" xmlns:r="http://schemas.openxmlformats.org/officeDocument/2006/relationships" xmlns:m="http://schemas.openxmlformats.org/officeDocument/2006/math" xmlns:v="urn:schemas-microsoft-com:vml" xmlns:wp14="http://schemas.microsoft.com/office/word/2010/wordprocessingDrawing" xmlns:wp="http://schemas.openxmlformats.org/drawingml/2006/wordprocessingDrawing" xmlns:w10="urn:schemas-microsoft-com:office:word" xmlns:w="http://schemas.openxmlformats.org/wordprocessingml/2006/main" xmlns:w14="http://schemas.microsoft.com/office/word/2010/wordml" xmlns:w15="http://schemas.microsoft.com/office/word/2012/wordml" xmlns:w16cex="http://schemas.microsoft.com/office/word/2018/wordml/cex" xmlns:w16cid="http://schemas.microsoft.com/office/word/2016/wordml/cid" xmlns:w16="http://schemas.microsoft.com/office/word/2018/wordml" xmlns:w16du="http://schemas.microsoft.com/office/word/2023/wordml/word16du" xmlns:w16sdtdh="http://schemas.microsoft.com/office/word/2020/wordml/sdtdatahash" xmlns:w16sdtfl="http://schemas.microsoft.com/office/word/2024/wordml/sdtformatlock" xmlns:w16se="http://schemas.microsoft.com/office/word/2015/wordml/symex" xmlns:wpg="http://schemas.microsoft.com/office/word/2010/wordprocessingGroup" xmlns:wpi="http://schemas.microsoft.com/office/word/2010/wordprocessingInk" xmlns:wne="http://schemas.microsoft.com/office/word/2006/wordml" xmlns:wps="http://schemas.microsoft.com/office/word/2010/wordprocessingShape" mc:Ignorable="w14 w15 w16se w16cid w16 w16cex w16sdtdh w16sdtfl w16du wp14">
+<w:document xmlns:wpc="http://schemas.microsoft.com/office/word/2010/wordprocessingCanvas" xmlns:cx="http://schemas.microsoft.com/office/drawing/2014/chartex" xmlns:cx1="http://schemas.microsoft.com/office/drawing/2015/9/8/chartex" xmlns:cx2="http://schemas.microsoft.com/office/drawing/2015/10/21/chartex" xmlns:cx3="http://schemas.microsoft.com/office/drawing/2016/5/9/chartex" xmlns:cx4="http://schemas.microsoft.com/office/drawing/2016/5/10/chartex" xmlns:cx5="http://schemas.microsoft.com/office/drawing/2016/5/11/chartex" xmlns:cx6="http://schemas.microsoft.com/office/drawing/2016/5/12/chartex" xmlns:cx7="http://schemas.microsoft.com/office/drawing/2016/5/13/chartex" xmlns:cx8="http://schemas.microsoft.com/office/drawing/2016/5/14/chartex" xmlns:mc="http://schemas.openxmlformats.org/markup-compatibility/2006" xmlns:m="http://schemas.openxmlformats.org/officeDocument/2006/math" xmlns:aink="http://schemas.microsoft.com/office/drawing/2016/ink" xmlns:am3d="http://schemas.microsoft.com/office/drawing/2017/model3d" xmlns:oel="http://schemas.microsoft.com/office/2019/extlst" xmlns:r="http://schemas.openxmlformats.org/officeDocument/2006/relationships" xmlns:wp14="http://schemas.microsoft.com/office/word/2010/wordprocessingDrawing" xmlns:wp="http://schemas.openxmlformats.org/drawingml/2006/wordprocessingDrawing" xmlns:wpg="http://schemas.microsoft.com/office/word/2010/wordprocessingGroup" xmlns:wpi="http://schemas.microsoft.com/office/word/2010/wordprocessingInk" xmlns:wps="http://schemas.microsoft.com/office/word/2010/wordprocessingShape" xmlns:o="urn:schemas-microsoft-com:office:office" xmlns:v="urn:schemas-microsoft-com:vml" xmlns:w10="urn:schemas-microsoft-com:office:word" xmlns:w="http://schemas.openxmlformats.org/wordprocessingml/2006/main" xmlns:w14="http://schemas.microsoft.com/office/word/2010/wordml" xmlns:w15="http://schemas.microsoft.com/office/word/2012/wordml" xmlns:w16cex="http://schemas.microsoft.com/office/word/2018/wordml/cex" xmlns:w16cid="http://schemas.microsoft.com/office/word/2016/wordml/cid" xmlns:w16="http://schemas.microsoft.com/office/word/2018/wordml" xmlns:w16sdtdh="http://schemas.microsoft.com/office/word/2020/wordml/sdtdatahash" xmlns:w16sdtfl="http://schemas.microsoft.com/office/word/2024/wordml/sdtformatlock" xmlns:w16se="http://schemas.microsoft.com/office/word/2015/wordml/symex" xmlns:w16du="http://schemas.microsoft.com/office/word/2023/wordml/word16du" xmlns:wne="http://schemas.microsoft.com/office/word/2006/wordml" mc:Ignorable="w14 w15 w16se w16cid w16 w16cex w16sdtdh w16sdtfl w16du wp14">
   <w:body>
     <w:p>
       <w:pPr>
@@ -140,7 +140,7 @@
                 <w:color w:val="E8E8E8" w:themeColor="background2"/>
                 <w:lang w:val="en-US"/>
               </w:rPr>
-              <w:t xml:space="preserve">Quality Assurance Specialist</w:t>
+              <w:t xml:space="preserve">Quality Assurance Specialist (PMC, Supplier, Transport/Avionics Projects)</w:t>
             </w:r>
           </w:p>
         </w:tc>
@@ -506,7 +506,7 @@
                 <w:rFonts w:asciiTheme="minorHAnsi" w:hAnsiTheme="minorHAnsi"/>
                 <w:lang w:val="en-US"/>
               </w:rPr>
-              <w:t xml:space="preserve">Bachelor of Engineering in Electronics &amp; Communication, Electronics &amp; Communication, Kuvempu University - Government, 1999 to 2003</w:t>
+              <w:t xml:space="preserve">Bachelor of Engineering, Electronics &amp; Communication, Kuvempu University - Government, 1999 to 2003</w:t>
               <w:br/>
               <w:t xml:space="preserve">PGD in MBA IBM, International Business Management, 2012 to 2013</w:t>
             </w:r>
@@ -674,7 +674,25 @@
                 <w:rFonts w:asciiTheme="minorHAnsi" w:hAnsiTheme="minorHAnsi"/>
                 <w:lang w:val="en-US"/>
               </w:rPr>
-              <w:t xml:space="preserve"/>
+              <w:t xml:space="preserve">• Built and directed Quality teams with a broad range of expertise in Electronics/Electrical, Critical Hardware/Software systems, and Civil/Mechanical (Steel structures, Welding etc).</w:t>
+              <w:br/>
+              <w:t xml:space="preserve">• Drove Organisational QHSE (Quality, Safety, Health &amp; Environment) initiatives across Organisations, Consortiums, and Contractors.</w:t>
+              <w:br/>
+              <w:t xml:space="preserve">• Led over 150 IMS audits, ensuring comprehensive QSHE compliance among 35+ contractors.</w:t>
+              <w:br/>
+              <w:t xml:space="preserve">• Directed and implemented Corporate/Site QMS and standards specified by ISO 9000 and Contracts.</w:t>
+              <w:br/>
+              <w:t xml:space="preserve">• Applied hands-on experience with tools such as 5 Why analysis, Fishbone diagrams, Pareto analysis, PFMEA/FMEA, etc.</w:t>
+              <w:br/>
+              <w:t xml:space="preserve">• Managed Corporate IMS (Quality, Health, Safety, Environment), ISO Certification, Trainings, KPIs, Alert -Veto-Advise, Audits, and QC tools.</w:t>
+              <w:br/>
+              <w:t xml:space="preserve">• Oversaw Engineering QA, including Gate reviews (Design to FAI), System Safety, SDLC/Agile/Scrum, Design/Coding Standards, and System Testing.</w:t>
+              <w:br/>
+              <w:t xml:space="preserve">• Managed Supplier Quality, including Qualification, Action Closures, Monitoring Performance, and served as Lead Auditor for 100+ IMS Audits across 30 entities.</w:t>
+              <w:br/>
+              <w:t xml:space="preserve">• Handled Site QAQC from Planning till Handover, including PQP, Material approvals/WMS/ITPs, IR/RFI, Problem Solving, Site NCRs, Snaglist, and RCAs.</w:t>
+              <w:br/>
+              <w:t xml:space="preserve">• Supported Chief Quality role, managing Civil (+Mech) teams with experts and auditing 16+ Civil Contractors.</w:t>
             </w:r>
           </w:p>
         </w:tc>
@@ -755,7 +773,7 @@
                 <w:rFonts w:asciiTheme="minorHAnsi" w:hAnsiTheme="minorHAnsi"/>
                 <w:lang w:val="en-US"/>
               </w:rPr>
-              <w:t xml:space="preserve">AI tools, MS office, Excel Automation, SAP, EDMS (Mezzoteam), Testing &amp; CM tools (DOORS/PIVS etc), PMP, SSGB, QMS Foundation, Lead Auditor IRCA/ISO 9001, English, Hindi, Kannada, Telugu, French (DELF A1)</w:t>
+              <w:t xml:space="preserve">PMP, Lead Auditor – ISO 9001, CMQ/OE (In progress), Lead Auditor IRCA/ISO 9001 (8 Yrs.), PMP (10 Yrs.), SSGB, QMS Foundation, ISO 14K/45K Certifications (Pursuing), Bid/Project Quality Assurance, Supplier Qualification, IPCA Airbus (Audit), People Management, AI tools, MS office, Excel Automation, SAP, EDMS (Mezzoteam), Testing &amp; CM tools (DOORS/PIVS), Corp. IMS (Quality, Health, Safety, Environment), ISO Certification, Trainings, KPIs, Alert -Veto-Advise, Audits, QC tools, Engineering QA (Gate reviews, Design to FAI, System Safety, SDLC/Agile/Scrum, Design/Coding Standards, System Testing), Supplier Quality (Qualification, Action Closures, Monitoring Performance, Lead Auditor for 100+ IMS Audits across 30 entities), Site QAQC (Planning till Handover - PQP, Material approvals/WMS/ITPs, IR/RFI, Problem Solving, Site NCRs, Snaglist, RCAs), Civil (+Mech) Quality Management, 5 Why analysis, Fishbone diagrams, Pareto analysis, PFMEA/FMEA, Proactive, Self-starter, Effective communicator, Mentor, Quality as a Culture (First Time Right, Zero defects)</w:t>
             </w:r>
           </w:p>
         </w:tc>
@@ -995,7 +1013,7 @@
                 <w:color w:val="FFFFFF"/>
                 <w:lang w:val="en-US"/>
               </w:rPr>
-              <w:t xml:space="preserve">Assignment</w:t>
+              <w:t>Assignment</w:t>
             </w:r>
           </w:p>
         </w:tc>
@@ -1099,7 +1117,7 @@
                 <w:rFonts w:ascii="Aptos" w:hAnsi="Aptos"/>
                 <w:lang w:val="en-IN"/>
               </w:rPr>
-              <w:t xml:space="preserve">Freelancer</w:t>
+              <w:t xml:space="preserve"/>
             </w:r>
           </w:p>
           <w:p>
@@ -1160,7 +1178,7 @@
                 <w:rFonts w:ascii="Aptos" w:hAnsi="Aptos"/>
                 <w:lang w:val="en-IN"/>
               </w:rPr>
-              <w:t xml:space="preserve">Quality Assurance Specialist</w:t>
+              <w:t xml:space="preserve">Quality Assurance Specialist (PMC, Supplier, Transport/Avionics Projects)</w:t>
             </w:r>
           </w:p>
           <w:p>
@@ -1334,7 +1352,7 @@
                 <w:lang w:val="en-IN"/>
               </w:rPr>
               <w:lastRenderedPageBreak/>
-              <w:t xml:space="preserve">Quality Assurance Specialist</w:t>
+              <w:t xml:space="preserve">Quality Assurance Specialist (PMC, Supplier, Transport/Avionics Projects)</w:t>
             </w:r>
           </w:p>
           <w:p>
@@ -1592,7 +1610,7 @@
                 <w:bCs/>
                 <w:lang w:val="en-IN"/>
               </w:rPr>
-              <w:t xml:space="preserve">Activities Performed:</w:t>
+              <w:t>Activities Performed:</w:t>
             </w:r>
             <w:r>
               <w:rPr>
@@ -1625,7 +1643,7 @@
                 <w:rFonts w:ascii="Aptos" w:hAnsi="Aptos"/>
                 <w:lang w:val="en-IN"/>
               </w:rPr>
-              <w:t xml:space="preserve">• QA: Corporate QMS, Reviews (project, documents, Issues) and Audits (IMS, Supplier Qualification, Issue based)</w:t>
+              <w:t xml:space="preserve">• Performed QA activities including Corporate QMS, project reviews, document reviews, issue reviews, and audits (IMS, Supplier Qualification, Issue based).</w:t>
             </w:r>
           </w:p>
           <w:p>
@@ -1659,7 +1677,7 @@
                 <w:rFonts w:ascii="Aptos" w:hAnsi="Aptos"/>
                 <w:lang w:val="en-IN"/>
               </w:rPr>
-              <w:t xml:space="preserve">• QC: ITP reviews, On Site Inspections (FAT, China), Supplier Procurement Follow-up Actions</w:t>
+              <w:t xml:space="preserve">• Conducted QC activities such as ITP reviews, on-site inspections (FAT, China), and supplier procurement follow-up actions.</w:t>
             </w:r>
           </w:p>
           <w:p>
@@ -1715,7 +1733,7 @@
                 <w:color w:val="05436E"/>
                 <w:lang w:val="en-US"/>
               </w:rPr>
-              <w:t xml:space="preserve">09'19-09`2024</w:t>
+              <w:t xml:space="preserve">09’2019-09`2024</w:t>
             </w:r>
           </w:p>
           <w:p>
@@ -1738,7 +1756,7 @@
                 <w:color w:val="05436E"/>
                 <w:lang w:val="en-US"/>
               </w:rPr>
-              <w:t xml:space="preserve">5 Y</w:t>
+              <w:t xml:space="preserve"/>
             </w:r>
           </w:p>
           <w:p>
@@ -1850,7 +1868,7 @@
                 <w:rFonts w:ascii="Aptos" w:hAnsi="Aptos"/>
                 <w:lang w:val="en-IN"/>
               </w:rPr>
-              <w:t xml:space="preserve">Senior QA/QC Expert</w:t>
+              <w:t xml:space="preserve">PMC – Senior Quality Assurance Expert (Systems)</w:t>
             </w:r>
           </w:p>
           <w:p>
@@ -2024,7 +2042,7 @@
                 <w:lang w:val="en-IN"/>
               </w:rPr>
               <w:lastRenderedPageBreak/>
-              <w:t xml:space="preserve">Senior QA/QC Expert</w:t>
+              <w:t xml:space="preserve">PMC – Senior Quality Assurance Expert (Systems)</w:t>
             </w:r>
           </w:p>
           <w:p>
@@ -2217,7 +2235,7 @@
                 <w:rFonts w:ascii="Aptos" w:hAnsi="Aptos"/>
                 <w:lang w:val="en-IN"/>
               </w:rPr>
-              <w:t xml:space="preserve">09'19-09`2024</w:t>
+              <w:t xml:space="preserve">09’2019-09`2024</w:t>
             </w:r>
           </w:p>
           <w:p>
@@ -2253,36 +2271,36 @@
                 <w:rFonts w:ascii="Aptos" w:hAnsi="Aptos"/>
                 <w:lang w:val="en-IN"/>
               </w:rPr>
-              <w:t xml:space="preserve">Telecom/Power Supply/Traction/Telecom/MEP/L&amp;E/TVS-ECS/PSD/Signalling/Rolling Stock/AFC/S&amp;S etc</w:t>
-            </w:r>
-          </w:p>
-          <w:p>
-            <w:pPr>
-              <w:spacing w:before="60" w:after="60" w:line="240" w:lineRule="auto"/>
-              <w:jc w:val="both"/>
-              <w:rPr>
-                <w:rFonts w:ascii="Aptos" w:hAnsi="Aptos"/>
-                <w:lang w:val="en-IN"/>
-              </w:rPr>
-            </w:pPr>
-          </w:p>
-          <w:p>
-            <w:pPr>
-              <w:spacing w:before="60" w:after="60" w:line="240" w:lineRule="auto"/>
-              <w:jc w:val="both"/>
-              <w:rPr>
-                <w:rFonts w:ascii="Aptos" w:hAnsi="Aptos"/>
-                <w:lang w:val="en-IN"/>
-              </w:rPr>
-            </w:pPr>
-            <w:r>
-              <w:rPr>
-                <w:rFonts w:ascii="Aptos" w:hAnsi="Aptos"/>
-                <w:b/>
-                <w:bCs/>
-                <w:lang w:val="en-IN"/>
-              </w:rPr>
-              <w:t xml:space="preserve">Activities Performed:</w:t>
+              <w:t xml:space="preserve">QA Surveillance of Systems Works for Line 1 and Line2 (Viaduct, UG, Depots); Systems: Telecom/Power Supply/Traction/Telecom/MEP/L&amp;E/TVS-ECS/PSD/Signalling/Rolling Stock/AFC/S&amp;S etc.</w:t>
+            </w:r>
+          </w:p>
+          <w:p>
+            <w:pPr>
+              <w:spacing w:before="60" w:after="60" w:line="240" w:lineRule="auto"/>
+              <w:jc w:val="both"/>
+              <w:rPr>
+                <w:rFonts w:ascii="Aptos" w:hAnsi="Aptos"/>
+                <w:lang w:val="en-IN"/>
+              </w:rPr>
+            </w:pPr>
+          </w:p>
+          <w:p>
+            <w:pPr>
+              <w:spacing w:before="60" w:after="60" w:line="240" w:lineRule="auto"/>
+              <w:jc w:val="both"/>
+              <w:rPr>
+                <w:rFonts w:ascii="Aptos" w:hAnsi="Aptos"/>
+                <w:lang w:val="en-IN"/>
+              </w:rPr>
+            </w:pPr>
+            <w:r>
+              <w:rPr>
+                <w:rFonts w:ascii="Aptos" w:hAnsi="Aptos"/>
+                <w:b/>
+                <w:bCs/>
+                <w:lang w:val="en-IN"/>
+              </w:rPr>
+              <w:t>Activities Performed:</w:t>
             </w:r>
             <w:r>
               <w:rPr>
@@ -2315,7 +2333,7 @@
                 <w:rFonts w:ascii="Aptos" w:hAnsi="Aptos"/>
                 <w:lang w:val="en-IN"/>
               </w:rPr>
-              <w:t xml:space="preserve">• QA Surveillance role, handling 14+ Contractors in PMC/GC role to Maha-Metro Rail Corporation</w:t>
+              <w:t xml:space="preserve">• Managed 14+ Contractor Quality teams in a customer-facing PMC/GC role for Maha-Metro Rail Corporation, overseeing initialization, monitoring, and control.</w:t>
             </w:r>
           </w:p>
           <w:p>
@@ -2349,7 +2367,7 @@
                 <w:rFonts w:ascii="Aptos" w:hAnsi="Aptos"/>
                 <w:lang w:val="en-IN"/>
               </w:rPr>
-              <w:t xml:space="preserve">• Customer facing role with 14+ Contractor Quality teams to manage (Initialise, Monitoring &amp; Control)</w:t>
+              <w:t xml:space="preserve">• Established, tailored, and maintained the internal QMS (Manual); approved Contractors' QMS, and mentored/trained teams.</w:t>
             </w:r>
           </w:p>
           <w:p>
@@ -2383,7 +2401,7 @@
                 <w:rFonts w:ascii="Aptos" w:hAnsi="Aptos"/>
                 <w:lang w:val="en-IN"/>
               </w:rPr>
-              <w:t xml:space="preserve">• QMS: Established, Tailored &amp; Maintain internal QMS(Manual); Approved Contractors` QMS, Mentor/Trained teams</w:t>
+              <w:t xml:space="preserve">• Approved QA/QC plans (+MS/ITP/Checklists) and QA/QC resources based on expertise review.</w:t>
             </w:r>
           </w:p>
           <w:p>
@@ -2417,7 +2435,7 @@
                 <w:rFonts w:ascii="Aptos" w:hAnsi="Aptos"/>
                 <w:lang w:val="en-IN"/>
               </w:rPr>
-              <w:t xml:space="preserve">• Approved QA/QC plans(+MS/ITP/Checklists), QA/QC resources based on expertise review</w:t>
+              <w:t xml:space="preserve">• Witnessed critical RFIs/FAT events for material, installation, and testing activities.</w:t>
             </w:r>
           </w:p>
           <w:p>
@@ -2451,7 +2469,7 @@
                 <w:rFonts w:ascii="Aptos" w:hAnsi="Aptos"/>
                 <w:lang w:val="en-IN"/>
               </w:rPr>
-              <w:t xml:space="preserve">• Witnessed critical RFIs/FAT events of Material/Installation/Testing activities</w:t>
+              <w:t xml:space="preserve">• Implemented Site QA/QC plans through regular audits, site visits, reviews, RCAs, and related record management (KPIs/OBS/NCRs/Snag list).</w:t>
             </w:r>
           </w:p>
           <w:p>
@@ -2485,7 +2503,7 @@
                 <w:rFonts w:ascii="Aptos" w:hAnsi="Aptos"/>
                 <w:lang w:val="en-IN"/>
               </w:rPr>
-              <w:t xml:space="preserve">• Implemented Site QA/QC plans through regular Audits/Site Visits/Reviews/RCAs &amp; related records (KPIs/OBS/NCRs/Snag list)</w:t>
+              <w:t xml:space="preserve">• Conducted Management reviews and Customer Site Visits, CMRS (System Safety) Visits, and followed up on actions to closure.</w:t>
             </w:r>
           </w:p>
           <w:p>
@@ -2519,7 +2537,7 @@
                 <w:rFonts w:ascii="Aptos" w:hAnsi="Aptos"/>
                 <w:lang w:val="en-IN"/>
               </w:rPr>
-              <w:t xml:space="preserve">• Conducted Management reviews and Customer Site Visits, CMRS (System Safety) Visits and followed-up actions to closure</w:t>
+              <w:t xml:space="preserve">• Reviewed the status of Contractors and Customer (QRM ppt); monitored KPIs, and ensured lessons learned were managed.</w:t>
             </w:r>
           </w:p>
           <w:p>
@@ -2553,41 +2571,7 @@
                 <w:rFonts w:ascii="Aptos" w:hAnsi="Aptos"/>
                 <w:lang w:val="en-IN"/>
               </w:rPr>
-              <w:t xml:space="preserve">• Reviewed status of Contractors and Customer (QRM ppt) ; Monitored KPIs, Ensured Lessons learnt were managed</w:t>
-            </w:r>
-          </w:p>
-          <w:p>
-            <w:pPr>
-              <w:spacing w:before="60" w:after="60" w:line="240" w:lineRule="auto"/>
-              <w:jc w:val="both"/>
-              <w:rPr>
-                <w:rFonts w:ascii="Aptos" w:hAnsi="Aptos"/>
-                <w:lang w:val="en-US"/>
-              </w:rPr>
-            </w:pPr>
-            <w:r>
-              <w:rPr>
-                <w:rFonts w:ascii="Aptos" w:hAnsi="Aptos"/>
-                <w:lang w:val="en-IN"/>
-              </w:rPr>
-              <w:t xml:space="preserve"/>
-            </w:r>
-          </w:p>
-          <w:p>
-            <w:pPr>
-              <w:spacing w:before="60" w:after="60" w:line="240" w:lineRule="auto"/>
-              <w:jc w:val="both"/>
-              <w:rPr>
-                <w:rFonts w:ascii="Aptos" w:hAnsi="Aptos"/>
-                <w:lang w:val="en-IN"/>
-              </w:rPr>
-            </w:pPr>
-            <w:r>
-              <w:rPr>
-                <w:rFonts w:ascii="Aptos" w:hAnsi="Aptos"/>
-                <w:lang w:val="en-IN"/>
-              </w:rPr>
-              <w:t xml:space="preserve">• Supervised Lab activities (Contract issues, Tracking testing performance, Invoices etc)</w:t>
+              <w:t xml:space="preserve">• Supervised Lab activities, including contract issues, tracking testing performance, and invoices.</w:t>
             </w:r>
           </w:p>
           <w:p>
@@ -2643,7 +2627,7 @@
                 <w:color w:val="05436E"/>
                 <w:lang w:val="en-US"/>
               </w:rPr>
-              <w:t xml:space="preserve">03'2018-08'2019</w:t>
+              <w:t xml:space="preserve">03’2018-08’2019</w:t>
             </w:r>
           </w:p>
           <w:p>
@@ -2666,7 +2650,7 @@
                 <w:color w:val="05436E"/>
                 <w:lang w:val="en-US"/>
               </w:rPr>
-              <w:t xml:space="preserve">1 Y 5 M</w:t>
+              <w:t xml:space="preserve"/>
             </w:r>
           </w:p>
           <w:p>
@@ -2717,7 +2701,7 @@
                 <w:rFonts w:ascii="Aptos" w:hAnsi="Aptos"/>
                 <w:lang w:val="en-IN"/>
               </w:rPr>
-              <w:t xml:space="preserve">EEPL</w:t>
+              <w:t xml:space="preserve">EEPL, India</w:t>
             </w:r>
           </w:p>
           <w:p>
@@ -3145,7 +3129,7 @@
                 <w:rFonts w:ascii="Aptos" w:hAnsi="Aptos"/>
                 <w:lang w:val="en-IN"/>
               </w:rPr>
-              <w:t xml:space="preserve">03'2018-08'2019</w:t>
+              <w:t xml:space="preserve">03’2018-08’2019</w:t>
             </w:r>
           </w:p>
           <w:p>
@@ -3181,36 +3165,36 @@
                 <w:rFonts w:ascii="Aptos" w:hAnsi="Aptos"/>
                 <w:lang w:val="en-IN"/>
               </w:rPr>
-              <w:t xml:space="preserve">ELV / Embedded Systems (IoT Hardware and Software) and Supplier Management</w:t>
-            </w:r>
-          </w:p>
-          <w:p>
-            <w:pPr>
-              <w:spacing w:before="60" w:after="60" w:line="240" w:lineRule="auto"/>
-              <w:jc w:val="both"/>
-              <w:rPr>
-                <w:rFonts w:ascii="Aptos" w:hAnsi="Aptos"/>
-                <w:lang w:val="en-IN"/>
-              </w:rPr>
-            </w:pPr>
-          </w:p>
-          <w:p>
-            <w:pPr>
-              <w:spacing w:before="60" w:after="60" w:line="240" w:lineRule="auto"/>
-              <w:jc w:val="both"/>
-              <w:rPr>
-                <w:rFonts w:ascii="Aptos" w:hAnsi="Aptos"/>
-                <w:lang w:val="en-IN"/>
-              </w:rPr>
-            </w:pPr>
-            <w:r>
-              <w:rPr>
-                <w:rFonts w:ascii="Aptos" w:hAnsi="Aptos"/>
-                <w:b/>
-                <w:bCs/>
-                <w:lang w:val="en-IN"/>
-              </w:rPr>
-              <w:t xml:space="preserve">Activities Performed:</w:t>
+              <w:t xml:space="preserve">Systems: ELV / Embedded Systems (IoT Hardware and Software) and Supplier Management</w:t>
+            </w:r>
+          </w:p>
+          <w:p>
+            <w:pPr>
+              <w:spacing w:before="60" w:after="60" w:line="240" w:lineRule="auto"/>
+              <w:jc w:val="both"/>
+              <w:rPr>
+                <w:rFonts w:ascii="Aptos" w:hAnsi="Aptos"/>
+                <w:lang w:val="en-IN"/>
+              </w:rPr>
+            </w:pPr>
+          </w:p>
+          <w:p>
+            <w:pPr>
+              <w:spacing w:before="60" w:after="60" w:line="240" w:lineRule="auto"/>
+              <w:jc w:val="both"/>
+              <w:rPr>
+                <w:rFonts w:ascii="Aptos" w:hAnsi="Aptos"/>
+                <w:lang w:val="en-IN"/>
+              </w:rPr>
+            </w:pPr>
+            <w:r>
+              <w:rPr>
+                <w:rFonts w:ascii="Aptos" w:hAnsi="Aptos"/>
+                <w:b/>
+                <w:bCs/>
+                <w:lang w:val="en-IN"/>
+              </w:rPr>
+              <w:t>Activities Performed:</w:t>
             </w:r>
             <w:r>
               <w:rPr>
@@ -3243,7 +3227,7 @@
                 <w:rFonts w:ascii="Aptos" w:hAnsi="Aptos"/>
                 <w:lang w:val="en-IN"/>
               </w:rPr>
-              <w:t xml:space="preserve">• SPOC for QA/QC activities from Concept-Implementation of IoT products</w:t>
+              <w:t xml:space="preserve">• Served as the Single Point of Contact (SPOC) for QA/QC activities from concept to implementation of IoT products.</w:t>
             </w:r>
           </w:p>
           <w:p>
@@ -3277,7 +3261,7 @@
                 <w:rFonts w:ascii="Aptos" w:hAnsi="Aptos"/>
                 <w:lang w:val="en-IN"/>
               </w:rPr>
-              <w:t xml:space="preserve">• Established and maintained the QMS implementing the “Culture of Quality” with focus on COPQ</w:t>
+              <w:t xml:space="preserve">• Established and maintained the QMS, implementing a 'Culture of Quality' with a focus on Cost of Poor Quality (COPQ).</w:t>
             </w:r>
           </w:p>
           <w:p>
@@ -3311,7 +3295,7 @@
                 <w:rFonts w:ascii="Aptos" w:hAnsi="Aptos"/>
                 <w:lang w:val="en-IN"/>
               </w:rPr>
-              <w:t xml:space="preserve">• Supplier Management (Qualification, Audits and performance monitoring)</w:t>
+              <w:t xml:space="preserve">• Managed suppliers, including qualification, audits, and performance monitoring.</w:t>
             </w:r>
           </w:p>
           <w:p>
@@ -3367,7 +3351,7 @@
                 <w:color w:val="05436E"/>
                 <w:lang w:val="en-US"/>
               </w:rPr>
-              <w:t xml:space="preserve">01'16-02'18</w:t>
+              <w:t xml:space="preserve">01’2016-02’2018</w:t>
             </w:r>
           </w:p>
           <w:p>
@@ -3390,7 +3374,7 @@
                 <w:color w:val="05436E"/>
                 <w:lang w:val="en-US"/>
               </w:rPr>
-              <w:t xml:space="preserve">2 Y 1 M</w:t>
+              <w:t xml:space="preserve"/>
             </w:r>
           </w:p>
           <w:p>
@@ -3502,7 +3486,7 @@
                 <w:rFonts w:ascii="Aptos" w:hAnsi="Aptos"/>
                 <w:lang w:val="en-IN"/>
               </w:rPr>
-              <w:t xml:space="preserve">Global Quality Assurance Manager</w:t>
+              <w:t xml:space="preserve">Global Quality Assurance Manager (Offshore-Onshore)</w:t>
             </w:r>
           </w:p>
           <w:p>
@@ -3676,7 +3660,7 @@
                 <w:lang w:val="en-IN"/>
               </w:rPr>
               <w:lastRenderedPageBreak/>
-              <w:t xml:space="preserve">Global Quality Assurance Manager</w:t>
+              <w:t xml:space="preserve">Global Quality Assurance Manager (Offshore-Onshore)</w:t>
             </w:r>
           </w:p>
           <w:p>
@@ -3722,7 +3706,7 @@
                 <w:rFonts w:ascii="Aptos" w:hAnsi="Aptos"/>
                 <w:lang w:val="en-IN"/>
               </w:rPr>
-              <w:t xml:space="preserve">Qatar</w:t>
+              <w:t xml:space="preserve">Qatar, France, Italy, Portugal</w:t>
             </w:r>
           </w:p>
           <w:p>
@@ -3869,7 +3853,7 @@
                 <w:rFonts w:ascii="Aptos" w:hAnsi="Aptos"/>
                 <w:lang w:val="en-IN"/>
               </w:rPr>
-              <w:t xml:space="preserve">01'16-02'18</w:t>
+              <w:t xml:space="preserve">01’2016-02’2018</w:t>
             </w:r>
           </w:p>
           <w:p>
@@ -3905,36 +3889,36 @@
                 <w:rFonts w:ascii="Aptos" w:hAnsi="Aptos"/>
                 <w:lang w:val="en-IN"/>
               </w:rPr>
-              <w:t xml:space="preserve">ELV / Communication and Control Systems (CCS) – 15 Sub-Systems (Telecom/PIS/PAS/Radio/FPS/BIM etc)</w:t>
-            </w:r>
-          </w:p>
-          <w:p>
-            <w:pPr>
-              <w:spacing w:before="60" w:after="60" w:line="240" w:lineRule="auto"/>
-              <w:jc w:val="both"/>
-              <w:rPr>
-                <w:rFonts w:ascii="Aptos" w:hAnsi="Aptos"/>
-                <w:lang w:val="en-IN"/>
-              </w:rPr>
-            </w:pPr>
-          </w:p>
-          <w:p>
-            <w:pPr>
-              <w:spacing w:before="60" w:after="60" w:line="240" w:lineRule="auto"/>
-              <w:jc w:val="both"/>
-              <w:rPr>
-                <w:rFonts w:ascii="Aptos" w:hAnsi="Aptos"/>
-                <w:lang w:val="en-IN"/>
-              </w:rPr>
-            </w:pPr>
-            <w:r>
-              <w:rPr>
-                <w:rFonts w:ascii="Aptos" w:hAnsi="Aptos"/>
-                <w:b/>
-                <w:bCs/>
-                <w:lang w:val="en-IN"/>
-              </w:rPr>
-              <w:t xml:space="preserve">Activities Performed:</w:t>
+              <w:t xml:space="preserve">Systems: ELV / Communication and Control Systems (CCS) – 15 Sub-Systems (Telecom/PIS/PAS/Radio/FPS/BIM etc)</w:t>
+            </w:r>
+          </w:p>
+          <w:p>
+            <w:pPr>
+              <w:spacing w:before="60" w:after="60" w:line="240" w:lineRule="auto"/>
+              <w:jc w:val="both"/>
+              <w:rPr>
+                <w:rFonts w:ascii="Aptos" w:hAnsi="Aptos"/>
+                <w:lang w:val="en-IN"/>
+              </w:rPr>
+            </w:pPr>
+          </w:p>
+          <w:p>
+            <w:pPr>
+              <w:spacing w:before="60" w:after="60" w:line="240" w:lineRule="auto"/>
+              <w:jc w:val="both"/>
+              <w:rPr>
+                <w:rFonts w:ascii="Aptos" w:hAnsi="Aptos"/>
+                <w:lang w:val="en-IN"/>
+              </w:rPr>
+            </w:pPr>
+            <w:r>
+              <w:rPr>
+                <w:rFonts w:ascii="Aptos" w:hAnsi="Aptos"/>
+                <w:b/>
+                <w:bCs/>
+                <w:lang w:val="en-IN"/>
+              </w:rPr>
+              <w:t>Activities Performed:</w:t>
             </w:r>
             <w:r>
               <w:rPr>
@@ -3967,7 +3951,7 @@
                 <w:rFonts w:ascii="Aptos" w:hAnsi="Aptos"/>
                 <w:lang w:val="en-IN"/>
               </w:rPr>
-              <w:t xml:space="preserve">• QMS: Tailor &amp; Implement Corporate (Chorus)/Customer processes and train the Thales teams and sub-contractors</w:t>
+              <w:t xml:space="preserve">• Tailored and implemented Corporate (Chorus)/Customer processes and trained Thales teams and sub-contractors on QMS.</w:t>
             </w:r>
           </w:p>
           <w:p>
@@ -4001,7 +3985,7 @@
                 <w:rFonts w:ascii="Aptos" w:hAnsi="Aptos"/>
                 <w:lang w:val="en-IN"/>
               </w:rPr>
-              <w:t xml:space="preserve">• Corporate QMS implementation (+SHE), ISO certification (9001:2015), Tailoring to Customer Process</w:t>
+              <w:t xml:space="preserve">• Implemented Corporate QMS (+SHE), achieved ISO 9001:2015 certification, and tailored processes to customer requirements.</w:t>
             </w:r>
           </w:p>
           <w:p>
@@ -4035,7 +4019,7 @@
                 <w:rFonts w:ascii="Aptos" w:hAnsi="Aptos"/>
                 <w:lang w:val="en-IN"/>
               </w:rPr>
-              <w:t xml:space="preserve">• QA/QC – PQP/WMS/ITP/MAR/RI/RFIs/Calibration/NCRs, Execution, Reporting, Audits, Supplier Quality, Site Quality QC teams (internal and Sub-contractors) during Material/Installation/T&amp;C phases</w:t>
+              <w:t xml:space="preserve">• Managed QA/QC activities including PQP/WMS/ITP/MAR/RI/RFIs/Calibration/NCRs, execution, reporting, audits, supplier quality, and site quality QC teams (internal and sub-contractors) during material, installation, and T&amp;C phases.</w:t>
             </w:r>
           </w:p>
           <w:p>
@@ -4069,7 +4053,7 @@
                 <w:rFonts w:ascii="Aptos" w:hAnsi="Aptos"/>
                 <w:lang w:val="en-IN"/>
               </w:rPr>
-              <w:t xml:space="preserve">• Co-ordination of Safety Assurance (Offshore team), TIMS assessment/PIVS (Internal Audits)</w:t>
+              <w:t xml:space="preserve">• Coordinated Safety Assurance (Offshore team) and TIMS assessment/PIVS (Internal Audits).</w:t>
             </w:r>
           </w:p>
           <w:p>
@@ -4103,7 +4087,7 @@
                 <w:rFonts w:ascii="Aptos" w:hAnsi="Aptos"/>
                 <w:lang w:val="en-IN"/>
               </w:rPr>
-              <w:t xml:space="preserve">• Reporting to Customer, Directors with QA Advise, Alerts and Veto for timely action and follow-up</w:t>
+              <w:t xml:space="preserve">• Reported to Customer and Directors with QA advice, alerts, and veto for timely action and follow-up.</w:t>
             </w:r>
           </w:p>
           <w:p>
@@ -4137,7 +4121,7 @@
                 <w:rFonts w:ascii="Aptos" w:hAnsi="Aptos"/>
                 <w:lang w:val="en-IN"/>
               </w:rPr>
-              <w:t xml:space="preserve">• Reviews of Bid/SOW/Proposals/Gate reviews/Design Docs/Materials/I,T&amp;C documents and records</w:t>
+              <w:t xml:space="preserve">• Reviewed bids, Statements of Work (SOW), proposals, gate reviews, design documents, materials, and I, T&amp;C documents and records.</w:t>
             </w:r>
           </w:p>
           <w:p>
@@ -4171,7 +4155,7 @@
                 <w:rFonts w:ascii="Aptos" w:hAnsi="Aptos"/>
                 <w:lang w:val="en-IN"/>
               </w:rPr>
-              <w:t xml:space="preserve">• Subcontractors: Qualification, Quality supervision and audits, reporting; material inspections</w:t>
+              <w:t xml:space="preserve">• Managed subcontractors, including qualification, quality supervision, audits, reporting, and material inspections.</w:t>
             </w:r>
           </w:p>
           <w:p>
@@ -4205,7 +4189,7 @@
                 <w:rFonts w:ascii="Aptos" w:hAnsi="Aptos"/>
                 <w:lang w:val="en-IN"/>
               </w:rPr>
-              <w:t xml:space="preserve">• Managed Non-Conformances, CAPA, RCA, KPI Analysis; Action Tracking, Risks, Lessons learnt, CSAT actions</w:t>
+              <w:t xml:space="preserve">• Managed Non-Conformances, CAPA, RCA, KPI Analysis; action tracking, risks, lessons learned, and CSAT actions.</w:t>
             </w:r>
           </w:p>
           <w:p>
@@ -4261,7 +4245,7 @@
                 <w:color w:val="05436E"/>
                 <w:lang w:val="en-US"/>
               </w:rPr>
-              <w:t xml:space="preserve">07'12-01'16</w:t>
+              <w:t xml:space="preserve">07’2012-01’2016</w:t>
             </w:r>
           </w:p>
           <w:p>
@@ -4284,7 +4268,7 @@
                 <w:color w:val="05436E"/>
                 <w:lang w:val="en-US"/>
               </w:rPr>
-              <w:t xml:space="preserve">3 Y 6 M</w:t>
+              <w:t xml:space="preserve"/>
             </w:r>
           </w:p>
           <w:p>
@@ -4396,7 +4380,7 @@
                 <w:rFonts w:ascii="Aptos" w:hAnsi="Aptos"/>
                 <w:lang w:val="en-IN"/>
               </w:rPr>
-              <w:t xml:space="preserve">Project Quality Assurance Manager</w:t>
+              <w:t xml:space="preserve">Project Quality Assurance Manager (Onshore)</w:t>
             </w:r>
           </w:p>
           <w:p>
@@ -4570,7 +4554,7 @@
                 <w:lang w:val="en-IN"/>
               </w:rPr>
               <w:lastRenderedPageBreak/>
-              <w:t xml:space="preserve">Project Quality Assurance Manager</w:t>
+              <w:t xml:space="preserve">Project Quality Assurance Manager (Onshore)</w:t>
             </w:r>
           </w:p>
           <w:p>
@@ -4763,7 +4747,7 @@
                 <w:rFonts w:ascii="Aptos" w:hAnsi="Aptos"/>
                 <w:lang w:val="en-IN"/>
               </w:rPr>
-              <w:t xml:space="preserve">07'12-01'16</w:t>
+              <w:t xml:space="preserve">07’2012-01’2016</w:t>
             </w:r>
           </w:p>
           <w:p>
@@ -4799,36 +4783,36 @@
                 <w:rFonts w:ascii="Aptos" w:hAnsi="Aptos"/>
                 <w:lang w:val="en-IN"/>
               </w:rPr>
-              <w:t xml:space="preserve">ELV / Embedded Systems (Aircraft Hardware and Software) and Aircraft Material inspections (before assembling)</w:t>
-            </w:r>
-          </w:p>
-          <w:p>
-            <w:pPr>
-              <w:spacing w:before="60" w:after="60" w:line="240" w:lineRule="auto"/>
-              <w:jc w:val="both"/>
-              <w:rPr>
-                <w:rFonts w:ascii="Aptos" w:hAnsi="Aptos"/>
-                <w:lang w:val="en-IN"/>
-              </w:rPr>
-            </w:pPr>
-          </w:p>
-          <w:p>
-            <w:pPr>
-              <w:spacing w:before="60" w:after="60" w:line="240" w:lineRule="auto"/>
-              <w:jc w:val="both"/>
-              <w:rPr>
-                <w:rFonts w:ascii="Aptos" w:hAnsi="Aptos"/>
-                <w:lang w:val="en-IN"/>
-              </w:rPr>
-            </w:pPr>
-            <w:r>
-              <w:rPr>
-                <w:rFonts w:ascii="Aptos" w:hAnsi="Aptos"/>
-                <w:b/>
-                <w:bCs/>
-                <w:lang w:val="en-IN"/>
-              </w:rPr>
-              <w:t xml:space="preserve">Activities Performed:</w:t>
+              <w:t xml:space="preserve">Systems: ELV / Embedded Systems (Aircraft Hardware and Software) and Aircraft Material inspections (before assembling)</w:t>
+            </w:r>
+          </w:p>
+          <w:p>
+            <w:pPr>
+              <w:spacing w:before="60" w:after="60" w:line="240" w:lineRule="auto"/>
+              <w:jc w:val="both"/>
+              <w:rPr>
+                <w:rFonts w:ascii="Aptos" w:hAnsi="Aptos"/>
+                <w:lang w:val="en-IN"/>
+              </w:rPr>
+            </w:pPr>
+          </w:p>
+          <w:p>
+            <w:pPr>
+              <w:spacing w:before="60" w:after="60" w:line="240" w:lineRule="auto"/>
+              <w:jc w:val="both"/>
+              <w:rPr>
+                <w:rFonts w:ascii="Aptos" w:hAnsi="Aptos"/>
+                <w:lang w:val="en-IN"/>
+              </w:rPr>
+            </w:pPr>
+            <w:r>
+              <w:rPr>
+                <w:rFonts w:ascii="Aptos" w:hAnsi="Aptos"/>
+                <w:b/>
+                <w:bCs/>
+                <w:lang w:val="en-IN"/>
+              </w:rPr>
+              <w:t>Activities Performed:</w:t>
             </w:r>
             <w:r>
               <w:rPr>
@@ -4861,7 +4845,7 @@
                 <w:rFonts w:ascii="Aptos" w:hAnsi="Aptos"/>
                 <w:lang w:val="en-IN"/>
               </w:rPr>
-              <w:t xml:space="preserve">• Supplier Auditor and PIVS (Internal Auditor) for Thales projects in India</w:t>
+              <w:t xml:space="preserve">• Served as Supplier Auditor and PIVS (Internal Auditor) for Thales projects in India.</w:t>
             </w:r>
           </w:p>
           <w:p>
@@ -4895,7 +4879,7 @@
                 <w:rFonts w:ascii="Aptos" w:hAnsi="Aptos"/>
                 <w:lang w:val="en-IN"/>
               </w:rPr>
-              <w:t xml:space="preserve">• QMS: Implemented Corporate QMS (Chorus 2.0 CPO, Tailoring, trainings, deployment etc.); ISO 9001 certification</w:t>
+              <w:t xml:space="preserve">• Implemented Corporate QMS (Chorus 2.0 CPO, tailoring, trainings, deployment etc.) and achieved ISO 9001 certification.</w:t>
             </w:r>
           </w:p>
           <w:p>
@@ -4929,7 +4913,7 @@
                 <w:rFonts w:ascii="Aptos" w:hAnsi="Aptos"/>
                 <w:lang w:val="en-IN"/>
               </w:rPr>
-              <w:t xml:space="preserve">• Planning: PQP, WMS/ITPs/Checklists for project including reviews and approvals of offset partner deliverables</w:t>
+              <w:t xml:space="preserve">• Developed planning documents including PQP, WMS/ITPs/Checklists for the project, including reviews and approvals of offset partner deliverables.</w:t>
             </w:r>
           </w:p>
           <w:p>
@@ -4963,7 +4947,7 @@
                 <w:rFonts w:ascii="Aptos" w:hAnsi="Aptos"/>
                 <w:lang w:val="en-IN"/>
               </w:rPr>
-              <w:t xml:space="preserve">• Engineering QA: Gate reviews, Software sampling tests/Build Checks, CSAT, Quality Advice, Track Actions</w:t>
+              <w:t xml:space="preserve">• Conducted Engineering QA activities such as gate reviews, software sampling tests/build checks, CSAT, provided quality advice, and tracked actions.</w:t>
             </w:r>
           </w:p>
           <w:p>
@@ -4997,7 +4981,7 @@
                 <w:rFonts w:ascii="Aptos" w:hAnsi="Aptos"/>
                 <w:lang w:val="en-IN"/>
               </w:rPr>
-              <w:t xml:space="preserve">• Conducted Material inspections of aircraft parts and follow-up actions to closure with France team</w:t>
+              <w:t xml:space="preserve">• Conducted material inspections of aircraft parts and followed up on actions to closure with the France team.</w:t>
             </w:r>
           </w:p>
           <w:p>
@@ -5031,7 +5015,7 @@
                 <w:rFonts w:ascii="Aptos" w:hAnsi="Aptos"/>
                 <w:lang w:val="en-IN"/>
               </w:rPr>
-              <w:t xml:space="preserve">• Delivery Management: Inspections (Hardware, Software), raised/tracked NCRs/OBS/Snag list/Issued Alerts &amp; Veto</w:t>
+              <w:t xml:space="preserve">• Managed delivery, including inspections (Hardware, Software), raised/tracked NCRs/OBS/Snag list, and issued alerts &amp; veto.</w:t>
             </w:r>
           </w:p>
           <w:p>
@@ -5065,7 +5049,7 @@
                 <w:rFonts w:ascii="Aptos" w:hAnsi="Aptos"/>
                 <w:lang w:val="en-IN"/>
               </w:rPr>
-              <w:t xml:space="preserve">• Review: MRs, Process Improvements, Risk monitoring, Lessons learnt, KPIs, RCA, CSAT, Snag list etc</w:t>
+              <w:t xml:space="preserve">• Reviewed Management Reviews (MRs), process improvements, risk monitoring, lessons learned, KPIs, RCA, CSAT, and snag lists.</w:t>
             </w:r>
           </w:p>
           <w:p>
@@ -5099,7 +5083,7 @@
                 <w:rFonts w:ascii="Aptos" w:hAnsi="Aptos"/>
                 <w:lang w:val="en-IN"/>
               </w:rPr>
-              <w:t xml:space="preserve">• Reporting: QA/QC Situational Awareness: Issued NCRs &amp; Quality Advise with focus on Alerts and Veto for timely action</w:t>
+              <w:t xml:space="preserve">• Reported QA/QC situational awareness, issued NCRs &amp; Quality Advice with a focus on alerts and veto for timely action.</w:t>
             </w:r>
           </w:p>
           <w:p>
@@ -5155,7 +5139,7 @@
                 <w:color w:val="05436E"/>
                 <w:lang w:val="en-US"/>
               </w:rPr>
-              <w:t xml:space="preserve">10'08-06'12</w:t>
+              <w:t xml:space="preserve">10’2008-06’2012</w:t>
             </w:r>
           </w:p>
           <w:p>
@@ -5178,7 +5162,7 @@
                 <w:color w:val="05436E"/>
                 <w:lang w:val="en-US"/>
               </w:rPr>
-              <w:t xml:space="preserve">3 Y 8 M</w:t>
+              <w:t xml:space="preserve"/>
             </w:r>
           </w:p>
           <w:p>
@@ -5290,7 +5274,7 @@
                 <w:rFonts w:ascii="Aptos" w:hAnsi="Aptos"/>
                 <w:lang w:val="en-IN"/>
               </w:rPr>
-              <w:t xml:space="preserve">Portfolio Quality Assurance Manager</w:t>
+              <w:t xml:space="preserve">Portfolio Quality Assurance Manager (Onshore)</w:t>
             </w:r>
           </w:p>
           <w:p>
@@ -5464,7 +5448,7 @@
                 <w:lang w:val="en-IN"/>
               </w:rPr>
               <w:lastRenderedPageBreak/>
-              <w:t xml:space="preserve">Portfolio Quality Assurance Manager</w:t>
+              <w:t xml:space="preserve">Portfolio Quality Assurance Manager (Onshore)</w:t>
             </w:r>
           </w:p>
           <w:p>
@@ -5657,7 +5641,7 @@
                 <w:rFonts w:ascii="Aptos" w:hAnsi="Aptos"/>
                 <w:lang w:val="en-IN"/>
               </w:rPr>
-              <w:t xml:space="preserve">10'08-06'12</w:t>
+              <w:t xml:space="preserve">10’2008-06’2012</w:t>
             </w:r>
           </w:p>
           <w:p>
@@ -5693,36 +5677,36 @@
                 <w:rFonts w:ascii="Aptos" w:hAnsi="Aptos"/>
                 <w:lang w:val="en-IN"/>
               </w:rPr>
-              <w:t xml:space="preserve">ELV / Embedded Systems (Aircraft Hardware and Software) and Aircraft Material inspections (before assembling)</w:t>
-            </w:r>
-          </w:p>
-          <w:p>
-            <w:pPr>
-              <w:spacing w:before="60" w:after="60" w:line="240" w:lineRule="auto"/>
-              <w:jc w:val="both"/>
-              <w:rPr>
-                <w:rFonts w:ascii="Aptos" w:hAnsi="Aptos"/>
-                <w:lang w:val="en-IN"/>
-              </w:rPr>
-            </w:pPr>
-          </w:p>
-          <w:p>
-            <w:pPr>
-              <w:spacing w:before="60" w:after="60" w:line="240" w:lineRule="auto"/>
-              <w:jc w:val="both"/>
-              <w:rPr>
-                <w:rFonts w:ascii="Aptos" w:hAnsi="Aptos"/>
-                <w:lang w:val="en-IN"/>
-              </w:rPr>
-            </w:pPr>
-            <w:r>
-              <w:rPr>
-                <w:rFonts w:ascii="Aptos" w:hAnsi="Aptos"/>
-                <w:b/>
-                <w:bCs/>
-                <w:lang w:val="en-IN"/>
-              </w:rPr>
-              <w:t xml:space="preserve">Activities Performed:</w:t>
+              <w:t xml:space="preserve">Systems: ELV / Embedded Systems (Aircraft Hardware and Software) and Aircraft Material inspections (before assembling)</w:t>
+            </w:r>
+          </w:p>
+          <w:p>
+            <w:pPr>
+              <w:spacing w:before="60" w:after="60" w:line="240" w:lineRule="auto"/>
+              <w:jc w:val="both"/>
+              <w:rPr>
+                <w:rFonts w:ascii="Aptos" w:hAnsi="Aptos"/>
+                <w:lang w:val="en-IN"/>
+              </w:rPr>
+            </w:pPr>
+          </w:p>
+          <w:p>
+            <w:pPr>
+              <w:spacing w:before="60" w:after="60" w:line="240" w:lineRule="auto"/>
+              <w:jc w:val="both"/>
+              <w:rPr>
+                <w:rFonts w:ascii="Aptos" w:hAnsi="Aptos"/>
+                <w:lang w:val="en-IN"/>
+              </w:rPr>
+            </w:pPr>
+            <w:r>
+              <w:rPr>
+                <w:rFonts w:ascii="Aptos" w:hAnsi="Aptos"/>
+                <w:b/>
+                <w:bCs/>
+                <w:lang w:val="en-IN"/>
+              </w:rPr>
+              <w:t>Activities Performed:</w:t>
             </w:r>
             <w:r>
               <w:rPr>
@@ -5755,7 +5739,7 @@
                 <w:rFonts w:ascii="Aptos" w:hAnsi="Aptos"/>
                 <w:lang w:val="en-IN"/>
               </w:rPr>
-              <w:t xml:space="preserve">• QAQC Planning (PQP), WMS/SOPs, Inspections for the entity projects and Portfolios</w:t>
+              <w:t xml:space="preserve">• Developed QAQC planning (PQP), WMS/SOPs, and inspections for entity projects and portfolios.</w:t>
             </w:r>
           </w:p>
           <w:p>
@@ -5789,7 +5773,7 @@
                 <w:rFonts w:ascii="Aptos" w:hAnsi="Aptos"/>
                 <w:lang w:val="en-IN"/>
               </w:rPr>
-              <w:t xml:space="preserve">• Key involvement in Stage Gate reviews (PDR/CDR/FAI etc) (Equivalent to Design and FAT)</w:t>
+              <w:t xml:space="preserve">• Key involvement in Stage Gate reviews (PDR/CDR/FAI etc.), equivalent to Design and FAT.</w:t>
             </w:r>
           </w:p>
           <w:p>
@@ -5823,7 +5807,7 @@
                 <w:rFonts w:ascii="Aptos" w:hAnsi="Aptos"/>
                 <w:lang w:val="en-IN"/>
               </w:rPr>
-              <w:t xml:space="preserve">• QC auditor for Organisation and Product owner for Web based tools using Agile</w:t>
+              <w:t xml:space="preserve">• Served as QC auditor for the organization and product owner for web-based tools using Agile methodology.</w:t>
             </w:r>
           </w:p>
           <w:p>
@@ -5857,7 +5841,7 @@
                 <w:rFonts w:ascii="Aptos" w:hAnsi="Aptos"/>
                 <w:lang w:val="en-IN"/>
               </w:rPr>
-              <w:t xml:space="preserve">• Report: QA Advise, KPIs, PMR-WB review of projects, Critical alerts &amp; Veto, Lessons Learnt</w:t>
+              <w:t xml:space="preserve">• Reported QA advice, KPIs, PMR-WB review of projects, critical alerts &amp; veto, and lessons learned.</w:t>
             </w:r>
           </w:p>
           <w:p>
@@ -5891,7 +5875,7 @@
                 <w:rFonts w:ascii="Aptos" w:hAnsi="Aptos"/>
                 <w:lang w:val="en-IN"/>
               </w:rPr>
-              <w:t xml:space="preserve">• Managed PIVS (Internal Audits) and track/facilitate the findings to Closure of CAR/NCR/OBS with RCA and actions</w:t>
+              <w:t xml:space="preserve">• Managed PIVS (Internal Audits) and tracked/facilitated findings to closure of CAR/NCR/OBS with RCA and actions.</w:t>
             </w:r>
           </w:p>
           <w:p>
@@ -5947,7 +5931,7 @@
                 <w:color w:val="05436E"/>
                 <w:lang w:val="en-US"/>
               </w:rPr>
-              <w:t xml:space="preserve">04'07-10'08</w:t>
+              <w:t xml:space="preserve">04’2007-10’2008</w:t>
             </w:r>
           </w:p>
           <w:p>
@@ -5970,7 +5954,7 @@
                 <w:color w:val="05436E"/>
                 <w:lang w:val="en-US"/>
               </w:rPr>
-              <w:t xml:space="preserve">1 Y 6 M</w:t>
+              <w:t xml:space="preserve"/>
             </w:r>
           </w:p>
           <w:p>
@@ -6082,7 +6066,7 @@
                 <w:rFonts w:ascii="Aptos" w:hAnsi="Aptos"/>
                 <w:lang w:val="en-IN"/>
               </w:rPr>
-              <w:t xml:space="preserve">Engineering Technical Lead</w:t>
+              <w:t xml:space="preserve">Engineering Technical Lead (Offshore)</w:t>
             </w:r>
           </w:p>
           <w:p>
@@ -6256,7 +6240,7 @@
                 <w:lang w:val="en-IN"/>
               </w:rPr>
               <w:lastRenderedPageBreak/>
-              <w:t xml:space="preserve">Engineering Technical Lead</w:t>
+              <w:t xml:space="preserve">Engineering Technical Lead (Offshore)</w:t>
             </w:r>
           </w:p>
           <w:p>
@@ -6449,7 +6433,7 @@
                 <w:rFonts w:ascii="Aptos" w:hAnsi="Aptos"/>
                 <w:lang w:val="en-IN"/>
               </w:rPr>
-              <w:t xml:space="preserve">04'07-10'08</w:t>
+              <w:t xml:space="preserve">04’2007-10’2008</w:t>
             </w:r>
           </w:p>
           <w:p>
@@ -6485,36 +6469,36 @@
                 <w:rFonts w:ascii="Aptos" w:hAnsi="Aptos"/>
                 <w:lang w:val="en-IN"/>
               </w:rPr>
-              <w:t xml:space="preserve">Aircraft HMI Software – LLR(Requirements), Design, Coding and Testing</w:t>
-            </w:r>
-          </w:p>
-          <w:p>
-            <w:pPr>
-              <w:spacing w:before="60" w:after="60" w:line="240" w:lineRule="auto"/>
-              <w:jc w:val="both"/>
-              <w:rPr>
-                <w:rFonts w:ascii="Aptos" w:hAnsi="Aptos"/>
-                <w:lang w:val="en-IN"/>
-              </w:rPr>
-            </w:pPr>
-          </w:p>
-          <w:p>
-            <w:pPr>
-              <w:spacing w:before="60" w:after="60" w:line="240" w:lineRule="auto"/>
-              <w:jc w:val="both"/>
-              <w:rPr>
-                <w:rFonts w:ascii="Aptos" w:hAnsi="Aptos"/>
-                <w:lang w:val="en-IN"/>
-              </w:rPr>
-            </w:pPr>
-            <w:r>
-              <w:rPr>
-                <w:rFonts w:ascii="Aptos" w:hAnsi="Aptos"/>
-                <w:b/>
-                <w:bCs/>
-                <w:lang w:val="en-IN"/>
-              </w:rPr>
-              <w:t xml:space="preserve">Activities Performed:</w:t>
+              <w:t xml:space="preserve">Systems: Aircraft HMI Software – LLR(Requirements), Design, Coding and Testing</w:t>
+            </w:r>
+          </w:p>
+          <w:p>
+            <w:pPr>
+              <w:spacing w:before="60" w:after="60" w:line="240" w:lineRule="auto"/>
+              <w:jc w:val="both"/>
+              <w:rPr>
+                <w:rFonts w:ascii="Aptos" w:hAnsi="Aptos"/>
+                <w:lang w:val="en-IN"/>
+              </w:rPr>
+            </w:pPr>
+          </w:p>
+          <w:p>
+            <w:pPr>
+              <w:spacing w:before="60" w:after="60" w:line="240" w:lineRule="auto"/>
+              <w:jc w:val="both"/>
+              <w:rPr>
+                <w:rFonts w:ascii="Aptos" w:hAnsi="Aptos"/>
+                <w:lang w:val="en-IN"/>
+              </w:rPr>
+            </w:pPr>
+            <w:r>
+              <w:rPr>
+                <w:rFonts w:ascii="Aptos" w:hAnsi="Aptos"/>
+                <w:b/>
+                <w:bCs/>
+                <w:lang w:val="en-IN"/>
+              </w:rPr>
+              <w:t>Activities Performed:</w:t>
             </w:r>
             <w:r>
               <w:rPr>
@@ -6547,7 +6531,7 @@
                 <w:rFonts w:ascii="Aptos" w:hAnsi="Aptos"/>
                 <w:lang w:val="en-IN"/>
               </w:rPr>
-              <w:t xml:space="preserve">• Project Initiation (France), planning, training (ADA language), execution, and monitoring control (client reporting)</w:t>
+              <w:t xml:space="preserve">• Managed project initiation (France), planning, training (ADA language), execution, and monitoring control (client reporting).</w:t>
             </w:r>
           </w:p>
           <w:p>
@@ -6581,7 +6565,7 @@
                 <w:rFonts w:ascii="Aptos" w:hAnsi="Aptos"/>
                 <w:lang w:val="en-IN"/>
               </w:rPr>
-              <w:t xml:space="preserve">• Requirement analysis, reviews, LLRs, design (CDS: HMI-GUI), coding (OOTH/DO178B), debug and unit testing</w:t>
+              <w:t xml:space="preserve">• Performed requirement analysis, reviews, LLRs, design (CDS: HMI-GUI), coding (OOTH/DO178B), debugging, and unit testing.</w:t>
             </w:r>
           </w:p>
           <w:p>
@@ -6615,7 +6599,7 @@
                 <w:rFonts w:ascii="Aptos" w:hAnsi="Aptos"/>
                 <w:lang w:val="en-IN"/>
               </w:rPr>
-              <w:t xml:space="preserve">• Pre- and post-delivery activities – CM audits, technical release audits (Software), RCA, KPI/Metrics and Analysis</w:t>
+              <w:t xml:space="preserve">• Conducted pre- and post-delivery activities, including CM audits, technical release audits (Software), RCA, KPI/Metrics, and analysis.</w:t>
             </w:r>
           </w:p>
           <w:p>
@@ -6649,7 +6633,7 @@
                 <w:rFonts w:ascii="Aptos" w:hAnsi="Aptos"/>
                 <w:lang w:val="en-IN"/>
               </w:rPr>
-              <w:t xml:space="preserve">• Key member of Innovation council, Interview panel and training automation</w:t>
+              <w:t xml:space="preserve">• Served as a key member of the Innovation Council, Interview Panel, and Training Automation initiatives.</w:t>
             </w:r>
           </w:p>
           <w:p>
@@ -6705,7 +6689,7 @@
                 <w:color w:val="05436E"/>
                 <w:lang w:val="en-US"/>
               </w:rPr>
-              <w:t xml:space="preserve">05'2004-03'2007</w:t>
+              <w:t xml:space="preserve">05’2004-03’2007</w:t>
             </w:r>
           </w:p>
           <w:p>
@@ -6728,7 +6712,7 @@
                 <w:color w:val="05436E"/>
                 <w:lang w:val="en-US"/>
               </w:rPr>
-              <w:t xml:space="preserve">2 Y 10 M</w:t>
+              <w:t xml:space="preserve"/>
             </w:r>
           </w:p>
           <w:p>
@@ -6779,7 +6763,7 @@
                 <w:rFonts w:ascii="Aptos" w:hAnsi="Aptos"/>
                 <w:lang w:val="en-IN"/>
               </w:rPr>
-              <w:t xml:space="preserve">Honeywell</w:t>
+              <w:t xml:space="preserve">Honeywell, ADA/DRDO</w:t>
             </w:r>
           </w:p>
           <w:p>
@@ -7164,7 +7148,7 @@
                 <w:rFonts w:ascii="Aptos" w:hAnsi="Aptos"/>
                 <w:lang w:val="en-IN"/>
               </w:rPr>
-              <w:t xml:space="preserve">ADA/DRDO</w:t>
+              <w:t xml:space="preserve">ADA/DRDO/HAL, Honeywell</w:t>
             </w:r>
           </w:p>
           <w:p>
@@ -7207,7 +7191,7 @@
                 <w:rFonts w:ascii="Aptos" w:hAnsi="Aptos"/>
                 <w:lang w:val="en-IN"/>
               </w:rPr>
-              <w:t xml:space="preserve">05'2004-03'2007</w:t>
+              <w:t xml:space="preserve">05’2004-03’2007</w:t>
             </w:r>
           </w:p>
           <w:p>
@@ -7243,6 +7227,51 @@
                 <w:rFonts w:ascii="Aptos" w:hAnsi="Aptos"/>
                 <w:lang w:val="en-IN"/>
               </w:rPr>
+              <w:t xml:space="preserve">MMR-SDP System Testing, Signal simulator (H/W &amp; S/W) using FPGAs, Blind Zone Analysis Software; A380 AESS Testing (ADIS, FDR and BITE) in compliance to DO178B in line with PSAC, SDP, IVVP etc.</w:t>
+            </w:r>
+          </w:p>
+          <w:p>
+            <w:pPr>
+              <w:spacing w:before="60" w:after="60" w:line="240" w:lineRule="auto"/>
+              <w:jc w:val="both"/>
+              <w:rPr>
+                <w:rFonts w:ascii="Aptos" w:hAnsi="Aptos"/>
+                <w:lang w:val="en-IN"/>
+              </w:rPr>
+            </w:pPr>
+          </w:p>
+          <w:p>
+            <w:pPr>
+              <w:spacing w:before="60" w:after="60" w:line="240" w:lineRule="auto"/>
+              <w:jc w:val="both"/>
+              <w:rPr>
+                <w:rFonts w:ascii="Aptos" w:hAnsi="Aptos"/>
+                <w:lang w:val="en-IN"/>
+              </w:rPr>
+            </w:pPr>
+            <w:r>
+              <w:rPr>
+                <w:rFonts w:ascii="Aptos" w:hAnsi="Aptos"/>
+                <w:b/>
+                <w:bCs/>
+                <w:lang w:val="en-IN"/>
+              </w:rPr>
+              <w:t>Activities Performed:</w:t>
+            </w:r>
+            <w:r>
+              <w:rPr>
+                <w:rFonts w:ascii="Aptos" w:hAnsi="Aptos"/>
+                <w:b/>
+                <w:bCs/>
+                <w:lang w:val="en-IN"/>
+              </w:rPr>
+              <w:t xml:space="preserve"> </w:t>
+            </w:r>
+            <w:r>
+              <w:rPr>
+                <w:rFonts w:ascii="Aptos" w:hAnsi="Aptos"/>
+                <w:lang w:val="en-IN"/>
+              </w:rPr>
               <w:t xml:space="preserve"/>
             </w:r>
           </w:p>
@@ -7255,34 +7284,23 @@
                 <w:lang w:val="en-IN"/>
               </w:rPr>
             </w:pPr>
-          </w:p>
-          <w:p>
-            <w:pPr>
-              <w:spacing w:before="60" w:after="60" w:line="240" w:lineRule="auto"/>
-              <w:jc w:val="both"/>
-              <w:rPr>
-                <w:rFonts w:ascii="Aptos" w:hAnsi="Aptos"/>
-                <w:lang w:val="en-IN"/>
-              </w:rPr>
-            </w:pPr>
-            <w:r>
-              <w:rPr>
-                <w:rFonts w:ascii="Aptos" w:hAnsi="Aptos"/>
-                <w:b/>
-                <w:bCs/>
-                <w:lang w:val="en-IN"/>
-              </w:rPr>
-              <w:t xml:space="preserve">Activities Performed:</w:t>
-            </w:r>
-            <w:r>
-              <w:rPr>
-                <w:rFonts w:ascii="Aptos" w:hAnsi="Aptos"/>
-                <w:b/>
-                <w:bCs/>
-                <w:lang w:val="en-IN"/>
-              </w:rPr>
-              <w:t xml:space="preserve"> </w:t>
-            </w:r>
+            <w:r>
+              <w:rPr>
+                <w:rFonts w:ascii="Aptos" w:hAnsi="Aptos"/>
+                <w:lang w:val="en-IN"/>
+              </w:rPr>
+              <w:t xml:space="preserve">• Performed System Engineering (Testing) for A380 Aircraft Surveillance System (IHAS-ADIS).</w:t>
+            </w:r>
+          </w:p>
+          <w:p>
+            <w:pPr>
+              <w:spacing w:before="60" w:after="60" w:line="240" w:lineRule="auto"/>
+              <w:jc w:val="both"/>
+              <w:rPr>
+                <w:rFonts w:ascii="Aptos" w:hAnsi="Aptos"/>
+                <w:lang w:val="en-US"/>
+              </w:rPr>
+            </w:pPr>
             <w:r>
               <w:rPr>
                 <w:rFonts w:ascii="Aptos" w:hAnsi="Aptos"/>
@@ -7305,41 +7323,7 @@
                 <w:rFonts w:ascii="Aptos" w:hAnsi="Aptos"/>
                 <w:lang w:val="en-IN"/>
               </w:rPr>
-              <w:t xml:space="preserve">• System Engineer (Testing) for A380 Aircraft Surveillance System (IHAS-ADIS)</w:t>
-            </w:r>
-          </w:p>
-          <w:p>
-            <w:pPr>
-              <w:spacing w:before="60" w:after="60" w:line="240" w:lineRule="auto"/>
-              <w:jc w:val="both"/>
-              <w:rPr>
-                <w:rFonts w:ascii="Aptos" w:hAnsi="Aptos"/>
-                <w:lang w:val="en-US"/>
-              </w:rPr>
-            </w:pPr>
-            <w:r>
-              <w:rPr>
-                <w:rFonts w:ascii="Aptos" w:hAnsi="Aptos"/>
-                <w:lang w:val="en-IN"/>
-              </w:rPr>
-              <w:t xml:space="preserve"/>
-            </w:r>
-          </w:p>
-          <w:p>
-            <w:pPr>
-              <w:spacing w:before="60" w:after="60" w:line="240" w:lineRule="auto"/>
-              <w:jc w:val="both"/>
-              <w:rPr>
-                <w:rFonts w:ascii="Aptos" w:hAnsi="Aptos"/>
-                <w:lang w:val="en-IN"/>
-              </w:rPr>
-            </w:pPr>
-            <w:r>
-              <w:rPr>
-                <w:rFonts w:ascii="Aptos" w:hAnsi="Aptos"/>
-                <w:lang w:val="en-IN"/>
-              </w:rPr>
-              <w:t xml:space="preserve">• System Engineer (Testing) for Radar SDP - Light Combat Aircraft (Tejas)</w:t>
+              <w:t xml:space="preserve">• Performed System Engineering (Testing) for Radar SDP - Light Combat Aircraft (Tejas).</w:t>
             </w:r>
           </w:p>
           <w:p>
@@ -7939,7 +7923,7 @@
                 <w:noProof/>
                 <w:lang w:val="en-IN"/>
               </w:rPr>
-              <w:t>12 June 2026</w:t>
+              <w:t>18 June 2026</w:t>
             </w:r>
             <w:r>
               <w:rPr>
@@ -8078,7 +8062,7 @@
                 <w:noProof/>
                 <w:lang w:val="en-IN"/>
               </w:rPr>
-              <w:t>12 June 2026</w:t>
+              <w:t>18 June 2026</w:t>
             </w:r>
             <w:r>
               <w:rPr>
@@ -9515,7 +9499,7 @@
 </file>
 
 <file path=word/endnotes.xml><?xml version="1.0" encoding="utf-8"?>
-<w:endnotes xmlns:wpc="http://schemas.microsoft.com/office/word/2010/wordprocessingCanvas" xmlns:cx="http://schemas.microsoft.com/office/drawing/2014/chartex" xmlns:cx1="http://schemas.microsoft.com/office/drawing/2015/9/8/chartex" xmlns:cx2="http://schemas.microsoft.com/office/drawing/2015/10/21/chartex" xmlns:cx3="http://schemas.microsoft.com/office/drawing/2016/5/9/chartex" xmlns:cx4="http://schemas.microsoft.com/office/drawing/2016/5/10/chartex" xmlns:cx5="http://schemas.microsoft.com/office/drawing/2016/5/11/chartex" xmlns:cx6="http://schemas.microsoft.com/office/drawing/2016/5/12/chartex" xmlns:cx7="http://schemas.microsoft.com/office/drawing/2016/5/13/chartex" xmlns:cx8="http://schemas.microsoft.com/office/drawing/2016/5/14/chartex" xmlns:mc="http://schemas.openxmlformats.org/markup-compatibility/2006" xmlns:aink="http://schemas.microsoft.com/office/drawing/2016/ink" xmlns:am3d="http://schemas.microsoft.com/office/drawing/2017/model3d" xmlns:o="urn:schemas-microsoft-com:office:office" xmlns:oel="http://schemas.microsoft.com/office/2019/extlst" xmlns:r="http://schemas.openxmlformats.org/officeDocument/2006/relationships" xmlns:m="http://schemas.openxmlformats.org/officeDocument/2006/math" xmlns:v="urn:schemas-microsoft-com:vml" xmlns:wp14="http://schemas.microsoft.com/office/word/2010/wordprocessingDrawing" xmlns:wp="http://schemas.openxmlformats.org/drawingml/2006/wordprocessingDrawing" xmlns:w10="urn:schemas-microsoft-com:office:word" xmlns:w="http://schemas.openxmlformats.org/wordprocessingml/2006/main" xmlns:w14="http://schemas.microsoft.com/office/word/2010/wordml" xmlns:w15="http://schemas.microsoft.com/office/word/2012/wordml" xmlns:w16cex="http://schemas.microsoft.com/office/word/2018/wordml/cex" xmlns:w16cid="http://schemas.microsoft.com/office/word/2016/wordml/cid" xmlns:w16="http://schemas.microsoft.com/office/word/2018/wordml" xmlns:w16du="http://schemas.microsoft.com/office/word/2023/wordml/word16du" xmlns:w16sdtdh="http://schemas.microsoft.com/office/word/2020/wordml/sdtdatahash" xmlns:w16sdtfl="http://schemas.microsoft.com/office/word/2024/wordml/sdtformatlock" xmlns:w16se="http://schemas.microsoft.com/office/word/2015/wordml/symex" xmlns:wpg="http://schemas.microsoft.com/office/word/2010/wordprocessingGroup" xmlns:wpi="http://schemas.microsoft.com/office/word/2010/wordprocessingInk" xmlns:wne="http://schemas.microsoft.com/office/word/2006/wordml" xmlns:wps="http://schemas.microsoft.com/office/word/2010/wordprocessingShape" mc:Ignorable="w14 w15 w16se w16cid w16 w16cex w16sdtdh w16sdtfl w16du wp14">
+<w:endnotes xmlns:wpc="http://schemas.microsoft.com/office/word/2010/wordprocessingCanvas" xmlns:cx="http://schemas.microsoft.com/office/drawing/2014/chartex" xmlns:cx1="http://schemas.microsoft.com/office/drawing/2015/9/8/chartex" xmlns:cx2="http://schemas.microsoft.com/office/drawing/2015/10/21/chartex" xmlns:cx3="http://schemas.microsoft.com/office/drawing/2016/5/9/chartex" xmlns:cx4="http://schemas.microsoft.com/office/drawing/2016/5/10/chartex" xmlns:cx5="http://schemas.microsoft.com/office/drawing/2016/5/11/chartex" xmlns:cx6="http://schemas.microsoft.com/office/drawing/2016/5/12/chartex" xmlns:cx7="http://schemas.microsoft.com/office/drawing/2016/5/13/chartex" xmlns:cx8="http://schemas.microsoft.com/office/drawing/2016/5/14/chartex" xmlns:mc="http://schemas.openxmlformats.org/markup-compatibility/2006" xmlns:m="http://schemas.openxmlformats.org/officeDocument/2006/math" xmlns:aink="http://schemas.microsoft.com/office/drawing/2016/ink" xmlns:am3d="http://schemas.microsoft.com/office/drawing/2017/model3d" xmlns:oel="http://schemas.microsoft.com/office/2019/extlst" xmlns:r="http://schemas.openxmlformats.org/officeDocument/2006/relationships" xmlns:wp14="http://schemas.microsoft.com/office/word/2010/wordprocessingDrawing" xmlns:wp="http://schemas.openxmlformats.org/drawingml/2006/wordprocessingDrawing" xmlns:wpg="http://schemas.microsoft.com/office/word/2010/wordprocessingGroup" xmlns:wpi="http://schemas.microsoft.com/office/word/2010/wordprocessingInk" xmlns:wps="http://schemas.microsoft.com/office/word/2010/wordprocessingShape" xmlns:o="urn:schemas-microsoft-com:office:office" xmlns:v="urn:schemas-microsoft-com:vml" xmlns:w10="urn:schemas-microsoft-com:office:word" xmlns:w="http://schemas.openxmlformats.org/wordprocessingml/2006/main" xmlns:w14="http://schemas.microsoft.com/office/word/2010/wordml" xmlns:w15="http://schemas.microsoft.com/office/word/2012/wordml" xmlns:w16cex="http://schemas.microsoft.com/office/word/2018/wordml/cex" xmlns:w16cid="http://schemas.microsoft.com/office/word/2016/wordml/cid" xmlns:w16="http://schemas.microsoft.com/office/word/2018/wordml" xmlns:w16sdtdh="http://schemas.microsoft.com/office/word/2020/wordml/sdtdatahash" xmlns:w16sdtfl="http://schemas.microsoft.com/office/word/2024/wordml/sdtformatlock" xmlns:w16se="http://schemas.microsoft.com/office/word/2015/wordml/symex" xmlns:w16du="http://schemas.microsoft.com/office/word/2023/wordml/word16du" xmlns:wne="http://schemas.microsoft.com/office/word/2006/wordml" mc:Ignorable="w14 w15 w16se w16cid w16 w16cex w16sdtdh w16sdtfl w16du wp14">
   <w:endnote w:type="separator" w:id="-1">
     <w:p>
       <w:pPr>
@@ -9540,7 +9524,7 @@
 </file>
 
 <file path=word/footer1.xml><?xml version="1.0" encoding="utf-8"?>
-<w:ftr xmlns:wpc="http://schemas.microsoft.com/office/word/2010/wordprocessingCanvas" xmlns:cx="http://schemas.microsoft.com/office/drawing/2014/chartex" xmlns:cx1="http://schemas.microsoft.com/office/drawing/2015/9/8/chartex" xmlns:cx2="http://schemas.microsoft.com/office/drawing/2015/10/21/chartex" xmlns:cx3="http://schemas.microsoft.com/office/drawing/2016/5/9/chartex" xmlns:cx4="http://schemas.microsoft.com/office/drawing/2016/5/10/chartex" xmlns:cx5="http://schemas.microsoft.com/office/drawing/2016/5/11/chartex" xmlns:cx6="http://schemas.microsoft.com/office/drawing/2016/5/12/chartex" xmlns:cx7="http://schemas.microsoft.com/office/drawing/2016/5/13/chartex" xmlns:cx8="http://schemas.microsoft.com/office/drawing/2016/5/14/chartex" xmlns:mc="http://schemas.openxmlformats.org/markup-compatibility/2006" xmlns:aink="http://schemas.microsoft.com/office/drawing/2016/ink" xmlns:am3d="http://schemas.microsoft.com/office/drawing/2017/model3d" xmlns:o="urn:schemas-microsoft-com:office:office" xmlns:oel="http://schemas.microsoft.com/office/2019/extlst" xmlns:r="http://schemas.openxmlformats.org/officeDocument/2006/relationships" xmlns:m="http://schemas.openxmlformats.org/officeDocument/2006/math" xmlns:v="urn:schemas-microsoft-com:vml" xmlns:wp14="http://schemas.microsoft.com/office/word/2010/wordprocessingDrawing" xmlns:wp="http://schemas.openxmlformats.org/drawingml/2006/wordprocessingDrawing" xmlns:w10="urn:schemas-microsoft-com:office:word" xmlns:w="http://schemas.openxmlformats.org/wordprocessingml/2006/main" xmlns:w14="http://schemas.microsoft.com/office/word/2010/wordml" xmlns:w15="http://schemas.microsoft.com/office/word/2012/wordml" xmlns:w16cex="http://schemas.microsoft.com/office/word/2018/wordml/cex" xmlns:w16cid="http://schemas.microsoft.com/office/word/2016/wordml/cid" xmlns:w16="http://schemas.microsoft.com/office/word/2018/wordml" xmlns:w16du="http://schemas.microsoft.com/office/word/2023/wordml/word16du" xmlns:w16sdtdh="http://schemas.microsoft.com/office/word/2020/wordml/sdtdatahash" xmlns:w16sdtfl="http://schemas.microsoft.com/office/word/2024/wordml/sdtformatlock" xmlns:w16se="http://schemas.microsoft.com/office/word/2015/wordml/symex" xmlns:wpg="http://schemas.microsoft.com/office/word/2010/wordprocessingGroup" xmlns:wpi="http://schemas.microsoft.com/office/word/2010/wordprocessingInk" xmlns:wne="http://schemas.microsoft.com/office/word/2006/wordml" xmlns:wps="http://schemas.microsoft.com/office/word/2010/wordprocessingShape" mc:Ignorable="w14 w15 w16se w16cid w16 w16cex w16sdtdh w16sdtfl w16du wp14">
+<w:ftr xmlns:wpc="http://schemas.microsoft.com/office/word/2010/wordprocessingCanvas" xmlns:cx="http://schemas.microsoft.com/office/drawing/2014/chartex" xmlns:cx1="http://schemas.microsoft.com/office/drawing/2015/9/8/chartex" xmlns:cx2="http://schemas.microsoft.com/office/drawing/2015/10/21/chartex" xmlns:cx3="http://schemas.microsoft.com/office/drawing/2016/5/9/chartex" xmlns:cx4="http://schemas.microsoft.com/office/drawing/2016/5/10/chartex" xmlns:cx5="http://schemas.microsoft.com/office/drawing/2016/5/11/chartex" xmlns:cx6="http://schemas.microsoft.com/office/drawing/2016/5/12/chartex" xmlns:cx7="http://schemas.microsoft.com/office/drawing/2016/5/13/chartex" xmlns:cx8="http://schemas.microsoft.com/office/drawing/2016/5/14/chartex" xmlns:mc="http://schemas.openxmlformats.org/markup-compatibility/2006" xmlns:m="http://schemas.openxmlformats.org/officeDocument/2006/math" xmlns:aink="http://schemas.microsoft.com/office/drawing/2016/ink" xmlns:am3d="http://schemas.microsoft.com/office/drawing/2017/model3d" xmlns:oel="http://schemas.microsoft.com/office/2019/extlst" xmlns:r="http://schemas.openxmlformats.org/officeDocument/2006/relationships" xmlns:wp14="http://schemas.microsoft.com/office/word/2010/wordprocessingDrawing" xmlns:wp="http://schemas.openxmlformats.org/drawingml/2006/wordprocessingDrawing" xmlns:wpg="http://schemas.microsoft.com/office/word/2010/wordprocessingGroup" xmlns:wpi="http://schemas.microsoft.com/office/word/2010/wordprocessingInk" xmlns:wps="http://schemas.microsoft.com/office/word/2010/wordprocessingShape" xmlns:o="urn:schemas-microsoft-com:office:office" xmlns:v="urn:schemas-microsoft-com:vml" xmlns:w10="urn:schemas-microsoft-com:office:word" xmlns:w="http://schemas.openxmlformats.org/wordprocessingml/2006/main" xmlns:w14="http://schemas.microsoft.com/office/word/2010/wordml" xmlns:w15="http://schemas.microsoft.com/office/word/2012/wordml" xmlns:w16cex="http://schemas.microsoft.com/office/word/2018/wordml/cex" xmlns:w16cid="http://schemas.microsoft.com/office/word/2016/wordml/cid" xmlns:w16="http://schemas.microsoft.com/office/word/2018/wordml" xmlns:w16sdtdh="http://schemas.microsoft.com/office/word/2020/wordml/sdtdatahash" xmlns:w16sdtfl="http://schemas.microsoft.com/office/word/2024/wordml/sdtformatlock" xmlns:w16se="http://schemas.microsoft.com/office/word/2015/wordml/symex" xmlns:w16du="http://schemas.microsoft.com/office/word/2023/wordml/word16du" xmlns:wne="http://schemas.microsoft.com/office/word/2006/wordml" mc:Ignorable="w14 w15 w16se w16cid w16 w16cex w16sdtdh w16sdtfl w16du wp14">
   <w:p>
     <w:pPr>
       <w:pStyle w:val="Footer"/>
@@ -9550,7 +9534,7 @@
 </file>
 
 <file path=word/footer2.xml><?xml version="1.0" encoding="utf-8"?>
-<w:ftr xmlns:wpc="http://schemas.microsoft.com/office/word/2010/wordprocessingCanvas" xmlns:cx="http://schemas.microsoft.com/office/drawing/2014/chartex" xmlns:cx1="http://schemas.microsoft.com/office/drawing/2015/9/8/chartex" xmlns:cx2="http://schemas.microsoft.com/office/drawing/2015/10/21/chartex" xmlns:cx3="http://schemas.microsoft.com/office/drawing/2016/5/9/chartex" xmlns:cx4="http://schemas.microsoft.com/office/drawing/2016/5/10/chartex" xmlns:cx5="http://schemas.microsoft.com/office/drawing/2016/5/11/chartex" xmlns:cx6="http://schemas.microsoft.com/office/drawing/2016/5/12/chartex" xmlns:cx7="http://schemas.microsoft.com/office/drawing/2016/5/13/chartex" xmlns:cx8="http://schemas.microsoft.com/office/drawing/2016/5/14/chartex" xmlns:mc="http://schemas.openxmlformats.org/markup-compatibility/2006" xmlns:aink="http://schemas.microsoft.com/office/drawing/2016/ink" xmlns:am3d="http://schemas.microsoft.com/office/drawing/2017/model3d" xmlns:o="urn:schemas-microsoft-com:office:office" xmlns:oel="http://schemas.microsoft.com/office/2019/extlst" xmlns:r="http://schemas.openxmlformats.org/officeDocument/2006/relationships" xmlns:m="http://schemas.openxmlformats.org/officeDocument/2006/math" xmlns:v="urn:schemas-microsoft-com:vml" xmlns:wp14="http://schemas.microsoft.com/office/word/2010/wordprocessingDrawing" xmlns:wp="http://schemas.openxmlformats.org/drawingml/2006/wordprocessingDrawing" xmlns:w10="urn:schemas-microsoft-com:office:word" xmlns:w="http://schemas.openxmlformats.org/wordprocessingml/2006/main" xmlns:w14="http://schemas.microsoft.com/office/word/2010/wordml" xmlns:w15="http://schemas.microsoft.com/office/word/2012/wordml" xmlns:w16cex="http://schemas.microsoft.com/office/word/2018/wordml/cex" xmlns:w16cid="http://schemas.microsoft.com/office/word/2016/wordml/cid" xmlns:w16="http://schemas.microsoft.com/office/word/2018/wordml" xmlns:w16du="http://schemas.microsoft.com/office/word/2023/wordml/word16du" xmlns:w16sdtdh="http://schemas.microsoft.com/office/word/2020/wordml/sdtdatahash" xmlns:w16sdtfl="http://schemas.microsoft.com/office/word/2024/wordml/sdtformatlock" xmlns:w16se="http://schemas.microsoft.com/office/word/2015/wordml/symex" xmlns:wpg="http://schemas.microsoft.com/office/word/2010/wordprocessingGroup" xmlns:wpi="http://schemas.microsoft.com/office/word/2010/wordprocessingInk" xmlns:wne="http://schemas.microsoft.com/office/word/2006/wordml" xmlns:wps="http://schemas.microsoft.com/office/word/2010/wordprocessingShape" mc:Ignorable="w14 w15 w16se w16cid w16 w16cex w16sdtdh w16sdtfl w16du wp14">
+<w:ftr xmlns:wpc="http://schemas.microsoft.com/office/word/2010/wordprocessingCanvas" xmlns:cx="http://schemas.microsoft.com/office/drawing/2014/chartex" xmlns:cx1="http://schemas.microsoft.com/office/drawing/2015/9/8/chartex" xmlns:cx2="http://schemas.microsoft.com/office/drawing/2015/10/21/chartex" xmlns:cx3="http://schemas.microsoft.com/office/drawing/2016/5/9/chartex" xmlns:cx4="http://schemas.microsoft.com/office/drawing/2016/5/10/chartex" xmlns:cx5="http://schemas.microsoft.com/office/drawing/2016/5/11/chartex" xmlns:cx6="http://schemas.microsoft.com/office/drawing/2016/5/12/chartex" xmlns:cx7="http://schemas.microsoft.com/office/drawing/2016/5/13/chartex" xmlns:cx8="http://schemas.microsoft.com/office/drawing/2016/5/14/chartex" xmlns:mc="http://schemas.openxmlformats.org/markup-compatibility/2006" xmlns:m="http://schemas.openxmlformats.org/officeDocument/2006/math" xmlns:aink="http://schemas.microsoft.com/office/drawing/2016/ink" xmlns:am3d="http://schemas.microsoft.com/office/drawing/2017/model3d" xmlns:oel="http://schemas.microsoft.com/office/2019/extlst" xmlns:r="http://schemas.openxmlformats.org/officeDocument/2006/relationships" xmlns:wp14="http://schemas.microsoft.com/office/word/2010/wordprocessingDrawing" xmlns:wp="http://schemas.openxmlformats.org/drawingml/2006/wordprocessingDrawing" xmlns:wpg="http://schemas.microsoft.com/office/word/2010/wordprocessingGroup" xmlns:wpi="http://schemas.microsoft.com/office/word/2010/wordprocessingInk" xmlns:wps="http://schemas.microsoft.com/office/word/2010/wordprocessingShape" xmlns:o="urn:schemas-microsoft-com:office:office" xmlns:v="urn:schemas-microsoft-com:vml" xmlns:w10="urn:schemas-microsoft-com:office:word" xmlns:w="http://schemas.openxmlformats.org/wordprocessingml/2006/main" xmlns:w14="http://schemas.microsoft.com/office/word/2010/wordml" xmlns:w15="http://schemas.microsoft.com/office/word/2012/wordml" xmlns:w16cex="http://schemas.microsoft.com/office/word/2018/wordml/cex" xmlns:w16cid="http://schemas.microsoft.com/office/word/2016/wordml/cid" xmlns:w16="http://schemas.microsoft.com/office/word/2018/wordml" xmlns:w16sdtdh="http://schemas.microsoft.com/office/word/2020/wordml/sdtdatahash" xmlns:w16sdtfl="http://schemas.microsoft.com/office/word/2024/wordml/sdtformatlock" xmlns:w16se="http://schemas.microsoft.com/office/word/2015/wordml/symex" xmlns:w16du="http://schemas.microsoft.com/office/word/2023/wordml/word16du" xmlns:wne="http://schemas.microsoft.com/office/word/2006/wordml" mc:Ignorable="w14 w15 w16se w16cid w16 w16cex w16sdtdh w16sdtfl w16du wp14">
   <w:p>
     <w:pPr>
       <w:tabs>
@@ -9697,7 +9681,7 @@
 </file>
 
 <file path=word/footer3.xml><?xml version="1.0" encoding="utf-8"?>
-<w:ftr xmlns:wpc="http://schemas.microsoft.com/office/word/2010/wordprocessingCanvas" xmlns:cx="http://schemas.microsoft.com/office/drawing/2014/chartex" xmlns:cx1="http://schemas.microsoft.com/office/drawing/2015/9/8/chartex" xmlns:cx2="http://schemas.microsoft.com/office/drawing/2015/10/21/chartex" xmlns:cx3="http://schemas.microsoft.com/office/drawing/2016/5/9/chartex" xmlns:cx4="http://schemas.microsoft.com/office/drawing/2016/5/10/chartex" xmlns:cx5="http://schemas.microsoft.com/office/drawing/2016/5/11/chartex" xmlns:cx6="http://schemas.microsoft.com/office/drawing/2016/5/12/chartex" xmlns:cx7="http://schemas.microsoft.com/office/drawing/2016/5/13/chartex" xmlns:cx8="http://schemas.microsoft.com/office/drawing/2016/5/14/chartex" xmlns:mc="http://schemas.openxmlformats.org/markup-compatibility/2006" xmlns:aink="http://schemas.microsoft.com/office/drawing/2016/ink" xmlns:am3d="http://schemas.microsoft.com/office/drawing/2017/model3d" xmlns:o="urn:schemas-microsoft-com:office:office" xmlns:oel="http://schemas.microsoft.com/office/2019/extlst" xmlns:r="http://schemas.openxmlformats.org/officeDocument/2006/relationships" xmlns:m="http://schemas.openxmlformats.org/officeDocument/2006/math" xmlns:v="urn:schemas-microsoft-com:vml" xmlns:wp14="http://schemas.microsoft.com/office/word/2010/wordprocessingDrawing" xmlns:wp="http://schemas.openxmlformats.org/drawingml/2006/wordprocessingDrawing" xmlns:w10="urn:schemas-microsoft-com:office:word" xmlns:w="http://schemas.openxmlformats.org/wordprocessingml/2006/main" xmlns:w14="http://schemas.microsoft.com/office/word/2010/wordml" xmlns:w15="http://schemas.microsoft.com/office/word/2012/wordml" xmlns:w16cex="http://schemas.microsoft.com/office/word/2018/wordml/cex" xmlns:w16cid="http://schemas.microsoft.com/office/word/2016/wordml/cid" xmlns:w16="http://schemas.microsoft.com/office/word/2018/wordml" xmlns:w16du="http://schemas.microsoft.com/office/word/2023/wordml/word16du" xmlns:w16sdtdh="http://schemas.microsoft.com/office/word/2020/wordml/sdtdatahash" xmlns:w16sdtfl="http://schemas.microsoft.com/office/word/2024/wordml/sdtformatlock" xmlns:w16se="http://schemas.microsoft.com/office/word/2015/wordml/symex" xmlns:wpg="http://schemas.microsoft.com/office/word/2010/wordprocessingGroup" xmlns:wpi="http://schemas.microsoft.com/office/word/2010/wordprocessingInk" xmlns:wne="http://schemas.microsoft.com/office/word/2006/wordml" xmlns:wps="http://schemas.microsoft.com/office/word/2010/wordprocessingShape" mc:Ignorable="w14 w15 w16se w16cid w16 w16cex w16sdtdh w16sdtfl w16du wp14">
+<w:ftr xmlns:wpc="http://schemas.microsoft.com/office/word/2010/wordprocessingCanvas" xmlns:cx="http://schemas.microsoft.com/office/drawing/2014/chartex" xmlns:cx1="http://schemas.microsoft.com/office/drawing/2015/9/8/chartex" xmlns:cx2="http://schemas.microsoft.com/office/drawing/2015/10/21/chartex" xmlns:cx3="http://schemas.microsoft.com/office/drawing/2016/5/9/chartex" xmlns:cx4="http://schemas.microsoft.com/office/drawing/2016/5/10/chartex" xmlns:cx5="http://schemas.microsoft.com/office/drawing/2016/5/11/chartex" xmlns:cx6="http://schemas.microsoft.com/office/drawing/2016/5/12/chartex" xmlns:cx7="http://schemas.microsoft.com/office/drawing/2016/5/13/chartex" xmlns:cx8="http://schemas.microsoft.com/office/drawing/2016/5/14/chartex" xmlns:mc="http://schemas.openxmlformats.org/markup-compatibility/2006" xmlns:m="http://schemas.openxmlformats.org/officeDocument/2006/math" xmlns:aink="http://schemas.microsoft.com/office/drawing/2016/ink" xmlns:am3d="http://schemas.microsoft.com/office/drawing/2017/model3d" xmlns:oel="http://schemas.microsoft.com/office/2019/extlst" xmlns:r="http://schemas.openxmlformats.org/officeDocument/2006/relationships" xmlns:wp14="http://schemas.microsoft.com/office/word/2010/wordprocessingDrawing" xmlns:wp="http://schemas.openxmlformats.org/drawingml/2006/wordprocessingDrawing" xmlns:wpg="http://schemas.microsoft.com/office/word/2010/wordprocessingGroup" xmlns:wpi="http://schemas.microsoft.com/office/word/2010/wordprocessingInk" xmlns:wps="http://schemas.microsoft.com/office/word/2010/wordprocessingShape" xmlns:o="urn:schemas-microsoft-com:office:office" xmlns:v="urn:schemas-microsoft-com:vml" xmlns:w10="urn:schemas-microsoft-com:office:word" xmlns:w="http://schemas.openxmlformats.org/wordprocessingml/2006/main" xmlns:w14="http://schemas.microsoft.com/office/word/2010/wordml" xmlns:w15="http://schemas.microsoft.com/office/word/2012/wordml" xmlns:w16cex="http://schemas.microsoft.com/office/word/2018/wordml/cex" xmlns:w16cid="http://schemas.microsoft.com/office/word/2016/wordml/cid" xmlns:w16="http://schemas.microsoft.com/office/word/2018/wordml" xmlns:w16sdtdh="http://schemas.microsoft.com/office/word/2020/wordml/sdtdatahash" xmlns:w16sdtfl="http://schemas.microsoft.com/office/word/2024/wordml/sdtformatlock" xmlns:w16se="http://schemas.microsoft.com/office/word/2015/wordml/symex" xmlns:w16du="http://schemas.microsoft.com/office/word/2023/wordml/word16du" xmlns:wne="http://schemas.microsoft.com/office/word/2006/wordml" mc:Ignorable="w14 w15 w16se w16cid w16 w16cex w16sdtdh w16sdtfl w16du wp14">
   <w:p>
     <w:pPr>
       <w:pStyle w:val="Footer"/>
@@ -9707,7 +9691,7 @@
 </file>
 
 <file path=word/footnotes.xml><?xml version="1.0" encoding="utf-8"?>
-<w:footnotes xmlns:wpc="http://schemas.microsoft.com/office/word/2010/wordprocessingCanvas" xmlns:cx="http://schemas.microsoft.com/office/drawing/2014/chartex" xmlns:cx1="http://schemas.microsoft.com/office/drawing/2015/9/8/chartex" xmlns:cx2="http://schemas.microsoft.com/office/drawing/2015/10/21/chartex" xmlns:cx3="http://schemas.microsoft.com/office/drawing/2016/5/9/chartex" xmlns:cx4="http://schemas.microsoft.com/office/drawing/2016/5/10/chartex" xmlns:cx5="http://schemas.microsoft.com/office/drawing/2016/5/11/chartex" xmlns:cx6="http://schemas.microsoft.com/office/drawing/2016/5/12/chartex" xmlns:cx7="http://schemas.microsoft.com/office/drawing/2016/5/13/chartex" xmlns:cx8="http://schemas.microsoft.com/office/drawing/2016/5/14/chartex" xmlns:mc="http://schemas.openxmlformats.org/markup-compatibility/2006" xmlns:aink="http://schemas.microsoft.com/office/drawing/2016/ink" xmlns:am3d="http://schemas.microsoft.com/office/drawing/2017/model3d" xmlns:o="urn:schemas-microsoft-com:office:office" xmlns:oel="http://schemas.microsoft.com/office/2019/extlst" xmlns:r="http://schemas.openxmlformats.org/officeDocument/2006/relationships" xmlns:m="http://schemas.openxmlformats.org/officeDocument/2006/math" xmlns:v="urn:schemas-microsoft-com:vml" xmlns:wp14="http://schemas.microsoft.com/office/word/2010/wordprocessingDrawing" xmlns:wp="http://schemas.openxmlformats.org/drawingml/2006/wordprocessingDrawing" xmlns:w10="urn:schemas-microsoft-com:office:word" xmlns:w="http://schemas.openxmlformats.org/wordprocessingml/2006/main" xmlns:w14="http://schemas.microsoft.com/office/word/2010/wordml" xmlns:w15="http://schemas.microsoft.com/office/word/2012/wordml" xmlns:w16cex="http://schemas.microsoft.com/office/word/2018/wordml/cex" xmlns:w16cid="http://schemas.microsoft.com/office/word/2016/wordml/cid" xmlns:w16="http://schemas.microsoft.com/office/word/2018/wordml" xmlns:w16du="http://schemas.microsoft.com/office/word/2023/wordml/word16du" xmlns:w16sdtdh="http://schemas.microsoft.com/office/word/2020/wordml/sdtdatahash" xmlns:w16sdtfl="http://schemas.microsoft.com/office/word/2024/wordml/sdtformatlock" xmlns:w16se="http://schemas.microsoft.com/office/word/2015/wordml/symex" xmlns:wpg="http://schemas.microsoft.com/office/word/2010/wordprocessingGroup" xmlns:wpi="http://schemas.microsoft.com/office/word/2010/wordprocessingInk" xmlns:wne="http://schemas.microsoft.com/office/word/2006/wordml" xmlns:wps="http://schemas.microsoft.com/office/word/2010/wordprocessingShape" mc:Ignorable="w14 w15 w16se w16cid w16 w16cex w16sdtdh w16sdtfl w16du wp14">
+<w:footnotes xmlns:wpc="http://schemas.microsoft.com/office/word/2010/wordprocessingCanvas" xmlns:cx="http://schemas.microsoft.com/office/drawing/2014/chartex" xmlns:cx1="http://schemas.microsoft.com/office/drawing/2015/9/8/chartex" xmlns:cx2="http://schemas.microsoft.com/office/drawing/2015/10/21/chartex" xmlns:cx3="http://schemas.microsoft.com/office/drawing/2016/5/9/chartex" xmlns:cx4="http://schemas.microsoft.com/office/drawing/2016/5/10/chartex" xmlns:cx5="http://schemas.microsoft.com/office/drawing/2016/5/11/chartex" xmlns:cx6="http://schemas.microsoft.com/office/drawing/2016/5/12/chartex" xmlns:cx7="http://schemas.microsoft.com/office/drawing/2016/5/13/chartex" xmlns:cx8="http://schemas.microsoft.com/office/drawing/2016/5/14/chartex" xmlns:mc="http://schemas.openxmlformats.org/markup-compatibility/2006" xmlns:m="http://schemas.openxmlformats.org/officeDocument/2006/math" xmlns:aink="http://schemas.microsoft.com/office/drawing/2016/ink" xmlns:am3d="http://schemas.microsoft.com/office/drawing/2017/model3d" xmlns:oel="http://schemas.microsoft.com/office/2019/extlst" xmlns:r="http://schemas.openxmlformats.org/officeDocument/2006/relationships" xmlns:wp14="http://schemas.microsoft.com/office/word/2010/wordprocessingDrawing" xmlns:wp="http://schemas.openxmlformats.org/drawingml/2006/wordprocessingDrawing" xmlns:wpg="http://schemas.microsoft.com/office/word/2010/wordprocessingGroup" xmlns:wpi="http://schemas.microsoft.com/office/word/2010/wordprocessingInk" xmlns:wps="http://schemas.microsoft.com/office/word/2010/wordprocessingShape" xmlns:o="urn:schemas-microsoft-com:office:office" xmlns:v="urn:schemas-microsoft-com:vml" xmlns:w10="urn:schemas-microsoft-com:office:word" xmlns:w="http://schemas.openxmlformats.org/wordprocessingml/2006/main" xmlns:w14="http://schemas.microsoft.com/office/word/2010/wordml" xmlns:w15="http://schemas.microsoft.com/office/word/2012/wordml" xmlns:w16cex="http://schemas.microsoft.com/office/word/2018/wordml/cex" xmlns:w16cid="http://schemas.microsoft.com/office/word/2016/wordml/cid" xmlns:w16="http://schemas.microsoft.com/office/word/2018/wordml" xmlns:w16sdtdh="http://schemas.microsoft.com/office/word/2020/wordml/sdtdatahash" xmlns:w16sdtfl="http://schemas.microsoft.com/office/word/2024/wordml/sdtformatlock" xmlns:w16se="http://schemas.microsoft.com/office/word/2015/wordml/symex" xmlns:w16du="http://schemas.microsoft.com/office/word/2023/wordml/word16du" xmlns:wne="http://schemas.microsoft.com/office/word/2006/wordml" mc:Ignorable="w14 w15 w16se w16cid w16 w16cex w16sdtdh w16sdtfl w16du wp14">
   <w:footnote w:type="separator" w:id="-1">
     <w:p>
       <w:pPr>
@@ -9732,7 +9716,7 @@
 </file>
 
 <file path=word/header1.xml><?xml version="1.0" encoding="utf-8"?>
-<w:hdr xmlns:wpc="http://schemas.microsoft.com/office/word/2010/wordprocessingCanvas" xmlns:cx="http://schemas.microsoft.com/office/drawing/2014/chartex" xmlns:cx1="http://schemas.microsoft.com/office/drawing/2015/9/8/chartex" xmlns:cx2="http://schemas.microsoft.com/office/drawing/2015/10/21/chartex" xmlns:cx3="http://schemas.microsoft.com/office/drawing/2016/5/9/chartex" xmlns:cx4="http://schemas.microsoft.com/office/drawing/2016/5/10/chartex" xmlns:cx5="http://schemas.microsoft.com/office/drawing/2016/5/11/chartex" xmlns:cx6="http://schemas.microsoft.com/office/drawing/2016/5/12/chartex" xmlns:cx7="http://schemas.microsoft.com/office/drawing/2016/5/13/chartex" xmlns:cx8="http://schemas.microsoft.com/office/drawing/2016/5/14/chartex" xmlns:mc="http://schemas.openxmlformats.org/markup-compatibility/2006" xmlns:aink="http://schemas.microsoft.com/office/drawing/2016/ink" xmlns:am3d="http://schemas.microsoft.com/office/drawing/2017/model3d" xmlns:o="urn:schemas-microsoft-com:office:office" xmlns:oel="http://schemas.microsoft.com/office/2019/extlst" xmlns:r="http://schemas.openxmlformats.org/officeDocument/2006/relationships" xmlns:m="http://schemas.openxmlformats.org/officeDocument/2006/math" xmlns:v="urn:schemas-microsoft-com:vml" xmlns:wp14="http://schemas.microsoft.com/office/word/2010/wordprocessingDrawing" xmlns:wp="http://schemas.openxmlformats.org/drawingml/2006/wordprocessingDrawing" xmlns:w10="urn:schemas-microsoft-com:office:word" xmlns:w="http://schemas.openxmlformats.org/wordprocessingml/2006/main" xmlns:w14="http://schemas.microsoft.com/office/word/2010/wordml" xmlns:w15="http://schemas.microsoft.com/office/word/2012/wordml" xmlns:w16cex="http://schemas.microsoft.com/office/word/2018/wordml/cex" xmlns:w16cid="http://schemas.microsoft.com/office/word/2016/wordml/cid" xmlns:w16="http://schemas.microsoft.com/office/word/2018/wordml" xmlns:w16du="http://schemas.microsoft.com/office/word/2023/wordml/word16du" xmlns:w16sdtdh="http://schemas.microsoft.com/office/word/2020/wordml/sdtdatahash" xmlns:w16sdtfl="http://schemas.microsoft.com/office/word/2024/wordml/sdtformatlock" xmlns:w16se="http://schemas.microsoft.com/office/word/2015/wordml/symex" xmlns:wpg="http://schemas.microsoft.com/office/word/2010/wordprocessingGroup" xmlns:wpi="http://schemas.microsoft.com/office/word/2010/wordprocessingInk" xmlns:wne="http://schemas.microsoft.com/office/word/2006/wordml" xmlns:wps="http://schemas.microsoft.com/office/word/2010/wordprocessingShape" mc:Ignorable="w14 w15 w16se w16cid w16 w16cex w16sdtdh w16sdtfl w16du wp14">
+<w:hdr xmlns:wpc="http://schemas.microsoft.com/office/word/2010/wordprocessingCanvas" xmlns:cx="http://schemas.microsoft.com/office/drawing/2014/chartex" xmlns:cx1="http://schemas.microsoft.com/office/drawing/2015/9/8/chartex" xmlns:cx2="http://schemas.microsoft.com/office/drawing/2015/10/21/chartex" xmlns:cx3="http://schemas.microsoft.com/office/drawing/2016/5/9/chartex" xmlns:cx4="http://schemas.microsoft.com/office/drawing/2016/5/10/chartex" xmlns:cx5="http://schemas.microsoft.com/office/drawing/2016/5/11/chartex" xmlns:cx6="http://schemas.microsoft.com/office/drawing/2016/5/12/chartex" xmlns:cx7="http://schemas.microsoft.com/office/drawing/2016/5/13/chartex" xmlns:cx8="http://schemas.microsoft.com/office/drawing/2016/5/14/chartex" xmlns:mc="http://schemas.openxmlformats.org/markup-compatibility/2006" xmlns:m="http://schemas.openxmlformats.org/officeDocument/2006/math" xmlns:aink="http://schemas.microsoft.com/office/drawing/2016/ink" xmlns:am3d="http://schemas.microsoft.com/office/drawing/2017/model3d" xmlns:oel="http://schemas.microsoft.com/office/2019/extlst" xmlns:r="http://schemas.openxmlformats.org/officeDocument/2006/relationships" xmlns:wp14="http://schemas.microsoft.com/office/word/2010/wordprocessingDrawing" xmlns:wp="http://schemas.openxmlformats.org/drawingml/2006/wordprocessingDrawing" xmlns:wpg="http://schemas.microsoft.com/office/word/2010/wordprocessingGroup" xmlns:wpi="http://schemas.microsoft.com/office/word/2010/wordprocessingInk" xmlns:wps="http://schemas.microsoft.com/office/word/2010/wordprocessingShape" xmlns:o="urn:schemas-microsoft-com:office:office" xmlns:v="urn:schemas-microsoft-com:vml" xmlns:w10="urn:schemas-microsoft-com:office:word" xmlns:w="http://schemas.openxmlformats.org/wordprocessingml/2006/main" xmlns:w14="http://schemas.microsoft.com/office/word/2010/wordml" xmlns:w15="http://schemas.microsoft.com/office/word/2012/wordml" xmlns:w16cex="http://schemas.microsoft.com/office/word/2018/wordml/cex" xmlns:w16cid="http://schemas.microsoft.com/office/word/2016/wordml/cid" xmlns:w16="http://schemas.microsoft.com/office/word/2018/wordml" xmlns:w16sdtdh="http://schemas.microsoft.com/office/word/2020/wordml/sdtdatahash" xmlns:w16sdtfl="http://schemas.microsoft.com/office/word/2024/wordml/sdtformatlock" xmlns:w16se="http://schemas.microsoft.com/office/word/2015/wordml/symex" xmlns:w16du="http://schemas.microsoft.com/office/word/2023/wordml/word16du" xmlns:wne="http://schemas.microsoft.com/office/word/2006/wordml" mc:Ignorable="w14 w15 w16se w16cid w16 w16cex w16sdtdh w16sdtfl w16du wp14">
   <w:p>
     <w:pPr>
       <w:pStyle w:val="Header"/>
@@ -9742,7 +9726,7 @@
 </file>
 
 <file path=word/header2.xml><?xml version="1.0" encoding="utf-8"?>
-<w:hdr xmlns:wpc="http://schemas.microsoft.com/office/word/2010/wordprocessingCanvas" xmlns:cx="http://schemas.microsoft.com/office/drawing/2014/chartex" xmlns:cx1="http://schemas.microsoft.com/office/drawing/2015/9/8/chartex" xmlns:cx2="http://schemas.microsoft.com/office/drawing/2015/10/21/chartex" xmlns:cx3="http://schemas.microsoft.com/office/drawing/2016/5/9/chartex" xmlns:cx4="http://schemas.microsoft.com/office/drawing/2016/5/10/chartex" xmlns:cx5="http://schemas.microsoft.com/office/drawing/2016/5/11/chartex" xmlns:cx6="http://schemas.microsoft.com/office/drawing/2016/5/12/chartex" xmlns:cx7="http://schemas.microsoft.com/office/drawing/2016/5/13/chartex" xmlns:cx8="http://schemas.microsoft.com/office/drawing/2016/5/14/chartex" xmlns:mc="http://schemas.openxmlformats.org/markup-compatibility/2006" xmlns:aink="http://schemas.microsoft.com/office/drawing/2016/ink" xmlns:am3d="http://schemas.microsoft.com/office/drawing/2017/model3d" xmlns:o="urn:schemas-microsoft-com:office:office" xmlns:oel="http://schemas.microsoft.com/office/2019/extlst" xmlns:r="http://schemas.openxmlformats.org/officeDocument/2006/relationships" xmlns:m="http://schemas.openxmlformats.org/officeDocument/2006/math" xmlns:v="urn:schemas-microsoft-com:vml" xmlns:wp14="http://schemas.microsoft.com/office/word/2010/wordprocessingDrawing" xmlns:wp="http://schemas.openxmlformats.org/drawingml/2006/wordprocessingDrawing" xmlns:w10="urn:schemas-microsoft-com:office:word" xmlns:w="http://schemas.openxmlformats.org/wordprocessingml/2006/main" xmlns:w14="http://schemas.microsoft.com/office/word/2010/wordml" xmlns:w15="http://schemas.microsoft.com/office/word/2012/wordml" xmlns:w16cex="http://schemas.microsoft.com/office/word/2018/wordml/cex" xmlns:w16cid="http://schemas.microsoft.com/office/word/2016/wordml/cid" xmlns:w16="http://schemas.microsoft.com/office/word/2018/wordml" xmlns:w16du="http://schemas.microsoft.com/office/word/2023/wordml/word16du" xmlns:w16sdtdh="http://schemas.microsoft.com/office/word/2020/wordml/sdtdatahash" xmlns:w16sdtfl="http://schemas.microsoft.com/office/word/2024/wordml/sdtformatlock" xmlns:w16se="http://schemas.microsoft.com/office/word/2015/wordml/symex" xmlns:wpg="http://schemas.microsoft.com/office/word/2010/wordprocessingGroup" xmlns:wpi="http://schemas.microsoft.com/office/word/2010/wordprocessingInk" xmlns:wne="http://schemas.microsoft.com/office/word/2006/wordml" xmlns:wps="http://schemas.microsoft.com/office/word/2010/wordprocessingShape" mc:Ignorable="w14 w15 w16se w16cid w16 w16cex w16sdtdh w16sdtfl w16du wp14">
+<w:hdr xmlns:wpc="http://schemas.microsoft.com/office/word/2010/wordprocessingCanvas" xmlns:cx="http://schemas.microsoft.com/office/drawing/2014/chartex" xmlns:cx1="http://schemas.microsoft.com/office/drawing/2015/9/8/chartex" xmlns:cx2="http://schemas.microsoft.com/office/drawing/2015/10/21/chartex" xmlns:cx3="http://schemas.microsoft.com/office/drawing/2016/5/9/chartex" xmlns:cx4="http://schemas.microsoft.com/office/drawing/2016/5/10/chartex" xmlns:cx5="http://schemas.microsoft.com/office/drawing/2016/5/11/chartex" xmlns:cx6="http://schemas.microsoft.com/office/drawing/2016/5/12/chartex" xmlns:cx7="http://schemas.microsoft.com/office/drawing/2016/5/13/chartex" xmlns:cx8="http://schemas.microsoft.com/office/drawing/2016/5/14/chartex" xmlns:mc="http://schemas.openxmlformats.org/markup-compatibility/2006" xmlns:m="http://schemas.openxmlformats.org/officeDocument/2006/math" xmlns:aink="http://schemas.microsoft.com/office/drawing/2016/ink" xmlns:am3d="http://schemas.microsoft.com/office/drawing/2017/model3d" xmlns:oel="http://schemas.microsoft.com/office/2019/extlst" xmlns:r="http://schemas.openxmlformats.org/officeDocument/2006/relationships" xmlns:wp14="http://schemas.microsoft.com/office/word/2010/wordprocessingDrawing" xmlns:wp="http://schemas.openxmlformats.org/drawingml/2006/wordprocessingDrawing" xmlns:wpg="http://schemas.microsoft.com/office/word/2010/wordprocessingGroup" xmlns:wpi="http://schemas.microsoft.com/office/word/2010/wordprocessingInk" xmlns:wps="http://schemas.microsoft.com/office/word/2010/wordprocessingShape" xmlns:o="urn:schemas-microsoft-com:office:office" xmlns:v="urn:schemas-microsoft-com:vml" xmlns:w10="urn:schemas-microsoft-com:office:word" xmlns:w="http://schemas.openxmlformats.org/wordprocessingml/2006/main" xmlns:w14="http://schemas.microsoft.com/office/word/2010/wordml" xmlns:w15="http://schemas.microsoft.com/office/word/2012/wordml" xmlns:w16cex="http://schemas.microsoft.com/office/word/2018/wordml/cex" xmlns:w16cid="http://schemas.microsoft.com/office/word/2016/wordml/cid" xmlns:w16="http://schemas.microsoft.com/office/word/2018/wordml" xmlns:w16sdtdh="http://schemas.microsoft.com/office/word/2020/wordml/sdtdatahash" xmlns:w16sdtfl="http://schemas.microsoft.com/office/word/2024/wordml/sdtformatlock" xmlns:w16se="http://schemas.microsoft.com/office/word/2015/wordml/symex" xmlns:w16du="http://schemas.microsoft.com/office/word/2023/wordml/word16du" xmlns:wne="http://schemas.microsoft.com/office/word/2006/wordml" mc:Ignorable="w14 w15 w16se w16cid w16 w16cex w16sdtdh w16sdtfl w16du wp14">
   <w:p>
     <w:pPr>
       <w:pStyle w:val="Header"/>
@@ -10084,7 +10068,7 @@
 </file>
 
 <file path=word/header3.xml><?xml version="1.0" encoding="utf-8"?>
-<w:hdr xmlns:wpc="http://schemas.microsoft.com/office/word/2010/wordprocessingCanvas" xmlns:cx="http://schemas.microsoft.com/office/drawing/2014/chartex" xmlns:cx1="http://schemas.microsoft.com/office/drawing/2015/9/8/chartex" xmlns:cx2="http://schemas.microsoft.com/office/drawing/2015/10/21/chartex" xmlns:cx3="http://schemas.microsoft.com/office/drawing/2016/5/9/chartex" xmlns:cx4="http://schemas.microsoft.com/office/drawing/2016/5/10/chartex" xmlns:cx5="http://schemas.microsoft.com/office/drawing/2016/5/11/chartex" xmlns:cx6="http://schemas.microsoft.com/office/drawing/2016/5/12/chartex" xmlns:cx7="http://schemas.microsoft.com/office/drawing/2016/5/13/chartex" xmlns:cx8="http://schemas.microsoft.com/office/drawing/2016/5/14/chartex" xmlns:mc="http://schemas.openxmlformats.org/markup-compatibility/2006" xmlns:aink="http://schemas.microsoft.com/office/drawing/2016/ink" xmlns:am3d="http://schemas.microsoft.com/office/drawing/2017/model3d" xmlns:o="urn:schemas-microsoft-com:office:office" xmlns:oel="http://schemas.microsoft.com/office/2019/extlst" xmlns:r="http://schemas.openxmlformats.org/officeDocument/2006/relationships" xmlns:m="http://schemas.openxmlformats.org/officeDocument/2006/math" xmlns:v="urn:schemas-microsoft-com:vml" xmlns:wp14="http://schemas.microsoft.com/office/word/2010/wordprocessingDrawing" xmlns:wp="http://schemas.openxmlformats.org/drawingml/2006/wordprocessingDrawing" xmlns:w10="urn:schemas-microsoft-com:office:word" xmlns:w="http://schemas.openxmlformats.org/wordprocessingml/2006/main" xmlns:w14="http://schemas.microsoft.com/office/word/2010/wordml" xmlns:w15="http://schemas.microsoft.com/office/word/2012/wordml" xmlns:w16cex="http://schemas.microsoft.com/office/word/2018/wordml/cex" xmlns:w16cid="http://schemas.microsoft.com/office/word/2016/wordml/cid" xmlns:w16="http://schemas.microsoft.com/office/word/2018/wordml" xmlns:w16du="http://schemas.microsoft.com/office/word/2023/wordml/word16du" xmlns:w16sdtdh="http://schemas.microsoft.com/office/word/2020/wordml/sdtdatahash" xmlns:w16sdtfl="http://schemas.microsoft.com/office/word/2024/wordml/sdtformatlock" xmlns:w16se="http://schemas.microsoft.com/office/word/2015/wordml/symex" xmlns:wpg="http://schemas.microsoft.com/office/word/2010/wordprocessingGroup" xmlns:wpi="http://schemas.microsoft.com/office/word/2010/wordprocessingInk" xmlns:wne="http://schemas.microsoft.com/office/word/2006/wordml" xmlns:wps="http://schemas.microsoft.com/office/word/2010/wordprocessingShape" mc:Ignorable="w14 w15 w16se w16cid w16 w16cex w16sdtdh w16sdtfl w16du wp14">
+<w:hdr xmlns:wpc="http://schemas.microsoft.com/office/word/2010/wordprocessingCanvas" xmlns:cx="http://schemas.microsoft.com/office/drawing/2014/chartex" xmlns:cx1="http://schemas.microsoft.com/office/drawing/2015/9/8/chartex" xmlns:cx2="http://schemas.microsoft.com/office/drawing/2015/10/21/chartex" xmlns:cx3="http://schemas.microsoft.com/office/drawing/2016/5/9/chartex" xmlns:cx4="http://schemas.microsoft.com/office/drawing/2016/5/10/chartex" xmlns:cx5="http://schemas.microsoft.com/office/drawing/2016/5/11/chartex" xmlns:cx6="http://schemas.microsoft.com/office/drawing/2016/5/12/chartex" xmlns:cx7="http://schemas.microsoft.com/office/drawing/2016/5/13/chartex" xmlns:cx8="http://schemas.microsoft.com/office/drawing/2016/5/14/chartex" xmlns:mc="http://schemas.openxmlformats.org/markup-compatibility/2006" xmlns:m="http://schemas.openxmlformats.org/officeDocument/2006/math" xmlns:aink="http://schemas.microsoft.com/office/drawing/2016/ink" xmlns:am3d="http://schemas.microsoft.com/office/drawing/2017/model3d" xmlns:oel="http://schemas.microsoft.com/office/2019/extlst" xmlns:r="http://schemas.openxmlformats.org/officeDocument/2006/relationships" xmlns:wp14="http://schemas.microsoft.com/office/word/2010/wordprocessingDrawing" xmlns:wp="http://schemas.openxmlformats.org/drawingml/2006/wordprocessingDrawing" xmlns:wpg="http://schemas.microsoft.com/office/word/2010/wordprocessingGroup" xmlns:wpi="http://schemas.microsoft.com/office/word/2010/wordprocessingInk" xmlns:wps="http://schemas.microsoft.com/office/word/2010/wordprocessingShape" xmlns:o="urn:schemas-microsoft-com:office:office" xmlns:v="urn:schemas-microsoft-com:vml" xmlns:w10="urn:schemas-microsoft-com:office:word" xmlns:w="http://schemas.openxmlformats.org/wordprocessingml/2006/main" xmlns:w14="http://schemas.microsoft.com/office/word/2010/wordml" xmlns:w15="http://schemas.microsoft.com/office/word/2012/wordml" xmlns:w16cex="http://schemas.microsoft.com/office/word/2018/wordml/cex" xmlns:w16cid="http://schemas.microsoft.com/office/word/2016/wordml/cid" xmlns:w16="http://schemas.microsoft.com/office/word/2018/wordml" xmlns:w16sdtdh="http://schemas.microsoft.com/office/word/2020/wordml/sdtdatahash" xmlns:w16sdtfl="http://schemas.microsoft.com/office/word/2024/wordml/sdtformatlock" xmlns:w16se="http://schemas.microsoft.com/office/word/2015/wordml/symex" xmlns:w16du="http://schemas.microsoft.com/office/word/2023/wordml/word16du" xmlns:wne="http://schemas.microsoft.com/office/word/2006/wordml" mc:Ignorable="w14 w15 w16se w16cid w16 w16cex w16sdtdh w16sdtfl w16du wp14">
   <w:p>
     <w:pPr>
       <w:pStyle w:val="Header"/>
@@ -10094,7 +10078,7 @@
 </file>
 
 <file path=word/numbering.xml><?xml version="1.0" encoding="utf-8"?>
-<w:numbering xmlns:wpc="http://schemas.microsoft.com/office/word/2010/wordprocessingCanvas" xmlns:cx="http://schemas.microsoft.com/office/drawing/2014/chartex" xmlns:cx1="http://schemas.microsoft.com/office/drawing/2015/9/8/chartex" xmlns:cx2="http://schemas.microsoft.com/office/drawing/2015/10/21/chartex" xmlns:cx3="http://schemas.microsoft.com/office/drawing/2016/5/9/chartex" xmlns:cx4="http://schemas.microsoft.com/office/drawing/2016/5/10/chartex" xmlns:cx5="http://schemas.microsoft.com/office/drawing/2016/5/11/chartex" xmlns:cx6="http://schemas.microsoft.com/office/drawing/2016/5/12/chartex" xmlns:cx7="http://schemas.microsoft.com/office/drawing/2016/5/13/chartex" xmlns:cx8="http://schemas.microsoft.com/office/drawing/2016/5/14/chartex" xmlns:mc="http://schemas.openxmlformats.org/markup-compatibility/2006" xmlns:aink="http://schemas.microsoft.com/office/drawing/2016/ink" xmlns:am3d="http://schemas.microsoft.com/office/drawing/2017/model3d" xmlns:o="urn:schemas-microsoft-com:office:office" xmlns:oel="http://schemas.microsoft.com/office/2019/extlst" xmlns:r="http://schemas.openxmlformats.org/officeDocument/2006/relationships" xmlns:m="http://schemas.openxmlformats.org/officeDocument/2006/math" xmlns:v="urn:schemas-microsoft-com:vml" xmlns:wp14="http://schemas.microsoft.com/office/word/2010/wordprocessingDrawing" xmlns:wp="http://schemas.openxmlformats.org/drawingml/2006/wordprocessingDrawing" xmlns:w10="urn:schemas-microsoft-com:office:word" xmlns:w="http://schemas.openxmlformats.org/wordprocessingml/2006/main" xmlns:w14="http://schemas.microsoft.com/office/word/2010/wordml" xmlns:w15="http://schemas.microsoft.com/office/word/2012/wordml" xmlns:w16cex="http://schemas.microsoft.com/office/word/2018/wordml/cex" xmlns:w16cid="http://schemas.microsoft.com/office/word/2016/wordml/cid" xmlns:w16="http://schemas.microsoft.com/office/word/2018/wordml" xmlns:w16du="http://schemas.microsoft.com/office/word/2023/wordml/word16du" xmlns:w16sdtdh="http://schemas.microsoft.com/office/word/2020/wordml/sdtdatahash" xmlns:w16sdtfl="http://schemas.microsoft.com/office/word/2024/wordml/sdtformatlock" xmlns:w16se="http://schemas.microsoft.com/office/word/2015/wordml/symex" xmlns:wpg="http://schemas.microsoft.com/office/word/2010/wordprocessingGroup" xmlns:wpi="http://schemas.microsoft.com/office/word/2010/wordprocessingInk" xmlns:wne="http://schemas.microsoft.com/office/word/2006/wordml" xmlns:wps="http://schemas.microsoft.com/office/word/2010/wordprocessingShape" mc:Ignorable="w14 w15 w16se w16cid w16 w16cex w16sdtdh w16sdtfl w16du wp14">
+<w:numbering xmlns:wpc="http://schemas.microsoft.com/office/word/2010/wordprocessingCanvas" xmlns:cx="http://schemas.microsoft.com/office/drawing/2014/chartex" xmlns:cx1="http://schemas.microsoft.com/office/drawing/2015/9/8/chartex" xmlns:cx2="http://schemas.microsoft.com/office/drawing/2015/10/21/chartex" xmlns:cx3="http://schemas.microsoft.com/office/drawing/2016/5/9/chartex" xmlns:cx4="http://schemas.microsoft.com/office/drawing/2016/5/10/chartex" xmlns:cx5="http://schemas.microsoft.com/office/drawing/2016/5/11/chartex" xmlns:cx6="http://schemas.microsoft.com/office/drawing/2016/5/12/chartex" xmlns:cx7="http://schemas.microsoft.com/office/drawing/2016/5/13/chartex" xmlns:cx8="http://schemas.microsoft.com/office/drawing/2016/5/14/chartex" xmlns:mc="http://schemas.openxmlformats.org/markup-compatibility/2006" xmlns:m="http://schemas.openxmlformats.org/officeDocument/2006/math" xmlns:aink="http://schemas.microsoft.com/office/drawing/2016/ink" xmlns:am3d="http://schemas.microsoft.com/office/drawing/2017/model3d" xmlns:oel="http://schemas.microsoft.com/office/2019/extlst" xmlns:r="http://schemas.openxmlformats.org/officeDocument/2006/relationships" xmlns:wp14="http://schemas.microsoft.com/office/word/2010/wordprocessingDrawing" xmlns:wp="http://schemas.openxmlformats.org/drawingml/2006/wordprocessingDrawing" xmlns:wpg="http://schemas.microsoft.com/office/word/2010/wordprocessingGroup" xmlns:wpi="http://schemas.microsoft.com/office/word/2010/wordprocessingInk" xmlns:wps="http://schemas.microsoft.com/office/word/2010/wordprocessingShape" xmlns:o="urn:schemas-microsoft-com:office:office" xmlns:v="urn:schemas-microsoft-com:vml" xmlns:w10="urn:schemas-microsoft-com:office:word" xmlns:w="http://schemas.openxmlformats.org/wordprocessingml/2006/main" xmlns:w14="http://schemas.microsoft.com/office/word/2010/wordml" xmlns:w15="http://schemas.microsoft.com/office/word/2012/wordml" xmlns:w16cex="http://schemas.microsoft.com/office/word/2018/wordml/cex" xmlns:w16cid="http://schemas.microsoft.com/office/word/2016/wordml/cid" xmlns:w16="http://schemas.microsoft.com/office/word/2018/wordml" xmlns:w16sdtdh="http://schemas.microsoft.com/office/word/2020/wordml/sdtdatahash" xmlns:w16sdtfl="http://schemas.microsoft.com/office/word/2024/wordml/sdtformatlock" xmlns:w16se="http://schemas.microsoft.com/office/word/2015/wordml/symex" xmlns:w16du="http://schemas.microsoft.com/office/word/2023/wordml/word16du" xmlns:wne="http://schemas.microsoft.com/office/word/2006/wordml" mc:Ignorable="w14 w15 w16se w16cid w16 w16cex w16sdtdh w16sdtfl w16du wp14">
   <w:abstractNum w:abstractNumId="0" w15:restartNumberingAfterBreak="0">
     <w:nsid w:val="12BC571E"/>
     <w:multiLevelType w:val="hybridMultilevel"/>
@@ -10829,7 +10813,7 @@
 </file>
 
 <file path=word/styles.xml><?xml version="1.0" encoding="utf-8"?>
-<w:styles xmlns:mc="http://schemas.openxmlformats.org/markup-compatibility/2006" xmlns:r="http://schemas.openxmlformats.org/officeDocument/2006/relationships" xmlns:w="http://schemas.openxmlformats.org/wordprocessingml/2006/main" xmlns:w14="http://schemas.microsoft.com/office/word/2010/wordml" xmlns:w15="http://schemas.microsoft.com/office/word/2012/wordml" xmlns:w16cex="http://schemas.microsoft.com/office/word/2018/wordml/cex" xmlns:w16cid="http://schemas.microsoft.com/office/word/2016/wordml/cid" xmlns:w16="http://schemas.microsoft.com/office/word/2018/wordml" xmlns:w16du="http://schemas.microsoft.com/office/word/2023/wordml/word16du" xmlns:w16sdtdh="http://schemas.microsoft.com/office/word/2020/wordml/sdtdatahash" xmlns:w16sdtfl="http://schemas.microsoft.com/office/word/2024/wordml/sdtformatlock" xmlns:w16se="http://schemas.microsoft.com/office/word/2015/wordml/symex" mc:Ignorable="w14 w15 w16se w16cid w16 w16cex w16sdtdh w16sdtfl w16du">
+<w:styles xmlns:mc="http://schemas.openxmlformats.org/markup-compatibility/2006" xmlns:r="http://schemas.openxmlformats.org/officeDocument/2006/relationships" xmlns:w="http://schemas.openxmlformats.org/wordprocessingml/2006/main" xmlns:w14="http://schemas.microsoft.com/office/word/2010/wordml" xmlns:w15="http://schemas.microsoft.com/office/word/2012/wordml" xmlns:w16cex="http://schemas.microsoft.com/office/word/2018/wordml/cex" xmlns:w16cid="http://schemas.microsoft.com/office/word/2016/wordml/cid" xmlns:w16="http://schemas.microsoft.com/office/word/2018/wordml" xmlns:w16sdtdh="http://schemas.microsoft.com/office/word/2020/wordml/sdtdatahash" xmlns:w16sdtfl="http://schemas.microsoft.com/office/word/2024/wordml/sdtformatlock" xmlns:w16se="http://schemas.microsoft.com/office/word/2015/wordml/symex" xmlns:w16du="http://schemas.microsoft.com/office/word/2023/wordml/word16du" mc:Ignorable="w14 w15 w16se w16cid w16 w16cex w16sdtdh w16sdtfl w16du">
   <w:docDefaults>
     <w:rPrDefault>
       <w:rPr>

</xml_diff>

<commit_message>
Model changed to OpenAI and updated doc generator
</commit_message>
<xml_diff>
--- a/outputs/Kiran_CV.docx
+++ b/outputs/Kiran_CV.docx
@@ -301,7 +301,7 @@
               <w:rPr>
                 <w:color w:val="000000" w:themeColor="text1"/>
               </w:rPr>
-              <w:t xml:space="preserve">Bachelor of Engineering in Electronics &amp; Communication, Kuvempu University - Government, 1999 to 2003</w:t>
+              <w:t xml:space="preserve">Bachelor of Engineering in Electronics &amp; Communication, Kuvempu University - Government, 2003</w:t>
             </w:r>
           </w:p>
           <w:p>
@@ -317,7 +317,7 @@
               <w:rPr>
                 <w:color w:val="000000" w:themeColor="text1"/>
               </w:rPr>
-              <w:t xml:space="preserve">PGD in MBA IBM (International Business Management), 2012 to 2013</w:t>
+              <w:t xml:space="preserve">PGD in MBA IBM (International Business Management), 2013</w:t>
             </w:r>
           </w:p>
           <w:p>
@@ -563,7 +563,7 @@
               <w:rPr>
                 <w:color w:val="000000" w:themeColor="text1"/>
               </w:rPr>
-              <w:t xml:space="preserve">India, Qatar, France, USA, Middle-East, China</w:t>
+              <w:t xml:space="preserve">Pune, Qatar, France, Italy, Portugal, USA, Middle-East, China, India</w:t>
             </w:r>
           </w:p>
         </w:tc>
@@ -649,7 +649,7 @@
               <w:rPr>
                 <w:color w:val="000000" w:themeColor="text1"/>
               </w:rPr>
-              <w:t xml:space="preserve">PMP, 10 Yrs.</w:t>
+              <w:t xml:space="preserve">Lead Auditor IRCA/ISO 9001, 2015</w:t>
             </w:r>
           </w:p>
           <w:p>
@@ -665,7 +665,7 @@
               <w:rPr>
                 <w:color w:val="000000" w:themeColor="text1"/>
               </w:rPr>
-              <w:t xml:space="preserve">Lead Auditor IRCA/ISO 9001, 8 Yrs.</w:t>
+              <w:t xml:space="preserve">PMP, 2013</w:t>
             </w:r>
           </w:p>
           <w:p>
@@ -713,7 +713,7 @@
               <w:rPr>
                 <w:color w:val="000000" w:themeColor="text1"/>
               </w:rPr>
-              <w:t xml:space="preserve">ASQ Membership, American Society for Quality (ID 200144686)</w:t>
+              <w:t xml:space="preserve">ASQ Membership, American Society for Quality</w:t>
             </w:r>
           </w:p>
           <w:p>
@@ -729,7 +729,7 @@
               <w:rPr>
                 <w:color w:val="000000" w:themeColor="text1"/>
               </w:rPr>
-              <w:t xml:space="preserve">IAENG Membership, IAENG (ID 335482)</w:t>
+              <w:t xml:space="preserve">IAENG Membership</w:t>
             </w:r>
           </w:p>
           <w:p>
@@ -745,7 +745,7 @@
               <w:rPr>
                 <w:color w:val="000000" w:themeColor="text1"/>
               </w:rPr>
-              <w:t xml:space="preserve">ASCE Membership, ASCE (ID 11986348)</w:t>
+              <w:t xml:space="preserve">ASCE Membership</w:t>
             </w:r>
           </w:p>
           <w:p>
@@ -825,7 +825,7 @@
           <w:sz w:val="22"/>
           <w:szCs w:val="22"/>
         </w:rPr>
-        <w:t xml:space="preserve">22 Yrs. in Transportation (Metro Rail Systems) &amp; Avionics Systems (Defence), 07+ Yrs. in Metro Rail projects, 13 Yrs. in Avionics projects, 2 Yrs. entrepreneurship and Independent (Freelance) roles, Built and directed Quality teams, International Experience with Cultural Diversities, Large Infra and Significant projects in various customer facing roles, Driven Organisational QHSE initiatives, Total experience of 22 years, Management experience, Technical expertise in Quality Management, Important achievements include Lead over 150 IMS audits, Directed &amp; implemented Corporate/Site QMS and standards, Hands on experience with tools such as 5 Why analysis, Fishbone diagrams, Pareto analysis, PFMEA/FMEA, etc.</w:t>
+        <w:t xml:space="preserve">22 years of experience in Transportation (Metro Rail Systems) and Avionics Systems (Defence). 7+ years in Metro Rail projects, including 5 years in Pune as Senior QAQC Expert for Pune Metro Rail Project. 13 years in Avionics projects. Significant achievements include leading over 150 IMS audits and implementing corporate QMS and standards specified by ISO 9000.</w:t>
       </w:r>
     </w:p>
     <w:p>
@@ -905,7 +905,7 @@
           <w:sz w:val="22"/>
           <w:szCs w:val="22"/>
         </w:rPr>
-        <w:t xml:space="preserve">10`2024 till date | </w:t>
+        <w:t xml:space="preserve">10/2024 till date | </w:t>
       </w:r>
     </w:p>
     <w:p>
@@ -941,40 +941,40 @@
           <w:sz w:val="22"/>
           <w:szCs w:val="22"/>
         </w:rPr>
-        <w:t xml:space="preserve"> | Quality Assurance Specialist (Freelancer - PMC, Supplier, Transport/Avionics Project related activities)</w:t>
-      </w:r>
-    </w:p>
-    <w:p>
-      <w:pPr>
-        <w:suppressAutoHyphens/>
-        <w:jc w:val="both"/>
-        <w:rPr>
-          <w:rFonts w:ascii="Calibri" w:hAnsi="Calibri"/>
-          <w:color w:val="000000" w:themeColor="text1"/>
-          <w:sz w:val="22"/>
-          <w:szCs w:val="22"/>
-        </w:rPr>
-      </w:pPr>
-    </w:p>
-    <w:p>
-      <w:pPr>
-        <w:suppressAutoHyphens/>
-        <w:jc w:val="both"/>
-        <w:rPr>
-          <w:rFonts w:ascii="Calibri" w:hAnsi="Calibri"/>
-          <w:color w:val="000000" w:themeColor="text1"/>
-          <w:sz w:val="22"/>
-          <w:szCs w:val="22"/>
-        </w:rPr>
-      </w:pPr>
-      <w:r>
-        <w:rPr>
-          <w:rFonts w:ascii="Calibri" w:hAnsi="Calibri"/>
-          <w:color w:val="000000" w:themeColor="text1"/>
-          <w:sz w:val="22"/>
-          <w:szCs w:val="22"/>
-        </w:rPr>
-        <w:t xml:space="preserve">Project description/summary: QA: Corporate QMS, Reviews (project, documents, Issues) and Audits (IMS, Supplier Qualification, Issue based). QC: ITP reviews, On Site Inspections (FAT, China), Supplier Procurement Follow-up Actions. </w:t>
+        <w:t xml:space="preserve"> | Quality Assurance Specialist</w:t>
+      </w:r>
+    </w:p>
+    <w:p>
+      <w:pPr>
+        <w:suppressAutoHyphens/>
+        <w:jc w:val="both"/>
+        <w:rPr>
+          <w:rFonts w:ascii="Calibri" w:hAnsi="Calibri"/>
+          <w:color w:val="000000" w:themeColor="text1"/>
+          <w:sz w:val="22"/>
+          <w:szCs w:val="22"/>
+        </w:rPr>
+      </w:pPr>
+    </w:p>
+    <w:p>
+      <w:pPr>
+        <w:suppressAutoHyphens/>
+        <w:jc w:val="both"/>
+        <w:rPr>
+          <w:rFonts w:ascii="Calibri" w:hAnsi="Calibri"/>
+          <w:color w:val="000000" w:themeColor="text1"/>
+          <w:sz w:val="22"/>
+          <w:szCs w:val="22"/>
+        </w:rPr>
+      </w:pPr>
+      <w:r>
+        <w:rPr>
+          <w:rFonts w:ascii="Calibri" w:hAnsi="Calibri"/>
+          <w:color w:val="000000" w:themeColor="text1"/>
+          <w:sz w:val="22"/>
+          <w:szCs w:val="22"/>
+        </w:rPr>
+        <w:t xml:space="preserve">Project description/summary: Quality Assurance Specialist for PMC, Supplier, Transport/Avionics Project related activities. </w:t>
       </w:r>
     </w:p>
     <w:p>
@@ -1109,7 +1109,7 @@
           <w:sz w:val="22"/>
           <w:szCs w:val="22"/>
         </w:rPr>
-        <w:t xml:space="preserve">QA: Corporate QMS, Reviews (project, documents, Issues) and Audits (IMS, Supplier Qualification, Issue based)</w:t>
+        <w:t xml:space="preserve">QA: Corporate QMS, Reviews (project, documents, Issues) and Audits (IMS, Supplier Qualification, Issue based).</w:t>
       </w:r>
     </w:p>
     <w:p>
@@ -1156,7 +1156,7 @@
           <w:sz w:val="22"/>
           <w:szCs w:val="22"/>
         </w:rPr>
-        <w:t xml:space="preserve">QC: ITP reviews, On Site Inspections (FAT, China), Supplier Procurement Follow-up Actions</w:t>
+        <w:t xml:space="preserve">QC: ITP reviews, On Site Inspections (FAT, China), Supplier Procurement Follow-up Actions.</w:t>
       </w:r>
     </w:p>
     <w:p>
@@ -1223,7 +1223,7 @@
           <w:sz w:val="22"/>
           <w:szCs w:val="22"/>
         </w:rPr>
-        <w:t xml:space="preserve">09'2019-09`2024 | Pune Metro Rail Project, Line 1 &amp; Line 2</w:t>
+        <w:t xml:space="preserve">09/2019-09/2024 | Pune Metro Rail</w:t>
       </w:r>
     </w:p>
     <w:p>
@@ -1259,40 +1259,40 @@
           <w:sz w:val="22"/>
           <w:szCs w:val="22"/>
         </w:rPr>
-        <w:t xml:space="preserve"> | PMC – Senior Quality Assurance Expert (SQAE)</w:t>
-      </w:r>
-    </w:p>
-    <w:p>
-      <w:pPr>
-        <w:suppressAutoHyphens/>
-        <w:jc w:val="both"/>
-        <w:rPr>
-          <w:rFonts w:ascii="Calibri" w:hAnsi="Calibri"/>
-          <w:color w:val="000000" w:themeColor="text1"/>
-          <w:sz w:val="22"/>
-          <w:szCs w:val="22"/>
-        </w:rPr>
-      </w:pPr>
-    </w:p>
-    <w:p>
-      <w:pPr>
-        <w:suppressAutoHyphens/>
-        <w:jc w:val="both"/>
-        <w:rPr>
-          <w:rFonts w:ascii="Calibri" w:hAnsi="Calibri"/>
-          <w:color w:val="000000" w:themeColor="text1"/>
-          <w:sz w:val="22"/>
-          <w:szCs w:val="22"/>
-        </w:rPr>
-      </w:pPr>
-      <w:r>
-        <w:rPr>
-          <w:rFonts w:ascii="Calibri" w:hAnsi="Calibri"/>
-          <w:color w:val="000000" w:themeColor="text1"/>
-          <w:sz w:val="22"/>
-          <w:szCs w:val="22"/>
-        </w:rPr>
-        <w:t xml:space="preserve">Project description/summary: QA Surveillance role, handling 14+ Contractors in PMC/GC role to Maha-Metro Rail Corporation </w:t>
+        <w:t xml:space="preserve"> | Senior Quality Assurance Expert (SQAE)</w:t>
+      </w:r>
+    </w:p>
+    <w:p>
+      <w:pPr>
+        <w:suppressAutoHyphens/>
+        <w:jc w:val="both"/>
+        <w:rPr>
+          <w:rFonts w:ascii="Calibri" w:hAnsi="Calibri"/>
+          <w:color w:val="000000" w:themeColor="text1"/>
+          <w:sz w:val="22"/>
+          <w:szCs w:val="22"/>
+        </w:rPr>
+      </w:pPr>
+    </w:p>
+    <w:p>
+      <w:pPr>
+        <w:suppressAutoHyphens/>
+        <w:jc w:val="both"/>
+        <w:rPr>
+          <w:rFonts w:ascii="Calibri" w:hAnsi="Calibri"/>
+          <w:color w:val="000000" w:themeColor="text1"/>
+          <w:sz w:val="22"/>
+          <w:szCs w:val="22"/>
+        </w:rPr>
+      </w:pPr>
+      <w:r>
+        <w:rPr>
+          <w:rFonts w:ascii="Calibri" w:hAnsi="Calibri"/>
+          <w:color w:val="000000" w:themeColor="text1"/>
+          <w:sz w:val="22"/>
+          <w:szCs w:val="22"/>
+        </w:rPr>
+        <w:t xml:space="preserve">Project description/summary: QA Surveillance role, handling 14+ Contractors in PMC/GC role to Maha-Metro Rail Corporation. </w:t>
       </w:r>
     </w:p>
     <w:p>
@@ -1427,7 +1427,7 @@
           <w:sz w:val="22"/>
           <w:szCs w:val="22"/>
         </w:rPr>
-        <w:t xml:space="preserve">QA Surveillance role, handling 14+ Contractors in PMC/GC role to Maha-Metro Rail Corporation</w:t>
+        <w:t xml:space="preserve">Customer facing role with 14+ Contractor Quality teams to manage (Initialise, Monitoring &amp; Control).</w:t>
       </w:r>
     </w:p>
     <w:p>
@@ -1474,7 +1474,7 @@
           <w:sz w:val="22"/>
           <w:szCs w:val="22"/>
         </w:rPr>
-        <w:t xml:space="preserve">Customer facing role with 14+ Contractor Quality teams to manage (Initialise, Monitoring &amp; Control)</w:t>
+        <w:t xml:space="preserve">Established, Tailored &amp; Maintain internal QMS(Manual); Approved Contractors' QMS, Mentor/Trained teams.</w:t>
       </w:r>
     </w:p>
     <w:p>
@@ -1521,7 +1521,7 @@
           <w:sz w:val="22"/>
           <w:szCs w:val="22"/>
         </w:rPr>
-        <w:t xml:space="preserve">Systems: Telecom/Power Supply/Traction/Telecom/MEP/L&amp;E/TVS-ECS/PSD/Signalling/Rolling Stock/AFC/S&amp;S etc.</w:t>
+        <w:t xml:space="preserve">Approved QA/QC plans(+MS/ITP/Checklists), QA/QC resources based on expertise review.</w:t>
       </w:r>
     </w:p>
     <w:p>
@@ -1568,7 +1568,7 @@
           <w:sz w:val="22"/>
           <w:szCs w:val="22"/>
         </w:rPr>
-        <w:t xml:space="preserve">QMS: Established, Tailored &amp; Maintain internal QMS(Manual); Approved Contractors` QMS, Mentor/Trained teams.</w:t>
+        <w:t xml:space="preserve">Witnessed critical RFIs/FAT events of Material/Installation/Testing activities.</w:t>
       </w:r>
     </w:p>
     <w:p>
@@ -1615,7 +1615,7 @@
           <w:sz w:val="22"/>
           <w:szCs w:val="22"/>
         </w:rPr>
-        <w:t xml:space="preserve">Approved QA/QC plans(+MS/ITP/Checklists), QA/QC resources based on expertise review</w:t>
+        <w:t xml:space="preserve">Implemented Site QA/QC plans through regular Audits/Site Visits/Reviews/RCAs &amp; related records (KPIs/OBS/NCRs/Snag list).</w:t>
       </w:r>
     </w:p>
     <w:p>
@@ -1662,7 +1662,7 @@
           <w:sz w:val="22"/>
           <w:szCs w:val="22"/>
         </w:rPr>
-        <w:t xml:space="preserve">Witnessed critical RFIs/FAT events of Material/Installation/Testing activities.</w:t>
+        <w:t xml:space="preserve">Conducted Management reviews and Customer Site Visits, CMRS (System Safety) Visits and followed-up actions to closure.</w:t>
       </w:r>
     </w:p>
     <w:p>
@@ -1709,231 +1709,7 @@
           <w:sz w:val="22"/>
           <w:szCs w:val="22"/>
         </w:rPr>
-        <w:t xml:space="preserve">Implemented Site QA/QC plans through regular Audits/Site Visits/Reviews/RCAs &amp; related records (KPIs/OBS/NCRs/Snag list)</w:t>
-      </w:r>
-    </w:p>
-    <w:p>
-      <w:pPr>
-        <w:suppressAutoHyphens/>
-        <w:jc w:val="both"/>
-        <w:rPr>
-          <w:rFonts w:ascii="Calibri" w:hAnsi="Calibri"/>
-          <w:color w:val="000000" w:themeColor="text1"/>
-          <w:sz w:val="22"/>
-          <w:szCs w:val="22"/>
-        </w:rPr>
-      </w:pPr>
-      <w:r>
-        <w:rPr>
-          <w:rFonts w:ascii="Calibri" w:hAnsi="Calibri"/>
-          <w:color w:val="000000" w:themeColor="text1"/>
-          <w:sz w:val="22"/>
-          <w:szCs w:val="22"/>
-        </w:rPr>
-        <w:t xml:space="preserve"/>
-      </w:r>
-    </w:p>
-    <w:p>
-      <w:pPr>
-        <w:suppressAutoHyphens/>
-        <w:jc w:val="both"/>
-        <w:rPr>
-          <w:rFonts w:ascii="Calibri" w:hAnsi="Calibri"/>
-          <w:color w:val="000000" w:themeColor="text1"/>
-          <w:sz w:val="22"/>
-          <w:szCs w:val="22"/>
-        </w:rPr>
-      </w:pPr>
-      <w:r>
-        <w:rPr>
-          <w:rFonts w:ascii="Calibri" w:hAnsi="Calibri"/>
-          <w:color w:val="000000" w:themeColor="text1"/>
-          <w:sz w:val="22"/>
-          <w:szCs w:val="22"/>
-        </w:rPr>
-        <w:t xml:space="preserve"/>
-      </w:r>
-    </w:p>
-    <w:p>
-      <w:pPr>
-        <w:suppressAutoHyphens/>
-        <w:jc w:val="both"/>
-        <w:rPr>
-          <w:rFonts w:ascii="Calibri" w:hAnsi="Calibri"/>
-          <w:b/>
-          <w:bCs/>
-          <w:color w:val="000000" w:themeColor="text1"/>
-          <w:sz w:val="22"/>
-          <w:szCs w:val="22"/>
-        </w:rPr>
-      </w:pPr>
-      <w:r>
-        <w:rPr>
-          <w:rFonts w:ascii="Calibri" w:hAnsi="Calibri"/>
-          <w:b/>
-          <w:bCs/>
-          <w:color w:val="000000" w:themeColor="text1"/>
-          <w:sz w:val="22"/>
-          <w:szCs w:val="22"/>
-        </w:rPr>
-        <w:t xml:space="preserve">03'2018-08'2019 | </w:t>
-      </w:r>
-    </w:p>
-    <w:p>
-      <w:pPr>
-        <w:suppressAutoHyphens/>
-        <w:jc w:val="both"/>
-        <w:rPr>
-          <w:rFonts w:ascii="Calibri" w:hAnsi="Calibri"/>
-          <w:b/>
-          <w:bCs/>
-          <w:color w:val="000000" w:themeColor="text1"/>
-          <w:sz w:val="22"/>
-          <w:szCs w:val="22"/>
-        </w:rPr>
-      </w:pPr>
-      <w:r>
-        <w:rPr>
-          <w:rFonts w:ascii="Calibri" w:hAnsi="Calibri"/>
-          <w:b/>
-          <w:bCs/>
-          <w:color w:val="000000" w:themeColor="text1"/>
-          <w:sz w:val="22"/>
-          <w:szCs w:val="22"/>
-        </w:rPr>
-        <w:t xml:space="preserve">India</w:t>
-      </w:r>
-      <w:r>
-        <w:rPr>
-          <w:rFonts w:ascii="Calibri" w:hAnsi="Calibri"/>
-          <w:b/>
-          <w:bCs/>
-          <w:color w:val="000000" w:themeColor="text1"/>
-          <w:sz w:val="22"/>
-          <w:szCs w:val="22"/>
-        </w:rPr>
-        <w:t xml:space="preserve"> | Founder Quality Director</w:t>
-      </w:r>
-    </w:p>
-    <w:p>
-      <w:pPr>
-        <w:suppressAutoHyphens/>
-        <w:jc w:val="both"/>
-        <w:rPr>
-          <w:rFonts w:ascii="Calibri" w:hAnsi="Calibri"/>
-          <w:color w:val="000000" w:themeColor="text1"/>
-          <w:sz w:val="22"/>
-          <w:szCs w:val="22"/>
-        </w:rPr>
-      </w:pPr>
-    </w:p>
-    <w:p>
-      <w:pPr>
-        <w:suppressAutoHyphens/>
-        <w:jc w:val="both"/>
-        <w:rPr>
-          <w:rFonts w:ascii="Calibri" w:hAnsi="Calibri"/>
-          <w:color w:val="000000" w:themeColor="text1"/>
-          <w:sz w:val="22"/>
-          <w:szCs w:val="22"/>
-        </w:rPr>
-      </w:pPr>
-      <w:r>
-        <w:rPr>
-          <w:rFonts w:ascii="Calibri" w:hAnsi="Calibri"/>
-          <w:color w:val="000000" w:themeColor="text1"/>
-          <w:sz w:val="22"/>
-          <w:szCs w:val="22"/>
-        </w:rPr>
-        <w:t xml:space="preserve">Project description/summary: Organisational Quality and Customer Excellence role, reporting to the Managing Director </w:t>
-      </w:r>
-    </w:p>
-    <w:p>
-      <w:pPr>
-        <w:suppressAutoHyphens/>
-        <w:jc w:val="both"/>
-        <w:rPr>
-          <w:rFonts w:ascii="Calibri" w:hAnsi="Calibri"/>
-          <w:color w:val="000000" w:themeColor="text1"/>
-          <w:sz w:val="22"/>
-          <w:szCs w:val="22"/>
-        </w:rPr>
-      </w:pPr>
-      <w:r>
-        <w:rPr>
-          <w:rFonts w:ascii="Calibri" w:hAnsi="Calibri"/>
-          <w:color w:val="000000" w:themeColor="text1"/>
-          <w:sz w:val="22"/>
-          <w:szCs w:val="22"/>
-        </w:rPr>
-        <w:t xml:space="preserve">Company’s role in the Project: </w:t>
-      </w:r>
-    </w:p>
-    <w:p>
-      <w:pPr>
-        <w:suppressAutoHyphens/>
-        <w:jc w:val="both"/>
-        <w:rPr>
-          <w:rFonts w:ascii="Calibri" w:hAnsi="Calibri"/>
-          <w:color w:val="000000" w:themeColor="text1"/>
-          <w:sz w:val="22"/>
-          <w:szCs w:val="22"/>
-        </w:rPr>
-      </w:pPr>
-      <w:r>
-        <w:rPr>
-          <w:rFonts w:ascii="Calibri" w:hAnsi="Calibri"/>
-          <w:color w:val="000000" w:themeColor="text1"/>
-          <w:sz w:val="22"/>
-          <w:szCs w:val="22"/>
-        </w:rPr>
-        <w:t xml:space="preserve">Value: </w:t>
-      </w:r>
-      <w:r>
-        <w:rPr>
-          <w:rFonts w:ascii="Calibri" w:hAnsi="Calibri"/>
-          <w:color w:val="000000" w:themeColor="text1"/>
-          <w:sz w:val="22"/>
-          <w:szCs w:val="22"/>
-        </w:rPr>
-        <w:t xml:space="preserve"/>
-      </w:r>
-    </w:p>
-    <w:p>
-      <w:pPr>
-        <w:suppressAutoHyphens/>
-        <w:jc w:val="both"/>
-        <w:rPr>
-          <w:rFonts w:ascii="Calibri" w:hAnsi="Calibri"/>
-          <w:color w:val="000000" w:themeColor="text1"/>
-          <w:sz w:val="22"/>
-          <w:szCs w:val="22"/>
-        </w:rPr>
-      </w:pPr>
-    </w:p>
-    <w:p>
-      <w:pPr>
-        <w:suppressAutoHyphens/>
-        <w:jc w:val="both"/>
-        <w:rPr>
-          <w:rFonts w:ascii="Calibri" w:hAnsi="Calibri"/>
-          <w:b/>
-          <w:bCs/>
-          <w:color w:val="000000" w:themeColor="text1"/>
-          <w:sz w:val="22"/>
-          <w:szCs w:val="22"/>
-        </w:rPr>
-      </w:pPr>
-      <w:r>
-        <w:rPr>
-          <w:rFonts w:ascii="Calibri" w:hAnsi="Calibri"/>
-          <w:b/>
-          <w:bCs/>
-          <w:color w:val="000000" w:themeColor="text1"/>
-          <w:sz w:val="22"/>
-          <w:szCs w:val="22"/>
-        </w:rPr>
-        <w:t>Responsibilities/Tasks:</w:t>
+        <w:t xml:space="preserve">Reviewed status of Contractors and Customer (QRM ppt); Monitored KPIs, Ensured Lessons learnt were managed.</w:t>
       </w:r>
     </w:p>
     <w:p>
@@ -1980,7 +1756,231 @@
           <w:sz w:val="22"/>
           <w:szCs w:val="22"/>
         </w:rPr>
-        <w:t xml:space="preserve">SPOC for QA/QC activities from Concept-Implementation of IoT products</w:t>
+        <w:t xml:space="preserve">Supervised Lab activities (Contract issues, Tracking testing performance, Invoices etc).</w:t>
+      </w:r>
+    </w:p>
+    <w:p>
+      <w:pPr>
+        <w:suppressAutoHyphens/>
+        <w:jc w:val="both"/>
+        <w:rPr>
+          <w:rFonts w:ascii="Calibri" w:hAnsi="Calibri"/>
+          <w:color w:val="000000" w:themeColor="text1"/>
+          <w:sz w:val="22"/>
+          <w:szCs w:val="22"/>
+        </w:rPr>
+      </w:pPr>
+      <w:r>
+        <w:rPr>
+          <w:rFonts w:ascii="Calibri" w:hAnsi="Calibri"/>
+          <w:color w:val="000000" w:themeColor="text1"/>
+          <w:sz w:val="22"/>
+          <w:szCs w:val="22"/>
+        </w:rPr>
+        <w:t xml:space="preserve"/>
+      </w:r>
+    </w:p>
+    <w:p>
+      <w:pPr>
+        <w:suppressAutoHyphens/>
+        <w:jc w:val="both"/>
+        <w:rPr>
+          <w:rFonts w:ascii="Calibri" w:hAnsi="Calibri"/>
+          <w:color w:val="000000" w:themeColor="text1"/>
+          <w:sz w:val="22"/>
+          <w:szCs w:val="22"/>
+        </w:rPr>
+      </w:pPr>
+      <w:r>
+        <w:rPr>
+          <w:rFonts w:ascii="Calibri" w:hAnsi="Calibri"/>
+          <w:color w:val="000000" w:themeColor="text1"/>
+          <w:sz w:val="22"/>
+          <w:szCs w:val="22"/>
+        </w:rPr>
+        <w:t xml:space="preserve"/>
+      </w:r>
+    </w:p>
+    <w:p>
+      <w:pPr>
+        <w:suppressAutoHyphens/>
+        <w:jc w:val="both"/>
+        <w:rPr>
+          <w:rFonts w:ascii="Calibri" w:hAnsi="Calibri"/>
+          <w:b/>
+          <w:bCs/>
+          <w:color w:val="000000" w:themeColor="text1"/>
+          <w:sz w:val="22"/>
+          <w:szCs w:val="22"/>
+        </w:rPr>
+      </w:pPr>
+      <w:r>
+        <w:rPr>
+          <w:rFonts w:ascii="Calibri" w:hAnsi="Calibri"/>
+          <w:b/>
+          <w:bCs/>
+          <w:color w:val="000000" w:themeColor="text1"/>
+          <w:sz w:val="22"/>
+          <w:szCs w:val="22"/>
+        </w:rPr>
+        <w:t xml:space="preserve">03/2018-08/2019 | </w:t>
+      </w:r>
+    </w:p>
+    <w:p>
+      <w:pPr>
+        <w:suppressAutoHyphens/>
+        <w:jc w:val="both"/>
+        <w:rPr>
+          <w:rFonts w:ascii="Calibri" w:hAnsi="Calibri"/>
+          <w:b/>
+          <w:bCs/>
+          <w:color w:val="000000" w:themeColor="text1"/>
+          <w:sz w:val="22"/>
+          <w:szCs w:val="22"/>
+        </w:rPr>
+      </w:pPr>
+      <w:r>
+        <w:rPr>
+          <w:rFonts w:ascii="Calibri" w:hAnsi="Calibri"/>
+          <w:b/>
+          <w:bCs/>
+          <w:color w:val="000000" w:themeColor="text1"/>
+          <w:sz w:val="22"/>
+          <w:szCs w:val="22"/>
+        </w:rPr>
+        <w:t xml:space="preserve"/>
+      </w:r>
+      <w:r>
+        <w:rPr>
+          <w:rFonts w:ascii="Calibri" w:hAnsi="Calibri"/>
+          <w:b/>
+          <w:bCs/>
+          <w:color w:val="000000" w:themeColor="text1"/>
+          <w:sz w:val="22"/>
+          <w:szCs w:val="22"/>
+        </w:rPr>
+        <w:t xml:space="preserve"> | Founder Quality Director</w:t>
+      </w:r>
+    </w:p>
+    <w:p>
+      <w:pPr>
+        <w:suppressAutoHyphens/>
+        <w:jc w:val="both"/>
+        <w:rPr>
+          <w:rFonts w:ascii="Calibri" w:hAnsi="Calibri"/>
+          <w:color w:val="000000" w:themeColor="text1"/>
+          <w:sz w:val="22"/>
+          <w:szCs w:val="22"/>
+        </w:rPr>
+      </w:pPr>
+    </w:p>
+    <w:p>
+      <w:pPr>
+        <w:suppressAutoHyphens/>
+        <w:jc w:val="both"/>
+        <w:rPr>
+          <w:rFonts w:ascii="Calibri" w:hAnsi="Calibri"/>
+          <w:color w:val="000000" w:themeColor="text1"/>
+          <w:sz w:val="22"/>
+          <w:szCs w:val="22"/>
+        </w:rPr>
+      </w:pPr>
+      <w:r>
+        <w:rPr>
+          <w:rFonts w:ascii="Calibri" w:hAnsi="Calibri"/>
+          <w:color w:val="000000" w:themeColor="text1"/>
+          <w:sz w:val="22"/>
+          <w:szCs w:val="22"/>
+        </w:rPr>
+        <w:t xml:space="preserve">Project description/summary: Organisational Quality and Customer Excellence role, reporting to the Managing Director. </w:t>
+      </w:r>
+    </w:p>
+    <w:p>
+      <w:pPr>
+        <w:suppressAutoHyphens/>
+        <w:jc w:val="both"/>
+        <w:rPr>
+          <w:rFonts w:ascii="Calibri" w:hAnsi="Calibri"/>
+          <w:color w:val="000000" w:themeColor="text1"/>
+          <w:sz w:val="22"/>
+          <w:szCs w:val="22"/>
+        </w:rPr>
+      </w:pPr>
+      <w:r>
+        <w:rPr>
+          <w:rFonts w:ascii="Calibri" w:hAnsi="Calibri"/>
+          <w:color w:val="000000" w:themeColor="text1"/>
+          <w:sz w:val="22"/>
+          <w:szCs w:val="22"/>
+        </w:rPr>
+        <w:t xml:space="preserve">Company’s role in the Project: </w:t>
+      </w:r>
+    </w:p>
+    <w:p>
+      <w:pPr>
+        <w:suppressAutoHyphens/>
+        <w:jc w:val="both"/>
+        <w:rPr>
+          <w:rFonts w:ascii="Calibri" w:hAnsi="Calibri"/>
+          <w:color w:val="000000" w:themeColor="text1"/>
+          <w:sz w:val="22"/>
+          <w:szCs w:val="22"/>
+        </w:rPr>
+      </w:pPr>
+      <w:r>
+        <w:rPr>
+          <w:rFonts w:ascii="Calibri" w:hAnsi="Calibri"/>
+          <w:color w:val="000000" w:themeColor="text1"/>
+          <w:sz w:val="22"/>
+          <w:szCs w:val="22"/>
+        </w:rPr>
+        <w:t xml:space="preserve">Value: </w:t>
+      </w:r>
+      <w:r>
+        <w:rPr>
+          <w:rFonts w:ascii="Calibri" w:hAnsi="Calibri"/>
+          <w:color w:val="000000" w:themeColor="text1"/>
+          <w:sz w:val="22"/>
+          <w:szCs w:val="22"/>
+        </w:rPr>
+        <w:t xml:space="preserve"/>
+      </w:r>
+    </w:p>
+    <w:p>
+      <w:pPr>
+        <w:suppressAutoHyphens/>
+        <w:jc w:val="both"/>
+        <w:rPr>
+          <w:rFonts w:ascii="Calibri" w:hAnsi="Calibri"/>
+          <w:color w:val="000000" w:themeColor="text1"/>
+          <w:sz w:val="22"/>
+          <w:szCs w:val="22"/>
+        </w:rPr>
+      </w:pPr>
+    </w:p>
+    <w:p>
+      <w:pPr>
+        <w:suppressAutoHyphens/>
+        <w:jc w:val="both"/>
+        <w:rPr>
+          <w:rFonts w:ascii="Calibri" w:hAnsi="Calibri"/>
+          <w:b/>
+          <w:bCs/>
+          <w:color w:val="000000" w:themeColor="text1"/>
+          <w:sz w:val="22"/>
+          <w:szCs w:val="22"/>
+        </w:rPr>
+      </w:pPr>
+      <w:r>
+        <w:rPr>
+          <w:rFonts w:ascii="Calibri" w:hAnsi="Calibri"/>
+          <w:b/>
+          <w:bCs/>
+          <w:color w:val="000000" w:themeColor="text1"/>
+          <w:sz w:val="22"/>
+          <w:szCs w:val="22"/>
+        </w:rPr>
+        <w:t>Responsibilities/Tasks:</w:t>
       </w:r>
     </w:p>
     <w:p>
@@ -2027,7 +2027,7 @@
           <w:sz w:val="22"/>
           <w:szCs w:val="22"/>
         </w:rPr>
-        <w:t xml:space="preserve">Established and maintained the QMS implementing the “Culture of Quality” with focus on COPQ.</w:t>
+        <w:t xml:space="preserve">SPOC for QA/QC activities from Concept-Implementation of IoT products.</w:t>
       </w:r>
     </w:p>
     <w:p>
@@ -2074,231 +2074,7 @@
           <w:sz w:val="22"/>
           <w:szCs w:val="22"/>
         </w:rPr>
-        <w:t xml:space="preserve">Supplier Management (Qualification, Audits and performance monitoring)</w:t>
-      </w:r>
-    </w:p>
-    <w:p>
-      <w:pPr>
-        <w:suppressAutoHyphens/>
-        <w:jc w:val="both"/>
-        <w:rPr>
-          <w:rFonts w:ascii="Calibri" w:hAnsi="Calibri"/>
-          <w:color w:val="000000" w:themeColor="text1"/>
-          <w:sz w:val="22"/>
-          <w:szCs w:val="22"/>
-        </w:rPr>
-      </w:pPr>
-      <w:r>
-        <w:rPr>
-          <w:rFonts w:ascii="Calibri" w:hAnsi="Calibri"/>
-          <w:color w:val="000000" w:themeColor="text1"/>
-          <w:sz w:val="22"/>
-          <w:szCs w:val="22"/>
-        </w:rPr>
-        <w:t xml:space="preserve"/>
-      </w:r>
-    </w:p>
-    <w:p>
-      <w:pPr>
-        <w:suppressAutoHyphens/>
-        <w:jc w:val="both"/>
-        <w:rPr>
-          <w:rFonts w:ascii="Calibri" w:hAnsi="Calibri"/>
-          <w:color w:val="000000" w:themeColor="text1"/>
-          <w:sz w:val="22"/>
-          <w:szCs w:val="22"/>
-        </w:rPr>
-      </w:pPr>
-      <w:r>
-        <w:rPr>
-          <w:rFonts w:ascii="Calibri" w:hAnsi="Calibri"/>
-          <w:color w:val="000000" w:themeColor="text1"/>
-          <w:sz w:val="22"/>
-          <w:szCs w:val="22"/>
-        </w:rPr>
-        <w:t xml:space="preserve"/>
-      </w:r>
-    </w:p>
-    <w:p>
-      <w:pPr>
-        <w:suppressAutoHyphens/>
-        <w:jc w:val="both"/>
-        <w:rPr>
-          <w:rFonts w:ascii="Calibri" w:hAnsi="Calibri"/>
-          <w:b/>
-          <w:bCs/>
-          <w:color w:val="000000" w:themeColor="text1"/>
-          <w:sz w:val="22"/>
-          <w:szCs w:val="22"/>
-        </w:rPr>
-      </w:pPr>
-      <w:r>
-        <w:rPr>
-          <w:rFonts w:ascii="Calibri" w:hAnsi="Calibri"/>
-          <w:b/>
-          <w:bCs/>
-          <w:color w:val="000000" w:themeColor="text1"/>
-          <w:sz w:val="22"/>
-          <w:szCs w:val="22"/>
-        </w:rPr>
-        <w:t xml:space="preserve">01'2016-02'2018 | Lusail Light Rail project</w:t>
-      </w:r>
-    </w:p>
-    <w:p>
-      <w:pPr>
-        <w:suppressAutoHyphens/>
-        <w:jc w:val="both"/>
-        <w:rPr>
-          <w:rFonts w:ascii="Calibri" w:hAnsi="Calibri"/>
-          <w:b/>
-          <w:bCs/>
-          <w:color w:val="000000" w:themeColor="text1"/>
-          <w:sz w:val="22"/>
-          <w:szCs w:val="22"/>
-        </w:rPr>
-      </w:pPr>
-      <w:r>
-        <w:rPr>
-          <w:rFonts w:ascii="Calibri" w:hAnsi="Calibri"/>
-          <w:b/>
-          <w:bCs/>
-          <w:color w:val="000000" w:themeColor="text1"/>
-          <w:sz w:val="22"/>
-          <w:szCs w:val="22"/>
-        </w:rPr>
-        <w:t xml:space="preserve">Qatar</w:t>
-      </w:r>
-      <w:r>
-        <w:rPr>
-          <w:rFonts w:ascii="Calibri" w:hAnsi="Calibri"/>
-          <w:b/>
-          <w:bCs/>
-          <w:color w:val="000000" w:themeColor="text1"/>
-          <w:sz w:val="22"/>
-          <w:szCs w:val="22"/>
-        </w:rPr>
-        <w:t xml:space="preserve"> | Global Quality Assurance Manager (Offshore-Onshore)</w:t>
-      </w:r>
-    </w:p>
-    <w:p>
-      <w:pPr>
-        <w:suppressAutoHyphens/>
-        <w:jc w:val="both"/>
-        <w:rPr>
-          <w:rFonts w:ascii="Calibri" w:hAnsi="Calibri"/>
-          <w:color w:val="000000" w:themeColor="text1"/>
-          <w:sz w:val="22"/>
-          <w:szCs w:val="22"/>
-        </w:rPr>
-      </w:pPr>
-    </w:p>
-    <w:p>
-      <w:pPr>
-        <w:suppressAutoHyphens/>
-        <w:jc w:val="both"/>
-        <w:rPr>
-          <w:rFonts w:ascii="Calibri" w:hAnsi="Calibri"/>
-          <w:color w:val="000000" w:themeColor="text1"/>
-          <w:sz w:val="22"/>
-          <w:szCs w:val="22"/>
-        </w:rPr>
-      </w:pPr>
-      <w:r>
-        <w:rPr>
-          <w:rFonts w:ascii="Calibri" w:hAnsi="Calibri"/>
-          <w:color w:val="000000" w:themeColor="text1"/>
-          <w:sz w:val="22"/>
-          <w:szCs w:val="22"/>
-        </w:rPr>
-        <w:t xml:space="preserve">Project description/summary: Onshore &amp; Offshore QA Surveillance role, responsible for Engineering and Site Quality </w:t>
-      </w:r>
-    </w:p>
-    <w:p>
-      <w:pPr>
-        <w:suppressAutoHyphens/>
-        <w:jc w:val="both"/>
-        <w:rPr>
-          <w:rFonts w:ascii="Calibri" w:hAnsi="Calibri"/>
-          <w:color w:val="000000" w:themeColor="text1"/>
-          <w:sz w:val="22"/>
-          <w:szCs w:val="22"/>
-        </w:rPr>
-      </w:pPr>
-      <w:r>
-        <w:rPr>
-          <w:rFonts w:ascii="Calibri" w:hAnsi="Calibri"/>
-          <w:color w:val="000000" w:themeColor="text1"/>
-          <w:sz w:val="22"/>
-          <w:szCs w:val="22"/>
-        </w:rPr>
-        <w:t xml:space="preserve">Company’s role in the Project: </w:t>
-      </w:r>
-    </w:p>
-    <w:p>
-      <w:pPr>
-        <w:suppressAutoHyphens/>
-        <w:jc w:val="both"/>
-        <w:rPr>
-          <w:rFonts w:ascii="Calibri" w:hAnsi="Calibri"/>
-          <w:color w:val="000000" w:themeColor="text1"/>
-          <w:sz w:val="22"/>
-          <w:szCs w:val="22"/>
-        </w:rPr>
-      </w:pPr>
-      <w:r>
-        <w:rPr>
-          <w:rFonts w:ascii="Calibri" w:hAnsi="Calibri"/>
-          <w:color w:val="000000" w:themeColor="text1"/>
-          <w:sz w:val="22"/>
-          <w:szCs w:val="22"/>
-        </w:rPr>
-        <w:t xml:space="preserve">Value: </w:t>
-      </w:r>
-      <w:r>
-        <w:rPr>
-          <w:rFonts w:ascii="Calibri" w:hAnsi="Calibri"/>
-          <w:color w:val="000000" w:themeColor="text1"/>
-          <w:sz w:val="22"/>
-          <w:szCs w:val="22"/>
-        </w:rPr>
-        <w:t xml:space="preserve"/>
-      </w:r>
-    </w:p>
-    <w:p>
-      <w:pPr>
-        <w:suppressAutoHyphens/>
-        <w:jc w:val="both"/>
-        <w:rPr>
-          <w:rFonts w:ascii="Calibri" w:hAnsi="Calibri"/>
-          <w:color w:val="000000" w:themeColor="text1"/>
-          <w:sz w:val="22"/>
-          <w:szCs w:val="22"/>
-        </w:rPr>
-      </w:pPr>
-    </w:p>
-    <w:p>
-      <w:pPr>
-        <w:suppressAutoHyphens/>
-        <w:jc w:val="both"/>
-        <w:rPr>
-          <w:rFonts w:ascii="Calibri" w:hAnsi="Calibri"/>
-          <w:b/>
-          <w:bCs/>
-          <w:color w:val="000000" w:themeColor="text1"/>
-          <w:sz w:val="22"/>
-          <w:szCs w:val="22"/>
-        </w:rPr>
-      </w:pPr>
-      <w:r>
-        <w:rPr>
-          <w:rFonts w:ascii="Calibri" w:hAnsi="Calibri"/>
-          <w:b/>
-          <w:bCs/>
-          <w:color w:val="000000" w:themeColor="text1"/>
-          <w:sz w:val="22"/>
-          <w:szCs w:val="22"/>
-        </w:rPr>
-        <w:t>Responsibilities/Tasks:</w:t>
+        <w:t xml:space="preserve">Established and maintained the QMS implementing the 'Culture of Quality' with focus on COPQ.</w:t>
       </w:r>
     </w:p>
     <w:p>
@@ -2345,7 +2121,231 @@
           <w:sz w:val="22"/>
           <w:szCs w:val="22"/>
         </w:rPr>
-        <w:t xml:space="preserve">QMS: Tailor &amp; Implement Corporate (Chorus)/Customer processes and train the Thales teams and sub-contractors.</w:t>
+        <w:t xml:space="preserve">Supplier Management (Qualification, Audits and performance monitoring).</w:t>
+      </w:r>
+    </w:p>
+    <w:p>
+      <w:pPr>
+        <w:suppressAutoHyphens/>
+        <w:jc w:val="both"/>
+        <w:rPr>
+          <w:rFonts w:ascii="Calibri" w:hAnsi="Calibri"/>
+          <w:color w:val="000000" w:themeColor="text1"/>
+          <w:sz w:val="22"/>
+          <w:szCs w:val="22"/>
+        </w:rPr>
+      </w:pPr>
+      <w:r>
+        <w:rPr>
+          <w:rFonts w:ascii="Calibri" w:hAnsi="Calibri"/>
+          <w:color w:val="000000" w:themeColor="text1"/>
+          <w:sz w:val="22"/>
+          <w:szCs w:val="22"/>
+        </w:rPr>
+        <w:t xml:space="preserve"/>
+      </w:r>
+    </w:p>
+    <w:p>
+      <w:pPr>
+        <w:suppressAutoHyphens/>
+        <w:jc w:val="both"/>
+        <w:rPr>
+          <w:rFonts w:ascii="Calibri" w:hAnsi="Calibri"/>
+          <w:color w:val="000000" w:themeColor="text1"/>
+          <w:sz w:val="22"/>
+          <w:szCs w:val="22"/>
+        </w:rPr>
+      </w:pPr>
+      <w:r>
+        <w:rPr>
+          <w:rFonts w:ascii="Calibri" w:hAnsi="Calibri"/>
+          <w:color w:val="000000" w:themeColor="text1"/>
+          <w:sz w:val="22"/>
+          <w:szCs w:val="22"/>
+        </w:rPr>
+        <w:t xml:space="preserve"/>
+      </w:r>
+    </w:p>
+    <w:p>
+      <w:pPr>
+        <w:suppressAutoHyphens/>
+        <w:jc w:val="both"/>
+        <w:rPr>
+          <w:rFonts w:ascii="Calibri" w:hAnsi="Calibri"/>
+          <w:b/>
+          <w:bCs/>
+          <w:color w:val="000000" w:themeColor="text1"/>
+          <w:sz w:val="22"/>
+          <w:szCs w:val="22"/>
+        </w:rPr>
+      </w:pPr>
+      <w:r>
+        <w:rPr>
+          <w:rFonts w:ascii="Calibri" w:hAnsi="Calibri"/>
+          <w:b/>
+          <w:bCs/>
+          <w:color w:val="000000" w:themeColor="text1"/>
+          <w:sz w:val="22"/>
+          <w:szCs w:val="22"/>
+        </w:rPr>
+        <w:t xml:space="preserve">01/2016-02/2018 | Lusail Rail</w:t>
+      </w:r>
+    </w:p>
+    <w:p>
+      <w:pPr>
+        <w:suppressAutoHyphens/>
+        <w:jc w:val="both"/>
+        <w:rPr>
+          <w:rFonts w:ascii="Calibri" w:hAnsi="Calibri"/>
+          <w:b/>
+          <w:bCs/>
+          <w:color w:val="000000" w:themeColor="text1"/>
+          <w:sz w:val="22"/>
+          <w:szCs w:val="22"/>
+        </w:rPr>
+      </w:pPr>
+      <w:r>
+        <w:rPr>
+          <w:rFonts w:ascii="Calibri" w:hAnsi="Calibri"/>
+          <w:b/>
+          <w:bCs/>
+          <w:color w:val="000000" w:themeColor="text1"/>
+          <w:sz w:val="22"/>
+          <w:szCs w:val="22"/>
+        </w:rPr>
+        <w:t xml:space="preserve">Qatar</w:t>
+      </w:r>
+      <w:r>
+        <w:rPr>
+          <w:rFonts w:ascii="Calibri" w:hAnsi="Calibri"/>
+          <w:b/>
+          <w:bCs/>
+          <w:color w:val="000000" w:themeColor="text1"/>
+          <w:sz w:val="22"/>
+          <w:szCs w:val="22"/>
+        </w:rPr>
+        <w:t xml:space="preserve"> | Global Quality Assurance Manager</w:t>
+      </w:r>
+    </w:p>
+    <w:p>
+      <w:pPr>
+        <w:suppressAutoHyphens/>
+        <w:jc w:val="both"/>
+        <w:rPr>
+          <w:rFonts w:ascii="Calibri" w:hAnsi="Calibri"/>
+          <w:color w:val="000000" w:themeColor="text1"/>
+          <w:sz w:val="22"/>
+          <w:szCs w:val="22"/>
+        </w:rPr>
+      </w:pPr>
+    </w:p>
+    <w:p>
+      <w:pPr>
+        <w:suppressAutoHyphens/>
+        <w:jc w:val="both"/>
+        <w:rPr>
+          <w:rFonts w:ascii="Calibri" w:hAnsi="Calibri"/>
+          <w:color w:val="000000" w:themeColor="text1"/>
+          <w:sz w:val="22"/>
+          <w:szCs w:val="22"/>
+        </w:rPr>
+      </w:pPr>
+      <w:r>
+        <w:rPr>
+          <w:rFonts w:ascii="Calibri" w:hAnsi="Calibri"/>
+          <w:color w:val="000000" w:themeColor="text1"/>
+          <w:sz w:val="22"/>
+          <w:szCs w:val="22"/>
+        </w:rPr>
+        <w:t xml:space="preserve">Project description/summary: Onshore &amp; Offshore QA Surveillance role, responsible for Engineering and Site Quality. </w:t>
+      </w:r>
+    </w:p>
+    <w:p>
+      <w:pPr>
+        <w:suppressAutoHyphens/>
+        <w:jc w:val="both"/>
+        <w:rPr>
+          <w:rFonts w:ascii="Calibri" w:hAnsi="Calibri"/>
+          <w:color w:val="000000" w:themeColor="text1"/>
+          <w:sz w:val="22"/>
+          <w:szCs w:val="22"/>
+        </w:rPr>
+      </w:pPr>
+      <w:r>
+        <w:rPr>
+          <w:rFonts w:ascii="Calibri" w:hAnsi="Calibri"/>
+          <w:color w:val="000000" w:themeColor="text1"/>
+          <w:sz w:val="22"/>
+          <w:szCs w:val="22"/>
+        </w:rPr>
+        <w:t xml:space="preserve">Company’s role in the Project: </w:t>
+      </w:r>
+    </w:p>
+    <w:p>
+      <w:pPr>
+        <w:suppressAutoHyphens/>
+        <w:jc w:val="both"/>
+        <w:rPr>
+          <w:rFonts w:ascii="Calibri" w:hAnsi="Calibri"/>
+          <w:color w:val="000000" w:themeColor="text1"/>
+          <w:sz w:val="22"/>
+          <w:szCs w:val="22"/>
+        </w:rPr>
+      </w:pPr>
+      <w:r>
+        <w:rPr>
+          <w:rFonts w:ascii="Calibri" w:hAnsi="Calibri"/>
+          <w:color w:val="000000" w:themeColor="text1"/>
+          <w:sz w:val="22"/>
+          <w:szCs w:val="22"/>
+        </w:rPr>
+        <w:t xml:space="preserve">Value: </w:t>
+      </w:r>
+      <w:r>
+        <w:rPr>
+          <w:rFonts w:ascii="Calibri" w:hAnsi="Calibri"/>
+          <w:color w:val="000000" w:themeColor="text1"/>
+          <w:sz w:val="22"/>
+          <w:szCs w:val="22"/>
+        </w:rPr>
+        <w:t xml:space="preserve"/>
+      </w:r>
+    </w:p>
+    <w:p>
+      <w:pPr>
+        <w:suppressAutoHyphens/>
+        <w:jc w:val="both"/>
+        <w:rPr>
+          <w:rFonts w:ascii="Calibri" w:hAnsi="Calibri"/>
+          <w:color w:val="000000" w:themeColor="text1"/>
+          <w:sz w:val="22"/>
+          <w:szCs w:val="22"/>
+        </w:rPr>
+      </w:pPr>
+    </w:p>
+    <w:p>
+      <w:pPr>
+        <w:suppressAutoHyphens/>
+        <w:jc w:val="both"/>
+        <w:rPr>
+          <w:rFonts w:ascii="Calibri" w:hAnsi="Calibri"/>
+          <w:b/>
+          <w:bCs/>
+          <w:color w:val="000000" w:themeColor="text1"/>
+          <w:sz w:val="22"/>
+          <w:szCs w:val="22"/>
+        </w:rPr>
+      </w:pPr>
+      <w:r>
+        <w:rPr>
+          <w:rFonts w:ascii="Calibri" w:hAnsi="Calibri"/>
+          <w:b/>
+          <w:bCs/>
+          <w:color w:val="000000" w:themeColor="text1"/>
+          <w:sz w:val="22"/>
+          <w:szCs w:val="22"/>
+        </w:rPr>
+        <w:t>Responsibilities/Tasks:</w:t>
       </w:r>
     </w:p>
     <w:p>
@@ -2392,7 +2392,7 @@
           <w:sz w:val="22"/>
           <w:szCs w:val="22"/>
         </w:rPr>
-        <w:t xml:space="preserve">Corporate QMS implementation (+SHE), ISO certification (9001:2015), Tailoring to Customer Process</w:t>
+        <w:t xml:space="preserve">Tailor &amp; Implement Corporate (Chorus)/Customer processes and train the Thales teams and sub-contractors.</w:t>
       </w:r>
     </w:p>
     <w:p>
@@ -2439,231 +2439,7 @@
           <w:sz w:val="22"/>
           <w:szCs w:val="22"/>
         </w:rPr>
-        <w:t xml:space="preserve">QA/QC – PQP/WMS/ITP/MAR/RI/RFIs/Calibration/NCRs, Execution, Reporting, Audits, Supplier Quality, Site Quality QC teams (internal and Sub-contractors) during Material/Installation/T&amp;C phases</w:t>
-      </w:r>
-    </w:p>
-    <w:p>
-      <w:pPr>
-        <w:suppressAutoHyphens/>
-        <w:jc w:val="both"/>
-        <w:rPr>
-          <w:rFonts w:ascii="Calibri" w:hAnsi="Calibri"/>
-          <w:color w:val="000000" w:themeColor="text1"/>
-          <w:sz w:val="22"/>
-          <w:szCs w:val="22"/>
-        </w:rPr>
-      </w:pPr>
-      <w:r>
-        <w:rPr>
-          <w:rFonts w:ascii="Calibri" w:hAnsi="Calibri"/>
-          <w:color w:val="000000" w:themeColor="text1"/>
-          <w:sz w:val="22"/>
-          <w:szCs w:val="22"/>
-        </w:rPr>
-        <w:t xml:space="preserve"/>
-      </w:r>
-    </w:p>
-    <w:p>
-      <w:pPr>
-        <w:suppressAutoHyphens/>
-        <w:jc w:val="both"/>
-        <w:rPr>
-          <w:rFonts w:ascii="Calibri" w:hAnsi="Calibri"/>
-          <w:color w:val="000000" w:themeColor="text1"/>
-          <w:sz w:val="22"/>
-          <w:szCs w:val="22"/>
-        </w:rPr>
-      </w:pPr>
-      <w:r>
-        <w:rPr>
-          <w:rFonts w:ascii="Calibri" w:hAnsi="Calibri"/>
-          <w:color w:val="000000" w:themeColor="text1"/>
-          <w:sz w:val="22"/>
-          <w:szCs w:val="22"/>
-        </w:rPr>
-        <w:t xml:space="preserve"/>
-      </w:r>
-    </w:p>
-    <w:p>
-      <w:pPr>
-        <w:suppressAutoHyphens/>
-        <w:jc w:val="both"/>
-        <w:rPr>
-          <w:rFonts w:ascii="Calibri" w:hAnsi="Calibri"/>
-          <w:b/>
-          <w:bCs/>
-          <w:color w:val="000000" w:themeColor="text1"/>
-          <w:sz w:val="22"/>
-          <w:szCs w:val="22"/>
-        </w:rPr>
-      </w:pPr>
-      <w:r>
-        <w:rPr>
-          <w:rFonts w:ascii="Calibri" w:hAnsi="Calibri"/>
-          <w:b/>
-          <w:bCs/>
-          <w:color w:val="000000" w:themeColor="text1"/>
-          <w:sz w:val="22"/>
-          <w:szCs w:val="22"/>
-        </w:rPr>
-        <w:t xml:space="preserve">07'2012-01'2016 | Mirage 2000 Aircraft Upgrade (Indian Offset Contract)</w:t>
-      </w:r>
-    </w:p>
-    <w:p>
-      <w:pPr>
-        <w:suppressAutoHyphens/>
-        <w:jc w:val="both"/>
-        <w:rPr>
-          <w:rFonts w:ascii="Calibri" w:hAnsi="Calibri"/>
-          <w:b/>
-          <w:bCs/>
-          <w:color w:val="000000" w:themeColor="text1"/>
-          <w:sz w:val="22"/>
-          <w:szCs w:val="22"/>
-        </w:rPr>
-      </w:pPr>
-      <w:r>
-        <w:rPr>
-          <w:rFonts w:ascii="Calibri" w:hAnsi="Calibri"/>
-          <w:b/>
-          <w:bCs/>
-          <w:color w:val="000000" w:themeColor="text1"/>
-          <w:sz w:val="22"/>
-          <w:szCs w:val="22"/>
-        </w:rPr>
-        <w:t xml:space="preserve">Bengaluru</w:t>
-      </w:r>
-      <w:r>
-        <w:rPr>
-          <w:rFonts w:ascii="Calibri" w:hAnsi="Calibri"/>
-          <w:b/>
-          <w:bCs/>
-          <w:color w:val="000000" w:themeColor="text1"/>
-          <w:sz w:val="22"/>
-          <w:szCs w:val="22"/>
-        </w:rPr>
-        <w:t xml:space="preserve"> | Project Quality Assurance Manager (Onshore)</w:t>
-      </w:r>
-    </w:p>
-    <w:p>
-      <w:pPr>
-        <w:suppressAutoHyphens/>
-        <w:jc w:val="both"/>
-        <w:rPr>
-          <w:rFonts w:ascii="Calibri" w:hAnsi="Calibri"/>
-          <w:color w:val="000000" w:themeColor="text1"/>
-          <w:sz w:val="22"/>
-          <w:szCs w:val="22"/>
-        </w:rPr>
-      </w:pPr>
-    </w:p>
-    <w:p>
-      <w:pPr>
-        <w:suppressAutoHyphens/>
-        <w:jc w:val="both"/>
-        <w:rPr>
-          <w:rFonts w:ascii="Calibri" w:hAnsi="Calibri"/>
-          <w:color w:val="000000" w:themeColor="text1"/>
-          <w:sz w:val="22"/>
-          <w:szCs w:val="22"/>
-        </w:rPr>
-      </w:pPr>
-      <w:r>
-        <w:rPr>
-          <w:rFonts w:ascii="Calibri" w:hAnsi="Calibri"/>
-          <w:color w:val="000000" w:themeColor="text1"/>
-          <w:sz w:val="22"/>
-          <w:szCs w:val="22"/>
-        </w:rPr>
-        <w:t xml:space="preserve">Project description/summary: Onshore &amp; Offshore QA/QC role, responsible for Engineering (Contractors) and Site Quality (HAL) </w:t>
-      </w:r>
-    </w:p>
-    <w:p>
-      <w:pPr>
-        <w:suppressAutoHyphens/>
-        <w:jc w:val="both"/>
-        <w:rPr>
-          <w:rFonts w:ascii="Calibri" w:hAnsi="Calibri"/>
-          <w:color w:val="000000" w:themeColor="text1"/>
-          <w:sz w:val="22"/>
-          <w:szCs w:val="22"/>
-        </w:rPr>
-      </w:pPr>
-      <w:r>
-        <w:rPr>
-          <w:rFonts w:ascii="Calibri" w:hAnsi="Calibri"/>
-          <w:color w:val="000000" w:themeColor="text1"/>
-          <w:sz w:val="22"/>
-          <w:szCs w:val="22"/>
-        </w:rPr>
-        <w:t xml:space="preserve">Company’s role in the Project: </w:t>
-      </w:r>
-    </w:p>
-    <w:p>
-      <w:pPr>
-        <w:suppressAutoHyphens/>
-        <w:jc w:val="both"/>
-        <w:rPr>
-          <w:rFonts w:ascii="Calibri" w:hAnsi="Calibri"/>
-          <w:color w:val="000000" w:themeColor="text1"/>
-          <w:sz w:val="22"/>
-          <w:szCs w:val="22"/>
-        </w:rPr>
-      </w:pPr>
-      <w:r>
-        <w:rPr>
-          <w:rFonts w:ascii="Calibri" w:hAnsi="Calibri"/>
-          <w:color w:val="000000" w:themeColor="text1"/>
-          <w:sz w:val="22"/>
-          <w:szCs w:val="22"/>
-        </w:rPr>
-        <w:t xml:space="preserve">Value: </w:t>
-      </w:r>
-      <w:r>
-        <w:rPr>
-          <w:rFonts w:ascii="Calibri" w:hAnsi="Calibri"/>
-          <w:color w:val="000000" w:themeColor="text1"/>
-          <w:sz w:val="22"/>
-          <w:szCs w:val="22"/>
-        </w:rPr>
-        <w:t xml:space="preserve"/>
-      </w:r>
-    </w:p>
-    <w:p>
-      <w:pPr>
-        <w:suppressAutoHyphens/>
-        <w:jc w:val="both"/>
-        <w:rPr>
-          <w:rFonts w:ascii="Calibri" w:hAnsi="Calibri"/>
-          <w:color w:val="000000" w:themeColor="text1"/>
-          <w:sz w:val="22"/>
-          <w:szCs w:val="22"/>
-        </w:rPr>
-      </w:pPr>
-    </w:p>
-    <w:p>
-      <w:pPr>
-        <w:suppressAutoHyphens/>
-        <w:jc w:val="both"/>
-        <w:rPr>
-          <w:rFonts w:ascii="Calibri" w:hAnsi="Calibri"/>
-          <w:b/>
-          <w:bCs/>
-          <w:color w:val="000000" w:themeColor="text1"/>
-          <w:sz w:val="22"/>
-          <w:szCs w:val="22"/>
-        </w:rPr>
-      </w:pPr>
-      <w:r>
-        <w:rPr>
-          <w:rFonts w:ascii="Calibri" w:hAnsi="Calibri"/>
-          <w:b/>
-          <w:bCs/>
-          <w:color w:val="000000" w:themeColor="text1"/>
-          <w:sz w:val="22"/>
-          <w:szCs w:val="22"/>
-        </w:rPr>
-        <w:t>Responsibilities/Tasks:</w:t>
+        <w:t xml:space="preserve">Corporate QMS implementation (+SHE), ISO certification (9001:2015), Tailoring to Customer Process.</w:t>
       </w:r>
     </w:p>
     <w:p>
@@ -2710,7 +2486,7 @@
           <w:sz w:val="22"/>
           <w:szCs w:val="22"/>
         </w:rPr>
-        <w:t xml:space="preserve">QMS: Implemented Corporate QMS (Chorus 2.0 CPO, Tailoring, trainings, deployment etc.); ISO 9001 certification.</w:t>
+        <w:t xml:space="preserve">QA/QC – PQP/WMS/ITP/MAR/RI/RFIs/Calibration/NCRs, Execution, Reporting, Audits, Supplier Quality, Site Quality QC teams (internal and Sub-contractors) during Material/Installation/T&amp;C phases.</w:t>
       </w:r>
     </w:p>
     <w:p>
@@ -2757,7 +2533,7 @@
           <w:sz w:val="22"/>
           <w:szCs w:val="22"/>
         </w:rPr>
-        <w:t xml:space="preserve">Planning: PQP, WMS/ITPs/Checklists for project including reviews and approvals of offset partner deliverables</w:t>
+        <w:t xml:space="preserve">Co-ordination of Safety Assurance (Offshore team), TIMS assessment/PIVS (Internal Audits).</w:t>
       </w:r>
     </w:p>
     <w:p>
@@ -2804,231 +2580,7 @@
           <w:sz w:val="22"/>
           <w:szCs w:val="22"/>
         </w:rPr>
-        <w:t xml:space="preserve">Engineering QA: Gate reviews, Software sampling tests/Build Checks, CSAT, Quality Advice, Track Actions</w:t>
-      </w:r>
-    </w:p>
-    <w:p>
-      <w:pPr>
-        <w:suppressAutoHyphens/>
-        <w:jc w:val="both"/>
-        <w:rPr>
-          <w:rFonts w:ascii="Calibri" w:hAnsi="Calibri"/>
-          <w:color w:val="000000" w:themeColor="text1"/>
-          <w:sz w:val="22"/>
-          <w:szCs w:val="22"/>
-        </w:rPr>
-      </w:pPr>
-      <w:r>
-        <w:rPr>
-          <w:rFonts w:ascii="Calibri" w:hAnsi="Calibri"/>
-          <w:color w:val="000000" w:themeColor="text1"/>
-          <w:sz w:val="22"/>
-          <w:szCs w:val="22"/>
-        </w:rPr>
-        <w:t xml:space="preserve"/>
-      </w:r>
-    </w:p>
-    <w:p>
-      <w:pPr>
-        <w:suppressAutoHyphens/>
-        <w:jc w:val="both"/>
-        <w:rPr>
-          <w:rFonts w:ascii="Calibri" w:hAnsi="Calibri"/>
-          <w:color w:val="000000" w:themeColor="text1"/>
-          <w:sz w:val="22"/>
-          <w:szCs w:val="22"/>
-        </w:rPr>
-      </w:pPr>
-      <w:r>
-        <w:rPr>
-          <w:rFonts w:ascii="Calibri" w:hAnsi="Calibri"/>
-          <w:color w:val="000000" w:themeColor="text1"/>
-          <w:sz w:val="22"/>
-          <w:szCs w:val="22"/>
-        </w:rPr>
-        <w:t xml:space="preserve"/>
-      </w:r>
-    </w:p>
-    <w:p>
-      <w:pPr>
-        <w:suppressAutoHyphens/>
-        <w:jc w:val="both"/>
-        <w:rPr>
-          <w:rFonts w:ascii="Calibri" w:hAnsi="Calibri"/>
-          <w:b/>
-          <w:bCs/>
-          <w:color w:val="000000" w:themeColor="text1"/>
-          <w:sz w:val="22"/>
-          <w:szCs w:val="22"/>
-        </w:rPr>
-      </w:pPr>
-      <w:r>
-        <w:rPr>
-          <w:rFonts w:ascii="Calibri" w:hAnsi="Calibri"/>
-          <w:b/>
-          <w:bCs/>
-          <w:color w:val="000000" w:themeColor="text1"/>
-          <w:sz w:val="22"/>
-          <w:szCs w:val="22"/>
-        </w:rPr>
-        <w:t xml:space="preserve">10'2008-06'2012 | Avionics Portfolio Projects</w:t>
-      </w:r>
-    </w:p>
-    <w:p>
-      <w:pPr>
-        <w:suppressAutoHyphens/>
-        <w:jc w:val="both"/>
-        <w:rPr>
-          <w:rFonts w:ascii="Calibri" w:hAnsi="Calibri"/>
-          <w:b/>
-          <w:bCs/>
-          <w:color w:val="000000" w:themeColor="text1"/>
-          <w:sz w:val="22"/>
-          <w:szCs w:val="22"/>
-        </w:rPr>
-      </w:pPr>
-      <w:r>
-        <w:rPr>
-          <w:rFonts w:ascii="Calibri" w:hAnsi="Calibri"/>
-          <w:b/>
-          <w:bCs/>
-          <w:color w:val="000000" w:themeColor="text1"/>
-          <w:sz w:val="22"/>
-          <w:szCs w:val="22"/>
-        </w:rPr>
-        <w:t xml:space="preserve">Chennai</w:t>
-      </w:r>
-      <w:r>
-        <w:rPr>
-          <w:rFonts w:ascii="Calibri" w:hAnsi="Calibri"/>
-          <w:b/>
-          <w:bCs/>
-          <w:color w:val="000000" w:themeColor="text1"/>
-          <w:sz w:val="22"/>
-          <w:szCs w:val="22"/>
-        </w:rPr>
-        <w:t xml:space="preserve"> | Portfolio Quality Assurance Manager (Onshore)</w:t>
-      </w:r>
-    </w:p>
-    <w:p>
-      <w:pPr>
-        <w:suppressAutoHyphens/>
-        <w:jc w:val="both"/>
-        <w:rPr>
-          <w:rFonts w:ascii="Calibri" w:hAnsi="Calibri"/>
-          <w:color w:val="000000" w:themeColor="text1"/>
-          <w:sz w:val="22"/>
-          <w:szCs w:val="22"/>
-        </w:rPr>
-      </w:pPr>
-    </w:p>
-    <w:p>
-      <w:pPr>
-        <w:suppressAutoHyphens/>
-        <w:jc w:val="both"/>
-        <w:rPr>
-          <w:rFonts w:ascii="Calibri" w:hAnsi="Calibri"/>
-          <w:color w:val="000000" w:themeColor="text1"/>
-          <w:sz w:val="22"/>
-          <w:szCs w:val="22"/>
-        </w:rPr>
-      </w:pPr>
-      <w:r>
-        <w:rPr>
-          <w:rFonts w:ascii="Calibri" w:hAnsi="Calibri"/>
-          <w:color w:val="000000" w:themeColor="text1"/>
-          <w:sz w:val="22"/>
-          <w:szCs w:val="22"/>
-        </w:rPr>
-        <w:t xml:space="preserve">Project description/summary: Offshore QA/QC role, responsible for Engineering Quality </w:t>
-      </w:r>
-    </w:p>
-    <w:p>
-      <w:pPr>
-        <w:suppressAutoHyphens/>
-        <w:jc w:val="both"/>
-        <w:rPr>
-          <w:rFonts w:ascii="Calibri" w:hAnsi="Calibri"/>
-          <w:color w:val="000000" w:themeColor="text1"/>
-          <w:sz w:val="22"/>
-          <w:szCs w:val="22"/>
-        </w:rPr>
-      </w:pPr>
-      <w:r>
-        <w:rPr>
-          <w:rFonts w:ascii="Calibri" w:hAnsi="Calibri"/>
-          <w:color w:val="000000" w:themeColor="text1"/>
-          <w:sz w:val="22"/>
-          <w:szCs w:val="22"/>
-        </w:rPr>
-        <w:t xml:space="preserve">Company’s role in the Project: </w:t>
-      </w:r>
-    </w:p>
-    <w:p>
-      <w:pPr>
-        <w:suppressAutoHyphens/>
-        <w:jc w:val="both"/>
-        <w:rPr>
-          <w:rFonts w:ascii="Calibri" w:hAnsi="Calibri"/>
-          <w:color w:val="000000" w:themeColor="text1"/>
-          <w:sz w:val="22"/>
-          <w:szCs w:val="22"/>
-        </w:rPr>
-      </w:pPr>
-      <w:r>
-        <w:rPr>
-          <w:rFonts w:ascii="Calibri" w:hAnsi="Calibri"/>
-          <w:color w:val="000000" w:themeColor="text1"/>
-          <w:sz w:val="22"/>
-          <w:szCs w:val="22"/>
-        </w:rPr>
-        <w:t xml:space="preserve">Value: </w:t>
-      </w:r>
-      <w:r>
-        <w:rPr>
-          <w:rFonts w:ascii="Calibri" w:hAnsi="Calibri"/>
-          <w:color w:val="000000" w:themeColor="text1"/>
-          <w:sz w:val="22"/>
-          <w:szCs w:val="22"/>
-        </w:rPr>
-        <w:t xml:space="preserve"/>
-      </w:r>
-    </w:p>
-    <w:p>
-      <w:pPr>
-        <w:suppressAutoHyphens/>
-        <w:jc w:val="both"/>
-        <w:rPr>
-          <w:rFonts w:ascii="Calibri" w:hAnsi="Calibri"/>
-          <w:color w:val="000000" w:themeColor="text1"/>
-          <w:sz w:val="22"/>
-          <w:szCs w:val="22"/>
-        </w:rPr>
-      </w:pPr>
-    </w:p>
-    <w:p>
-      <w:pPr>
-        <w:suppressAutoHyphens/>
-        <w:jc w:val="both"/>
-        <w:rPr>
-          <w:rFonts w:ascii="Calibri" w:hAnsi="Calibri"/>
-          <w:b/>
-          <w:bCs/>
-          <w:color w:val="000000" w:themeColor="text1"/>
-          <w:sz w:val="22"/>
-          <w:szCs w:val="22"/>
-        </w:rPr>
-      </w:pPr>
-      <w:r>
-        <w:rPr>
-          <w:rFonts w:ascii="Calibri" w:hAnsi="Calibri"/>
-          <w:b/>
-          <w:bCs/>
-          <w:color w:val="000000" w:themeColor="text1"/>
-          <w:sz w:val="22"/>
-          <w:szCs w:val="22"/>
-        </w:rPr>
-        <w:t>Responsibilities/Tasks:</w:t>
+        <w:t xml:space="preserve">Reporting to Customer, Directors with QA Advise, Alerts and Veto for timely action and follow-up.</w:t>
       </w:r>
     </w:p>
     <w:p>
@@ -3075,7 +2627,7 @@
           <w:sz w:val="22"/>
           <w:szCs w:val="22"/>
         </w:rPr>
-        <w:t xml:space="preserve">QAQC Planning (PQP), WMS/SOPs, Inspections for the entity projects and Portfolios</w:t>
+        <w:t xml:space="preserve">Reviews of Bid/SOW/Proposals/Gate reviews/Design Docs/Materials/I,T&amp;C documents and records.</w:t>
       </w:r>
     </w:p>
     <w:p>
@@ -3122,231 +2674,7 @@
           <w:sz w:val="22"/>
           <w:szCs w:val="22"/>
         </w:rPr>
-        <w:t xml:space="preserve">Key involvement in Stage Gate reviews (PDR/CDR/FAI etc) (Equivalent to Design and FAT)</w:t>
-      </w:r>
-    </w:p>
-    <w:p>
-      <w:pPr>
-        <w:suppressAutoHyphens/>
-        <w:jc w:val="both"/>
-        <w:rPr>
-          <w:rFonts w:ascii="Calibri" w:hAnsi="Calibri"/>
-          <w:color w:val="000000" w:themeColor="text1"/>
-          <w:sz w:val="22"/>
-          <w:szCs w:val="22"/>
-        </w:rPr>
-      </w:pPr>
-      <w:r>
-        <w:rPr>
-          <w:rFonts w:ascii="Calibri" w:hAnsi="Calibri"/>
-          <w:color w:val="000000" w:themeColor="text1"/>
-          <w:sz w:val="22"/>
-          <w:szCs w:val="22"/>
-        </w:rPr>
-        <w:t xml:space="preserve"/>
-      </w:r>
-    </w:p>
-    <w:p>
-      <w:pPr>
-        <w:suppressAutoHyphens/>
-        <w:jc w:val="both"/>
-        <w:rPr>
-          <w:rFonts w:ascii="Calibri" w:hAnsi="Calibri"/>
-          <w:color w:val="000000" w:themeColor="text1"/>
-          <w:sz w:val="22"/>
-          <w:szCs w:val="22"/>
-        </w:rPr>
-      </w:pPr>
-      <w:r>
-        <w:rPr>
-          <w:rFonts w:ascii="Calibri" w:hAnsi="Calibri"/>
-          <w:color w:val="000000" w:themeColor="text1"/>
-          <w:sz w:val="22"/>
-          <w:szCs w:val="22"/>
-        </w:rPr>
-        <w:t xml:space="preserve"/>
-      </w:r>
-    </w:p>
-    <w:p>
-      <w:pPr>
-        <w:suppressAutoHyphens/>
-        <w:jc w:val="both"/>
-        <w:rPr>
-          <w:rFonts w:ascii="Calibri" w:hAnsi="Calibri"/>
-          <w:b/>
-          <w:bCs/>
-          <w:color w:val="000000" w:themeColor="text1"/>
-          <w:sz w:val="22"/>
-          <w:szCs w:val="22"/>
-        </w:rPr>
-      </w:pPr>
-      <w:r>
-        <w:rPr>
-          <w:rFonts w:ascii="Calibri" w:hAnsi="Calibri"/>
-          <w:b/>
-          <w:bCs/>
-          <w:color w:val="000000" w:themeColor="text1"/>
-          <w:sz w:val="22"/>
-          <w:szCs w:val="22"/>
-        </w:rPr>
-        <w:t xml:space="preserve">04'2007-10'2008 | A400M Aircraft HMI projects</w:t>
-      </w:r>
-    </w:p>
-    <w:p>
-      <w:pPr>
-        <w:suppressAutoHyphens/>
-        <w:jc w:val="both"/>
-        <w:rPr>
-          <w:rFonts w:ascii="Calibri" w:hAnsi="Calibri"/>
-          <w:b/>
-          <w:bCs/>
-          <w:color w:val="000000" w:themeColor="text1"/>
-          <w:sz w:val="22"/>
-          <w:szCs w:val="22"/>
-        </w:rPr>
-      </w:pPr>
-      <w:r>
-        <w:rPr>
-          <w:rFonts w:ascii="Calibri" w:hAnsi="Calibri"/>
-          <w:b/>
-          <w:bCs/>
-          <w:color w:val="000000" w:themeColor="text1"/>
-          <w:sz w:val="22"/>
-          <w:szCs w:val="22"/>
-        </w:rPr>
-        <w:t xml:space="preserve"/>
-      </w:r>
-      <w:r>
-        <w:rPr>
-          <w:rFonts w:ascii="Calibri" w:hAnsi="Calibri"/>
-          <w:b/>
-          <w:bCs/>
-          <w:color w:val="000000" w:themeColor="text1"/>
-          <w:sz w:val="22"/>
-          <w:szCs w:val="22"/>
-        </w:rPr>
-        <w:t xml:space="preserve"> | Engineering Technical Lead (Offshore)</w:t>
-      </w:r>
-    </w:p>
-    <w:p>
-      <w:pPr>
-        <w:suppressAutoHyphens/>
-        <w:jc w:val="both"/>
-        <w:rPr>
-          <w:rFonts w:ascii="Calibri" w:hAnsi="Calibri"/>
-          <w:color w:val="000000" w:themeColor="text1"/>
-          <w:sz w:val="22"/>
-          <w:szCs w:val="22"/>
-        </w:rPr>
-      </w:pPr>
-    </w:p>
-    <w:p>
-      <w:pPr>
-        <w:suppressAutoHyphens/>
-        <w:jc w:val="both"/>
-        <w:rPr>
-          <w:rFonts w:ascii="Calibri" w:hAnsi="Calibri"/>
-          <w:color w:val="000000" w:themeColor="text1"/>
-          <w:sz w:val="22"/>
-          <w:szCs w:val="22"/>
-        </w:rPr>
-      </w:pPr>
-      <w:r>
-        <w:rPr>
-          <w:rFonts w:ascii="Calibri" w:hAnsi="Calibri"/>
-          <w:color w:val="000000" w:themeColor="text1"/>
-          <w:sz w:val="22"/>
-          <w:szCs w:val="22"/>
-        </w:rPr>
-        <w:t xml:space="preserve">Project description/summary: Avionics Team Lead, responsible for HMI (for Pilot) Design and Development for A400M Aircraft </w:t>
-      </w:r>
-    </w:p>
-    <w:p>
-      <w:pPr>
-        <w:suppressAutoHyphens/>
-        <w:jc w:val="both"/>
-        <w:rPr>
-          <w:rFonts w:ascii="Calibri" w:hAnsi="Calibri"/>
-          <w:color w:val="000000" w:themeColor="text1"/>
-          <w:sz w:val="22"/>
-          <w:szCs w:val="22"/>
-        </w:rPr>
-      </w:pPr>
-      <w:r>
-        <w:rPr>
-          <w:rFonts w:ascii="Calibri" w:hAnsi="Calibri"/>
-          <w:color w:val="000000" w:themeColor="text1"/>
-          <w:sz w:val="22"/>
-          <w:szCs w:val="22"/>
-        </w:rPr>
-        <w:t xml:space="preserve">Company’s role in the Project: </w:t>
-      </w:r>
-    </w:p>
-    <w:p>
-      <w:pPr>
-        <w:suppressAutoHyphens/>
-        <w:jc w:val="both"/>
-        <w:rPr>
-          <w:rFonts w:ascii="Calibri" w:hAnsi="Calibri"/>
-          <w:color w:val="000000" w:themeColor="text1"/>
-          <w:sz w:val="22"/>
-          <w:szCs w:val="22"/>
-        </w:rPr>
-      </w:pPr>
-      <w:r>
-        <w:rPr>
-          <w:rFonts w:ascii="Calibri" w:hAnsi="Calibri"/>
-          <w:color w:val="000000" w:themeColor="text1"/>
-          <w:sz w:val="22"/>
-          <w:szCs w:val="22"/>
-        </w:rPr>
-        <w:t xml:space="preserve">Value: </w:t>
-      </w:r>
-      <w:r>
-        <w:rPr>
-          <w:rFonts w:ascii="Calibri" w:hAnsi="Calibri"/>
-          <w:color w:val="000000" w:themeColor="text1"/>
-          <w:sz w:val="22"/>
-          <w:szCs w:val="22"/>
-        </w:rPr>
-        <w:t xml:space="preserve"/>
-      </w:r>
-    </w:p>
-    <w:p>
-      <w:pPr>
-        <w:suppressAutoHyphens/>
-        <w:jc w:val="both"/>
-        <w:rPr>
-          <w:rFonts w:ascii="Calibri" w:hAnsi="Calibri"/>
-          <w:color w:val="000000" w:themeColor="text1"/>
-          <w:sz w:val="22"/>
-          <w:szCs w:val="22"/>
-        </w:rPr>
-      </w:pPr>
-    </w:p>
-    <w:p>
-      <w:pPr>
-        <w:suppressAutoHyphens/>
-        <w:jc w:val="both"/>
-        <w:rPr>
-          <w:rFonts w:ascii="Calibri" w:hAnsi="Calibri"/>
-          <w:b/>
-          <w:bCs/>
-          <w:color w:val="000000" w:themeColor="text1"/>
-          <w:sz w:val="22"/>
-          <w:szCs w:val="22"/>
-        </w:rPr>
-      </w:pPr>
-      <w:r>
-        <w:rPr>
-          <w:rFonts w:ascii="Calibri" w:hAnsi="Calibri"/>
-          <w:b/>
-          <w:bCs/>
-          <w:color w:val="000000" w:themeColor="text1"/>
-          <w:sz w:val="22"/>
-          <w:szCs w:val="22"/>
-        </w:rPr>
-        <w:t>Responsibilities/Tasks:</w:t>
+        <w:t xml:space="preserve">Qualification, Quality supervision and audits of Subcontractors, reporting; material inspections.</w:t>
       </w:r>
     </w:p>
     <w:p>
@@ -3393,7 +2721,231 @@
           <w:sz w:val="22"/>
           <w:szCs w:val="22"/>
         </w:rPr>
-        <w:t xml:space="preserve">Project Initiation (France), planning, training (ADA language), execution, and monitoring control (client reporting)</w:t>
+        <w:t xml:space="preserve">Managed Non-Conformances, CAPA, RCA, KPI Analysis; Action Tracking, Risks, Lessons learnt, CSAT actions.</w:t>
+      </w:r>
+    </w:p>
+    <w:p>
+      <w:pPr>
+        <w:suppressAutoHyphens/>
+        <w:jc w:val="both"/>
+        <w:rPr>
+          <w:rFonts w:ascii="Calibri" w:hAnsi="Calibri"/>
+          <w:color w:val="000000" w:themeColor="text1"/>
+          <w:sz w:val="22"/>
+          <w:szCs w:val="22"/>
+        </w:rPr>
+      </w:pPr>
+      <w:r>
+        <w:rPr>
+          <w:rFonts w:ascii="Calibri" w:hAnsi="Calibri"/>
+          <w:color w:val="000000" w:themeColor="text1"/>
+          <w:sz w:val="22"/>
+          <w:szCs w:val="22"/>
+        </w:rPr>
+        <w:t xml:space="preserve"/>
+      </w:r>
+    </w:p>
+    <w:p>
+      <w:pPr>
+        <w:suppressAutoHyphens/>
+        <w:jc w:val="both"/>
+        <w:rPr>
+          <w:rFonts w:ascii="Calibri" w:hAnsi="Calibri"/>
+          <w:color w:val="000000" w:themeColor="text1"/>
+          <w:sz w:val="22"/>
+          <w:szCs w:val="22"/>
+        </w:rPr>
+      </w:pPr>
+      <w:r>
+        <w:rPr>
+          <w:rFonts w:ascii="Calibri" w:hAnsi="Calibri"/>
+          <w:color w:val="000000" w:themeColor="text1"/>
+          <w:sz w:val="22"/>
+          <w:szCs w:val="22"/>
+        </w:rPr>
+        <w:t xml:space="preserve"/>
+      </w:r>
+    </w:p>
+    <w:p>
+      <w:pPr>
+        <w:suppressAutoHyphens/>
+        <w:jc w:val="both"/>
+        <w:rPr>
+          <w:rFonts w:ascii="Calibri" w:hAnsi="Calibri"/>
+          <w:b/>
+          <w:bCs/>
+          <w:color w:val="000000" w:themeColor="text1"/>
+          <w:sz w:val="22"/>
+          <w:szCs w:val="22"/>
+        </w:rPr>
+      </w:pPr>
+      <w:r>
+        <w:rPr>
+          <w:rFonts w:ascii="Calibri" w:hAnsi="Calibri"/>
+          <w:b/>
+          <w:bCs/>
+          <w:color w:val="000000" w:themeColor="text1"/>
+          <w:sz w:val="22"/>
+          <w:szCs w:val="22"/>
+        </w:rPr>
+        <w:t xml:space="preserve">07/2012-01/2016 | Mirage 2000 Aircraft Upgrade</w:t>
+      </w:r>
+    </w:p>
+    <w:p>
+      <w:pPr>
+        <w:suppressAutoHyphens/>
+        <w:jc w:val="both"/>
+        <w:rPr>
+          <w:rFonts w:ascii="Calibri" w:hAnsi="Calibri"/>
+          <w:b/>
+          <w:bCs/>
+          <w:color w:val="000000" w:themeColor="text1"/>
+          <w:sz w:val="22"/>
+          <w:szCs w:val="22"/>
+        </w:rPr>
+      </w:pPr>
+      <w:r>
+        <w:rPr>
+          <w:rFonts w:ascii="Calibri" w:hAnsi="Calibri"/>
+          <w:b/>
+          <w:bCs/>
+          <w:color w:val="000000" w:themeColor="text1"/>
+          <w:sz w:val="22"/>
+          <w:szCs w:val="22"/>
+        </w:rPr>
+        <w:t xml:space="preserve">Bengaluru</w:t>
+      </w:r>
+      <w:r>
+        <w:rPr>
+          <w:rFonts w:ascii="Calibri" w:hAnsi="Calibri"/>
+          <w:b/>
+          <w:bCs/>
+          <w:color w:val="000000" w:themeColor="text1"/>
+          <w:sz w:val="22"/>
+          <w:szCs w:val="22"/>
+        </w:rPr>
+        <w:t xml:space="preserve"> | Project Quality Assurance Manager</w:t>
+      </w:r>
+    </w:p>
+    <w:p>
+      <w:pPr>
+        <w:suppressAutoHyphens/>
+        <w:jc w:val="both"/>
+        <w:rPr>
+          <w:rFonts w:ascii="Calibri" w:hAnsi="Calibri"/>
+          <w:color w:val="000000" w:themeColor="text1"/>
+          <w:sz w:val="22"/>
+          <w:szCs w:val="22"/>
+        </w:rPr>
+      </w:pPr>
+    </w:p>
+    <w:p>
+      <w:pPr>
+        <w:suppressAutoHyphens/>
+        <w:jc w:val="both"/>
+        <w:rPr>
+          <w:rFonts w:ascii="Calibri" w:hAnsi="Calibri"/>
+          <w:color w:val="000000" w:themeColor="text1"/>
+          <w:sz w:val="22"/>
+          <w:szCs w:val="22"/>
+        </w:rPr>
+      </w:pPr>
+      <w:r>
+        <w:rPr>
+          <w:rFonts w:ascii="Calibri" w:hAnsi="Calibri"/>
+          <w:color w:val="000000" w:themeColor="text1"/>
+          <w:sz w:val="22"/>
+          <w:szCs w:val="22"/>
+        </w:rPr>
+        <w:t xml:space="preserve">Project description/summary: Onshore role reporting to the Regional QHSE Director. </w:t>
+      </w:r>
+    </w:p>
+    <w:p>
+      <w:pPr>
+        <w:suppressAutoHyphens/>
+        <w:jc w:val="both"/>
+        <w:rPr>
+          <w:rFonts w:ascii="Calibri" w:hAnsi="Calibri"/>
+          <w:color w:val="000000" w:themeColor="text1"/>
+          <w:sz w:val="22"/>
+          <w:szCs w:val="22"/>
+        </w:rPr>
+      </w:pPr>
+      <w:r>
+        <w:rPr>
+          <w:rFonts w:ascii="Calibri" w:hAnsi="Calibri"/>
+          <w:color w:val="000000" w:themeColor="text1"/>
+          <w:sz w:val="22"/>
+          <w:szCs w:val="22"/>
+        </w:rPr>
+        <w:t xml:space="preserve">Company’s role in the Project: </w:t>
+      </w:r>
+    </w:p>
+    <w:p>
+      <w:pPr>
+        <w:suppressAutoHyphens/>
+        <w:jc w:val="both"/>
+        <w:rPr>
+          <w:rFonts w:ascii="Calibri" w:hAnsi="Calibri"/>
+          <w:color w:val="000000" w:themeColor="text1"/>
+          <w:sz w:val="22"/>
+          <w:szCs w:val="22"/>
+        </w:rPr>
+      </w:pPr>
+      <w:r>
+        <w:rPr>
+          <w:rFonts w:ascii="Calibri" w:hAnsi="Calibri"/>
+          <w:color w:val="000000" w:themeColor="text1"/>
+          <w:sz w:val="22"/>
+          <w:szCs w:val="22"/>
+        </w:rPr>
+        <w:t xml:space="preserve">Value: </w:t>
+      </w:r>
+      <w:r>
+        <w:rPr>
+          <w:rFonts w:ascii="Calibri" w:hAnsi="Calibri"/>
+          <w:color w:val="000000" w:themeColor="text1"/>
+          <w:sz w:val="22"/>
+          <w:szCs w:val="22"/>
+        </w:rPr>
+        <w:t xml:space="preserve"/>
+      </w:r>
+    </w:p>
+    <w:p>
+      <w:pPr>
+        <w:suppressAutoHyphens/>
+        <w:jc w:val="both"/>
+        <w:rPr>
+          <w:rFonts w:ascii="Calibri" w:hAnsi="Calibri"/>
+          <w:color w:val="000000" w:themeColor="text1"/>
+          <w:sz w:val="22"/>
+          <w:szCs w:val="22"/>
+        </w:rPr>
+      </w:pPr>
+    </w:p>
+    <w:p>
+      <w:pPr>
+        <w:suppressAutoHyphens/>
+        <w:jc w:val="both"/>
+        <w:rPr>
+          <w:rFonts w:ascii="Calibri" w:hAnsi="Calibri"/>
+          <w:b/>
+          <w:bCs/>
+          <w:color w:val="000000" w:themeColor="text1"/>
+          <w:sz w:val="22"/>
+          <w:szCs w:val="22"/>
+        </w:rPr>
+      </w:pPr>
+      <w:r>
+        <w:rPr>
+          <w:rFonts w:ascii="Calibri" w:hAnsi="Calibri"/>
+          <w:b/>
+          <w:bCs/>
+          <w:color w:val="000000" w:themeColor="text1"/>
+          <w:sz w:val="22"/>
+          <w:szCs w:val="22"/>
+        </w:rPr>
+        <w:t>Responsibilities/Tasks:</w:t>
       </w:r>
     </w:p>
     <w:p>
@@ -3440,231 +2992,7 @@
           <w:sz w:val="22"/>
           <w:szCs w:val="22"/>
         </w:rPr>
-        <w:t xml:space="preserve">Requirement analysis, reviews, LLRs, design (CDS: HMI-GUI), coding (OOTH/DO178B), debug and unit testing.</w:t>
-      </w:r>
-    </w:p>
-    <w:p>
-      <w:pPr>
-        <w:suppressAutoHyphens/>
-        <w:jc w:val="both"/>
-        <w:rPr>
-          <w:rFonts w:ascii="Calibri" w:hAnsi="Calibri"/>
-          <w:color w:val="000000" w:themeColor="text1"/>
-          <w:sz w:val="22"/>
-          <w:szCs w:val="22"/>
-        </w:rPr>
-      </w:pPr>
-      <w:r>
-        <w:rPr>
-          <w:rFonts w:ascii="Calibri" w:hAnsi="Calibri"/>
-          <w:color w:val="000000" w:themeColor="text1"/>
-          <w:sz w:val="22"/>
-          <w:szCs w:val="22"/>
-        </w:rPr>
-        <w:t xml:space="preserve"/>
-      </w:r>
-    </w:p>
-    <w:p>
-      <w:pPr>
-        <w:suppressAutoHyphens/>
-        <w:jc w:val="both"/>
-        <w:rPr>
-          <w:rFonts w:ascii="Calibri" w:hAnsi="Calibri"/>
-          <w:color w:val="000000" w:themeColor="text1"/>
-          <w:sz w:val="22"/>
-          <w:szCs w:val="22"/>
-        </w:rPr>
-      </w:pPr>
-      <w:r>
-        <w:rPr>
-          <w:rFonts w:ascii="Calibri" w:hAnsi="Calibri"/>
-          <w:color w:val="000000" w:themeColor="text1"/>
-          <w:sz w:val="22"/>
-          <w:szCs w:val="22"/>
-        </w:rPr>
-        <w:t xml:space="preserve"/>
-      </w:r>
-    </w:p>
-    <w:p>
-      <w:pPr>
-        <w:suppressAutoHyphens/>
-        <w:jc w:val="both"/>
-        <w:rPr>
-          <w:rFonts w:ascii="Calibri" w:hAnsi="Calibri"/>
-          <w:b/>
-          <w:bCs/>
-          <w:color w:val="000000" w:themeColor="text1"/>
-          <w:sz w:val="22"/>
-          <w:szCs w:val="22"/>
-        </w:rPr>
-      </w:pPr>
-      <w:r>
-        <w:rPr>
-          <w:rFonts w:ascii="Calibri" w:hAnsi="Calibri"/>
-          <w:b/>
-          <w:bCs/>
-          <w:color w:val="000000" w:themeColor="text1"/>
-          <w:sz w:val="22"/>
-          <w:szCs w:val="22"/>
-        </w:rPr>
-        <w:t xml:space="preserve">05'2004-03'2007 | A380 Aircraft Surveillance System (IHAS-ADIS)</w:t>
-      </w:r>
-    </w:p>
-    <w:p>
-      <w:pPr>
-        <w:suppressAutoHyphens/>
-        <w:jc w:val="both"/>
-        <w:rPr>
-          <w:rFonts w:ascii="Calibri" w:hAnsi="Calibri"/>
-          <w:b/>
-          <w:bCs/>
-          <w:color w:val="000000" w:themeColor="text1"/>
-          <w:sz w:val="22"/>
-          <w:szCs w:val="22"/>
-        </w:rPr>
-      </w:pPr>
-      <w:r>
-        <w:rPr>
-          <w:rFonts w:ascii="Calibri" w:hAnsi="Calibri"/>
-          <w:b/>
-          <w:bCs/>
-          <w:color w:val="000000" w:themeColor="text1"/>
-          <w:sz w:val="22"/>
-          <w:szCs w:val="22"/>
-        </w:rPr>
-        <w:t xml:space="preserve"/>
-      </w:r>
-      <w:r>
-        <w:rPr>
-          <w:rFonts w:ascii="Calibri" w:hAnsi="Calibri"/>
-          <w:b/>
-          <w:bCs/>
-          <w:color w:val="000000" w:themeColor="text1"/>
-          <w:sz w:val="22"/>
-          <w:szCs w:val="22"/>
-        </w:rPr>
-        <w:t xml:space="preserve"> | System Engineer</w:t>
-      </w:r>
-    </w:p>
-    <w:p>
-      <w:pPr>
-        <w:suppressAutoHyphens/>
-        <w:jc w:val="both"/>
-        <w:rPr>
-          <w:rFonts w:ascii="Calibri" w:hAnsi="Calibri"/>
-          <w:color w:val="000000" w:themeColor="text1"/>
-          <w:sz w:val="22"/>
-          <w:szCs w:val="22"/>
-        </w:rPr>
-      </w:pPr>
-    </w:p>
-    <w:p>
-      <w:pPr>
-        <w:suppressAutoHyphens/>
-        <w:jc w:val="both"/>
-        <w:rPr>
-          <w:rFonts w:ascii="Calibri" w:hAnsi="Calibri"/>
-          <w:color w:val="000000" w:themeColor="text1"/>
-          <w:sz w:val="22"/>
-          <w:szCs w:val="22"/>
-        </w:rPr>
-      </w:pPr>
-      <w:r>
-        <w:rPr>
-          <w:rFonts w:ascii="Calibri" w:hAnsi="Calibri"/>
-          <w:color w:val="000000" w:themeColor="text1"/>
-          <w:sz w:val="22"/>
-          <w:szCs w:val="22"/>
-        </w:rPr>
-        <w:t xml:space="preserve">Project description/summary: System Engineer (Testing) for A380 Aircraft Surveillance System (IHAS-ADIS) </w:t>
-      </w:r>
-    </w:p>
-    <w:p>
-      <w:pPr>
-        <w:suppressAutoHyphens/>
-        <w:jc w:val="both"/>
-        <w:rPr>
-          <w:rFonts w:ascii="Calibri" w:hAnsi="Calibri"/>
-          <w:color w:val="000000" w:themeColor="text1"/>
-          <w:sz w:val="22"/>
-          <w:szCs w:val="22"/>
-        </w:rPr>
-      </w:pPr>
-      <w:r>
-        <w:rPr>
-          <w:rFonts w:ascii="Calibri" w:hAnsi="Calibri"/>
-          <w:color w:val="000000" w:themeColor="text1"/>
-          <w:sz w:val="22"/>
-          <w:szCs w:val="22"/>
-        </w:rPr>
-        <w:t xml:space="preserve">Company’s role in the Project: </w:t>
-      </w:r>
-    </w:p>
-    <w:p>
-      <w:pPr>
-        <w:suppressAutoHyphens/>
-        <w:jc w:val="both"/>
-        <w:rPr>
-          <w:rFonts w:ascii="Calibri" w:hAnsi="Calibri"/>
-          <w:color w:val="000000" w:themeColor="text1"/>
-          <w:sz w:val="22"/>
-          <w:szCs w:val="22"/>
-        </w:rPr>
-      </w:pPr>
-      <w:r>
-        <w:rPr>
-          <w:rFonts w:ascii="Calibri" w:hAnsi="Calibri"/>
-          <w:color w:val="000000" w:themeColor="text1"/>
-          <w:sz w:val="22"/>
-          <w:szCs w:val="22"/>
-        </w:rPr>
-        <w:t xml:space="preserve">Value: </w:t>
-      </w:r>
-      <w:r>
-        <w:rPr>
-          <w:rFonts w:ascii="Calibri" w:hAnsi="Calibri"/>
-          <w:color w:val="000000" w:themeColor="text1"/>
-          <w:sz w:val="22"/>
-          <w:szCs w:val="22"/>
-        </w:rPr>
-        <w:t xml:space="preserve"/>
-      </w:r>
-    </w:p>
-    <w:p>
-      <w:pPr>
-        <w:suppressAutoHyphens/>
-        <w:jc w:val="both"/>
-        <w:rPr>
-          <w:rFonts w:ascii="Calibri" w:hAnsi="Calibri"/>
-          <w:color w:val="000000" w:themeColor="text1"/>
-          <w:sz w:val="22"/>
-          <w:szCs w:val="22"/>
-        </w:rPr>
-      </w:pPr>
-    </w:p>
-    <w:p>
-      <w:pPr>
-        <w:suppressAutoHyphens/>
-        <w:jc w:val="both"/>
-        <w:rPr>
-          <w:rFonts w:ascii="Calibri" w:hAnsi="Calibri"/>
-          <w:b/>
-          <w:bCs/>
-          <w:color w:val="000000" w:themeColor="text1"/>
-          <w:sz w:val="22"/>
-          <w:szCs w:val="22"/>
-        </w:rPr>
-      </w:pPr>
-      <w:r>
-        <w:rPr>
-          <w:rFonts w:ascii="Calibri" w:hAnsi="Calibri"/>
-          <w:b/>
-          <w:bCs/>
-          <w:color w:val="000000" w:themeColor="text1"/>
-          <w:sz w:val="22"/>
-          <w:szCs w:val="22"/>
-        </w:rPr>
-        <w:t>Responsibilities/Tasks:</w:t>
+        <w:t xml:space="preserve">Implemented Corporate QMS (Chorus 2.0 CPO, Tailoring, trainings, deployment etc.); ISO 9001 certification.</w:t>
       </w:r>
     </w:p>
     <w:p>
@@ -3711,7 +3039,7 @@
           <w:sz w:val="22"/>
           <w:szCs w:val="22"/>
         </w:rPr>
-        <w:t xml:space="preserve">System Engineer (Testing) for A380 Aircraft Surveillance System (IHAS-ADIS)</w:t>
+        <w:t xml:space="preserve">Planning: PQP, WMS/ITPs/Checklists for project including reviews and approvals of offset partner deliverables.</w:t>
       </w:r>
     </w:p>
     <w:p>
@@ -3758,7 +3086,1337 @@
           <w:sz w:val="22"/>
           <w:szCs w:val="22"/>
         </w:rPr>
-        <w:t xml:space="preserve">System Engineer (Testing) for Radar SDP - Light Combat Aircraft (Tejas)</w:t>
+        <w:t xml:space="preserve">Engineering QA: Gate reviews, Software sampling tests/Build Checks, CSAT, Quality Advice, Track Actions.</w:t>
+      </w:r>
+    </w:p>
+    <w:p>
+      <w:pPr>
+        <w:suppressAutoHyphens/>
+        <w:jc w:val="both"/>
+        <w:rPr>
+          <w:rFonts w:ascii="Calibri" w:hAnsi="Calibri"/>
+          <w:color w:val="000000" w:themeColor="text1"/>
+          <w:sz w:val="22"/>
+          <w:szCs w:val="22"/>
+        </w:rPr>
+      </w:pPr>
+      <w:r>
+        <w:rPr>
+          <w:rFonts w:ascii="Calibri" w:hAnsi="Calibri"/>
+          <w:color w:val="000000" w:themeColor="text1"/>
+          <w:sz w:val="22"/>
+          <w:szCs w:val="22"/>
+        </w:rPr>
+        <w:t xml:space="preserve"/>
+      </w:r>
+    </w:p>
+    <w:p>
+      <w:pPr>
+        <w:pStyle w:val="ListParagraph"/>
+        <w:numPr>
+          <w:ilvl w:val="0"/>
+          <w:numId w:val="8"/>
+        </w:numPr>
+        <w:suppressAutoHyphens/>
+        <w:jc w:val="both"/>
+        <w:rPr>
+          <w:rFonts w:ascii="Calibri" w:hAnsi="Calibri"/>
+          <w:color w:val="000000" w:themeColor="text1"/>
+          <w:sz w:val="22"/>
+          <w:szCs w:val="22"/>
+        </w:rPr>
+      </w:pPr>
+      <w:r>
+        <w:rPr>
+          <w:rFonts w:ascii="Calibri" w:hAnsi="Calibri"/>
+          <w:color w:val="000000" w:themeColor="text1"/>
+          <w:sz w:val="22"/>
+          <w:szCs w:val="22"/>
+        </w:rPr>
+        <w:t xml:space="preserve">Conducted Material inspections of aircraft parts and follow-up actions to closure with France team.</w:t>
+      </w:r>
+    </w:p>
+    <w:p>
+      <w:pPr>
+        <w:suppressAutoHyphens/>
+        <w:jc w:val="both"/>
+        <w:rPr>
+          <w:rFonts w:ascii="Calibri" w:hAnsi="Calibri"/>
+          <w:color w:val="000000" w:themeColor="text1"/>
+          <w:sz w:val="22"/>
+          <w:szCs w:val="22"/>
+        </w:rPr>
+      </w:pPr>
+      <w:r>
+        <w:rPr>
+          <w:rFonts w:ascii="Calibri" w:hAnsi="Calibri"/>
+          <w:color w:val="000000" w:themeColor="text1"/>
+          <w:sz w:val="22"/>
+          <w:szCs w:val="22"/>
+        </w:rPr>
+        <w:t xml:space="preserve"/>
+      </w:r>
+    </w:p>
+    <w:p>
+      <w:pPr>
+        <w:pStyle w:val="ListParagraph"/>
+        <w:numPr>
+          <w:ilvl w:val="0"/>
+          <w:numId w:val="8"/>
+        </w:numPr>
+        <w:suppressAutoHyphens/>
+        <w:jc w:val="both"/>
+        <w:rPr>
+          <w:rFonts w:ascii="Calibri" w:hAnsi="Calibri"/>
+          <w:color w:val="000000" w:themeColor="text1"/>
+          <w:sz w:val="22"/>
+          <w:szCs w:val="22"/>
+        </w:rPr>
+      </w:pPr>
+      <w:r>
+        <w:rPr>
+          <w:rFonts w:ascii="Calibri" w:hAnsi="Calibri"/>
+          <w:color w:val="000000" w:themeColor="text1"/>
+          <w:sz w:val="22"/>
+          <w:szCs w:val="22"/>
+        </w:rPr>
+        <w:t xml:space="preserve">Delivery Management: Inspections (Hardware, Software), raised/tracked NCRs/OBS/Snag list/Issued Alerts &amp; Veto.</w:t>
+      </w:r>
+    </w:p>
+    <w:p>
+      <w:pPr>
+        <w:suppressAutoHyphens/>
+        <w:jc w:val="both"/>
+        <w:rPr>
+          <w:rFonts w:ascii="Calibri" w:hAnsi="Calibri"/>
+          <w:color w:val="000000" w:themeColor="text1"/>
+          <w:sz w:val="22"/>
+          <w:szCs w:val="22"/>
+        </w:rPr>
+      </w:pPr>
+      <w:r>
+        <w:rPr>
+          <w:rFonts w:ascii="Calibri" w:hAnsi="Calibri"/>
+          <w:color w:val="000000" w:themeColor="text1"/>
+          <w:sz w:val="22"/>
+          <w:szCs w:val="22"/>
+        </w:rPr>
+        <w:t xml:space="preserve"/>
+      </w:r>
+    </w:p>
+    <w:p>
+      <w:pPr>
+        <w:pStyle w:val="ListParagraph"/>
+        <w:numPr>
+          <w:ilvl w:val="0"/>
+          <w:numId w:val="8"/>
+        </w:numPr>
+        <w:suppressAutoHyphens/>
+        <w:jc w:val="both"/>
+        <w:rPr>
+          <w:rFonts w:ascii="Calibri" w:hAnsi="Calibri"/>
+          <w:color w:val="000000" w:themeColor="text1"/>
+          <w:sz w:val="22"/>
+          <w:szCs w:val="22"/>
+        </w:rPr>
+      </w:pPr>
+      <w:r>
+        <w:rPr>
+          <w:rFonts w:ascii="Calibri" w:hAnsi="Calibri"/>
+          <w:color w:val="000000" w:themeColor="text1"/>
+          <w:sz w:val="22"/>
+          <w:szCs w:val="22"/>
+        </w:rPr>
+        <w:t xml:space="preserve">Reporting: QA/QC Situational Awareness: Issued NCRs &amp; Quality Advise with focus on Alerts and Veto for timely action.</w:t>
+      </w:r>
+    </w:p>
+    <w:p>
+      <w:pPr>
+        <w:suppressAutoHyphens/>
+        <w:jc w:val="both"/>
+        <w:rPr>
+          <w:rFonts w:ascii="Calibri" w:hAnsi="Calibri"/>
+          <w:color w:val="000000" w:themeColor="text1"/>
+          <w:sz w:val="22"/>
+          <w:szCs w:val="22"/>
+        </w:rPr>
+      </w:pPr>
+      <w:r>
+        <w:rPr>
+          <w:rFonts w:ascii="Calibri" w:hAnsi="Calibri"/>
+          <w:color w:val="000000" w:themeColor="text1"/>
+          <w:sz w:val="22"/>
+          <w:szCs w:val="22"/>
+        </w:rPr>
+        <w:t xml:space="preserve"/>
+      </w:r>
+    </w:p>
+    <w:p>
+      <w:pPr>
+        <w:suppressAutoHyphens/>
+        <w:jc w:val="both"/>
+        <w:rPr>
+          <w:rFonts w:ascii="Calibri" w:hAnsi="Calibri"/>
+          <w:color w:val="000000" w:themeColor="text1"/>
+          <w:sz w:val="22"/>
+          <w:szCs w:val="22"/>
+        </w:rPr>
+      </w:pPr>
+      <w:r>
+        <w:rPr>
+          <w:rFonts w:ascii="Calibri" w:hAnsi="Calibri"/>
+          <w:color w:val="000000" w:themeColor="text1"/>
+          <w:sz w:val="22"/>
+          <w:szCs w:val="22"/>
+        </w:rPr>
+        <w:t xml:space="preserve"/>
+      </w:r>
+    </w:p>
+    <w:p>
+      <w:pPr>
+        <w:suppressAutoHyphens/>
+        <w:jc w:val="both"/>
+        <w:rPr>
+          <w:rFonts w:ascii="Calibri" w:hAnsi="Calibri"/>
+          <w:b/>
+          <w:bCs/>
+          <w:color w:val="000000" w:themeColor="text1"/>
+          <w:sz w:val="22"/>
+          <w:szCs w:val="22"/>
+        </w:rPr>
+      </w:pPr>
+      <w:r>
+        <w:rPr>
+          <w:rFonts w:ascii="Calibri" w:hAnsi="Calibri"/>
+          <w:b/>
+          <w:bCs/>
+          <w:color w:val="000000" w:themeColor="text1"/>
+          <w:sz w:val="22"/>
+          <w:szCs w:val="22"/>
+        </w:rPr>
+        <w:t xml:space="preserve">10/2008-06/2012 | </w:t>
+      </w:r>
+    </w:p>
+    <w:p>
+      <w:pPr>
+        <w:suppressAutoHyphens/>
+        <w:jc w:val="both"/>
+        <w:rPr>
+          <w:rFonts w:ascii="Calibri" w:hAnsi="Calibri"/>
+          <w:b/>
+          <w:bCs/>
+          <w:color w:val="000000" w:themeColor="text1"/>
+          <w:sz w:val="22"/>
+          <w:szCs w:val="22"/>
+        </w:rPr>
+      </w:pPr>
+      <w:r>
+        <w:rPr>
+          <w:rFonts w:ascii="Calibri" w:hAnsi="Calibri"/>
+          <w:b/>
+          <w:bCs/>
+          <w:color w:val="000000" w:themeColor="text1"/>
+          <w:sz w:val="22"/>
+          <w:szCs w:val="22"/>
+        </w:rPr>
+        <w:t xml:space="preserve">Chennai</w:t>
+      </w:r>
+      <w:r>
+        <w:rPr>
+          <w:rFonts w:ascii="Calibri" w:hAnsi="Calibri"/>
+          <w:b/>
+          <w:bCs/>
+          <w:color w:val="000000" w:themeColor="text1"/>
+          <w:sz w:val="22"/>
+          <w:szCs w:val="22"/>
+        </w:rPr>
+        <w:t xml:space="preserve"> | Portfolio Quality Assurance Manager</w:t>
+      </w:r>
+    </w:p>
+    <w:p>
+      <w:pPr>
+        <w:suppressAutoHyphens/>
+        <w:jc w:val="both"/>
+        <w:rPr>
+          <w:rFonts w:ascii="Calibri" w:hAnsi="Calibri"/>
+          <w:color w:val="000000" w:themeColor="text1"/>
+          <w:sz w:val="22"/>
+          <w:szCs w:val="22"/>
+        </w:rPr>
+      </w:pPr>
+    </w:p>
+    <w:p>
+      <w:pPr>
+        <w:suppressAutoHyphens/>
+        <w:jc w:val="both"/>
+        <w:rPr>
+          <w:rFonts w:ascii="Calibri" w:hAnsi="Calibri"/>
+          <w:color w:val="000000" w:themeColor="text1"/>
+          <w:sz w:val="22"/>
+          <w:szCs w:val="22"/>
+        </w:rPr>
+      </w:pPr>
+      <w:r>
+        <w:rPr>
+          <w:rFonts w:ascii="Calibri" w:hAnsi="Calibri"/>
+          <w:color w:val="000000" w:themeColor="text1"/>
+          <w:sz w:val="22"/>
+          <w:szCs w:val="22"/>
+        </w:rPr>
+        <w:t xml:space="preserve">Project description/summary: Onshore role reporting to the Regional QHSE Director. </w:t>
+      </w:r>
+    </w:p>
+    <w:p>
+      <w:pPr>
+        <w:suppressAutoHyphens/>
+        <w:jc w:val="both"/>
+        <w:rPr>
+          <w:rFonts w:ascii="Calibri" w:hAnsi="Calibri"/>
+          <w:color w:val="000000" w:themeColor="text1"/>
+          <w:sz w:val="22"/>
+          <w:szCs w:val="22"/>
+        </w:rPr>
+      </w:pPr>
+      <w:r>
+        <w:rPr>
+          <w:rFonts w:ascii="Calibri" w:hAnsi="Calibri"/>
+          <w:color w:val="000000" w:themeColor="text1"/>
+          <w:sz w:val="22"/>
+          <w:szCs w:val="22"/>
+        </w:rPr>
+        <w:t xml:space="preserve">Company’s role in the Project: </w:t>
+      </w:r>
+    </w:p>
+    <w:p>
+      <w:pPr>
+        <w:suppressAutoHyphens/>
+        <w:jc w:val="both"/>
+        <w:rPr>
+          <w:rFonts w:ascii="Calibri" w:hAnsi="Calibri"/>
+          <w:color w:val="000000" w:themeColor="text1"/>
+          <w:sz w:val="22"/>
+          <w:szCs w:val="22"/>
+        </w:rPr>
+      </w:pPr>
+      <w:r>
+        <w:rPr>
+          <w:rFonts w:ascii="Calibri" w:hAnsi="Calibri"/>
+          <w:color w:val="000000" w:themeColor="text1"/>
+          <w:sz w:val="22"/>
+          <w:szCs w:val="22"/>
+        </w:rPr>
+        <w:t xml:space="preserve">Value: </w:t>
+      </w:r>
+      <w:r>
+        <w:rPr>
+          <w:rFonts w:ascii="Calibri" w:hAnsi="Calibri"/>
+          <w:color w:val="000000" w:themeColor="text1"/>
+          <w:sz w:val="22"/>
+          <w:szCs w:val="22"/>
+        </w:rPr>
+        <w:t xml:space="preserve"/>
+      </w:r>
+    </w:p>
+    <w:p>
+      <w:pPr>
+        <w:suppressAutoHyphens/>
+        <w:jc w:val="both"/>
+        <w:rPr>
+          <w:rFonts w:ascii="Calibri" w:hAnsi="Calibri"/>
+          <w:color w:val="000000" w:themeColor="text1"/>
+          <w:sz w:val="22"/>
+          <w:szCs w:val="22"/>
+        </w:rPr>
+      </w:pPr>
+    </w:p>
+    <w:p>
+      <w:pPr>
+        <w:suppressAutoHyphens/>
+        <w:jc w:val="both"/>
+        <w:rPr>
+          <w:rFonts w:ascii="Calibri" w:hAnsi="Calibri"/>
+          <w:b/>
+          <w:bCs/>
+          <w:color w:val="000000" w:themeColor="text1"/>
+          <w:sz w:val="22"/>
+          <w:szCs w:val="22"/>
+        </w:rPr>
+      </w:pPr>
+      <w:r>
+        <w:rPr>
+          <w:rFonts w:ascii="Calibri" w:hAnsi="Calibri"/>
+          <w:b/>
+          <w:bCs/>
+          <w:color w:val="000000" w:themeColor="text1"/>
+          <w:sz w:val="22"/>
+          <w:szCs w:val="22"/>
+        </w:rPr>
+        <w:t>Responsibilities/Tasks:</w:t>
+      </w:r>
+    </w:p>
+    <w:p>
+      <w:pPr>
+        <w:suppressAutoHyphens/>
+        <w:jc w:val="both"/>
+        <w:rPr>
+          <w:rFonts w:ascii="Calibri" w:hAnsi="Calibri"/>
+          <w:color w:val="000000" w:themeColor="text1"/>
+          <w:sz w:val="22"/>
+          <w:szCs w:val="22"/>
+        </w:rPr>
+      </w:pPr>
+      <w:r>
+        <w:rPr>
+          <w:rFonts w:ascii="Calibri" w:hAnsi="Calibri"/>
+          <w:color w:val="000000" w:themeColor="text1"/>
+          <w:sz w:val="22"/>
+          <w:szCs w:val="22"/>
+        </w:rPr>
+        <w:t xml:space="preserve"/>
+      </w:r>
+    </w:p>
+    <w:p>
+      <w:pPr>
+        <w:pStyle w:val="ListParagraph"/>
+        <w:numPr>
+          <w:ilvl w:val="0"/>
+          <w:numId w:val="8"/>
+        </w:numPr>
+        <w:suppressAutoHyphens/>
+        <w:jc w:val="both"/>
+        <w:rPr>
+          <w:rFonts w:ascii="Calibri" w:hAnsi="Calibri"/>
+          <w:color w:val="000000" w:themeColor="text1"/>
+          <w:sz w:val="22"/>
+          <w:szCs w:val="22"/>
+        </w:rPr>
+      </w:pPr>
+      <w:r>
+        <w:rPr>
+          <w:rFonts w:ascii="Calibri" w:hAnsi="Calibri"/>
+          <w:color w:val="000000" w:themeColor="text1"/>
+          <w:sz w:val="22"/>
+          <w:szCs w:val="22"/>
+        </w:rPr>
+        <w:t xml:space="preserve">QAQC Planning (PQP), WMS/SOPs, Inspections for the entity projects and Portfolios.</w:t>
+      </w:r>
+    </w:p>
+    <w:p>
+      <w:pPr>
+        <w:suppressAutoHyphens/>
+        <w:jc w:val="both"/>
+        <w:rPr>
+          <w:rFonts w:ascii="Calibri" w:hAnsi="Calibri"/>
+          <w:color w:val="000000" w:themeColor="text1"/>
+          <w:sz w:val="22"/>
+          <w:szCs w:val="22"/>
+        </w:rPr>
+      </w:pPr>
+      <w:r>
+        <w:rPr>
+          <w:rFonts w:ascii="Calibri" w:hAnsi="Calibri"/>
+          <w:color w:val="000000" w:themeColor="text1"/>
+          <w:sz w:val="22"/>
+          <w:szCs w:val="22"/>
+        </w:rPr>
+        <w:t xml:space="preserve"/>
+      </w:r>
+    </w:p>
+    <w:p>
+      <w:pPr>
+        <w:pStyle w:val="ListParagraph"/>
+        <w:numPr>
+          <w:ilvl w:val="0"/>
+          <w:numId w:val="8"/>
+        </w:numPr>
+        <w:suppressAutoHyphens/>
+        <w:jc w:val="both"/>
+        <w:rPr>
+          <w:rFonts w:ascii="Calibri" w:hAnsi="Calibri"/>
+          <w:color w:val="000000" w:themeColor="text1"/>
+          <w:sz w:val="22"/>
+          <w:szCs w:val="22"/>
+        </w:rPr>
+      </w:pPr>
+      <w:r>
+        <w:rPr>
+          <w:rFonts w:ascii="Calibri" w:hAnsi="Calibri"/>
+          <w:color w:val="000000" w:themeColor="text1"/>
+          <w:sz w:val="22"/>
+          <w:szCs w:val="22"/>
+        </w:rPr>
+        <w:t xml:space="preserve">Key involvement in Stage Gate reviews (PDR/CDR/FAI etc) (Equivalent to Design and FAT).</w:t>
+      </w:r>
+    </w:p>
+    <w:p>
+      <w:pPr>
+        <w:suppressAutoHyphens/>
+        <w:jc w:val="both"/>
+        <w:rPr>
+          <w:rFonts w:ascii="Calibri" w:hAnsi="Calibri"/>
+          <w:color w:val="000000" w:themeColor="text1"/>
+          <w:sz w:val="22"/>
+          <w:szCs w:val="22"/>
+        </w:rPr>
+      </w:pPr>
+      <w:r>
+        <w:rPr>
+          <w:rFonts w:ascii="Calibri" w:hAnsi="Calibri"/>
+          <w:color w:val="000000" w:themeColor="text1"/>
+          <w:sz w:val="22"/>
+          <w:szCs w:val="22"/>
+        </w:rPr>
+        <w:t xml:space="preserve"/>
+      </w:r>
+    </w:p>
+    <w:p>
+      <w:pPr>
+        <w:pStyle w:val="ListParagraph"/>
+        <w:numPr>
+          <w:ilvl w:val="0"/>
+          <w:numId w:val="8"/>
+        </w:numPr>
+        <w:suppressAutoHyphens/>
+        <w:jc w:val="both"/>
+        <w:rPr>
+          <w:rFonts w:ascii="Calibri" w:hAnsi="Calibri"/>
+          <w:color w:val="000000" w:themeColor="text1"/>
+          <w:sz w:val="22"/>
+          <w:szCs w:val="22"/>
+        </w:rPr>
+      </w:pPr>
+      <w:r>
+        <w:rPr>
+          <w:rFonts w:ascii="Calibri" w:hAnsi="Calibri"/>
+          <w:color w:val="000000" w:themeColor="text1"/>
+          <w:sz w:val="22"/>
+          <w:szCs w:val="22"/>
+        </w:rPr>
+        <w:t xml:space="preserve">QC auditor for Organisation and Product owner for Web based tools using Agile.</w:t>
+      </w:r>
+    </w:p>
+    <w:p>
+      <w:pPr>
+        <w:suppressAutoHyphens/>
+        <w:jc w:val="both"/>
+        <w:rPr>
+          <w:rFonts w:ascii="Calibri" w:hAnsi="Calibri"/>
+          <w:color w:val="000000" w:themeColor="text1"/>
+          <w:sz w:val="22"/>
+          <w:szCs w:val="22"/>
+        </w:rPr>
+      </w:pPr>
+      <w:r>
+        <w:rPr>
+          <w:rFonts w:ascii="Calibri" w:hAnsi="Calibri"/>
+          <w:color w:val="000000" w:themeColor="text1"/>
+          <w:sz w:val="22"/>
+          <w:szCs w:val="22"/>
+        </w:rPr>
+        <w:t xml:space="preserve"/>
+      </w:r>
+    </w:p>
+    <w:p>
+      <w:pPr>
+        <w:pStyle w:val="ListParagraph"/>
+        <w:numPr>
+          <w:ilvl w:val="0"/>
+          <w:numId w:val="8"/>
+        </w:numPr>
+        <w:suppressAutoHyphens/>
+        <w:jc w:val="both"/>
+        <w:rPr>
+          <w:rFonts w:ascii="Calibri" w:hAnsi="Calibri"/>
+          <w:color w:val="000000" w:themeColor="text1"/>
+          <w:sz w:val="22"/>
+          <w:szCs w:val="22"/>
+        </w:rPr>
+      </w:pPr>
+      <w:r>
+        <w:rPr>
+          <w:rFonts w:ascii="Calibri" w:hAnsi="Calibri"/>
+          <w:color w:val="000000" w:themeColor="text1"/>
+          <w:sz w:val="22"/>
+          <w:szCs w:val="22"/>
+        </w:rPr>
+        <w:t xml:space="preserve">Report: QA Advise, KPIs, PMR-WB review of projects, Critical alerts &amp; Veto, Lessons Learnt.</w:t>
+      </w:r>
+    </w:p>
+    <w:p>
+      <w:pPr>
+        <w:suppressAutoHyphens/>
+        <w:jc w:val="both"/>
+        <w:rPr>
+          <w:rFonts w:ascii="Calibri" w:hAnsi="Calibri"/>
+          <w:color w:val="000000" w:themeColor="text1"/>
+          <w:sz w:val="22"/>
+          <w:szCs w:val="22"/>
+        </w:rPr>
+      </w:pPr>
+      <w:r>
+        <w:rPr>
+          <w:rFonts w:ascii="Calibri" w:hAnsi="Calibri"/>
+          <w:color w:val="000000" w:themeColor="text1"/>
+          <w:sz w:val="22"/>
+          <w:szCs w:val="22"/>
+        </w:rPr>
+        <w:t xml:space="preserve"/>
+      </w:r>
+    </w:p>
+    <w:p>
+      <w:pPr>
+        <w:pStyle w:val="ListParagraph"/>
+        <w:numPr>
+          <w:ilvl w:val="0"/>
+          <w:numId w:val="8"/>
+        </w:numPr>
+        <w:suppressAutoHyphens/>
+        <w:jc w:val="both"/>
+        <w:rPr>
+          <w:rFonts w:ascii="Calibri" w:hAnsi="Calibri"/>
+          <w:color w:val="000000" w:themeColor="text1"/>
+          <w:sz w:val="22"/>
+          <w:szCs w:val="22"/>
+        </w:rPr>
+      </w:pPr>
+      <w:r>
+        <w:rPr>
+          <w:rFonts w:ascii="Calibri" w:hAnsi="Calibri"/>
+          <w:color w:val="000000" w:themeColor="text1"/>
+          <w:sz w:val="22"/>
+          <w:szCs w:val="22"/>
+        </w:rPr>
+        <w:t xml:space="preserve">Managed PIVS (Internal Audits) and track/facilitate the findings to Closure of CAR/NCR/OBS with RCA and actions.</w:t>
+      </w:r>
+    </w:p>
+    <w:p>
+      <w:pPr>
+        <w:suppressAutoHyphens/>
+        <w:jc w:val="both"/>
+        <w:rPr>
+          <w:rFonts w:ascii="Calibri" w:hAnsi="Calibri"/>
+          <w:color w:val="000000" w:themeColor="text1"/>
+          <w:sz w:val="22"/>
+          <w:szCs w:val="22"/>
+        </w:rPr>
+      </w:pPr>
+      <w:r>
+        <w:rPr>
+          <w:rFonts w:ascii="Calibri" w:hAnsi="Calibri"/>
+          <w:color w:val="000000" w:themeColor="text1"/>
+          <w:sz w:val="22"/>
+          <w:szCs w:val="22"/>
+        </w:rPr>
+        <w:t xml:space="preserve"/>
+      </w:r>
+    </w:p>
+    <w:p>
+      <w:pPr>
+        <w:suppressAutoHyphens/>
+        <w:jc w:val="both"/>
+        <w:rPr>
+          <w:rFonts w:ascii="Calibri" w:hAnsi="Calibri"/>
+          <w:color w:val="000000" w:themeColor="text1"/>
+          <w:sz w:val="22"/>
+          <w:szCs w:val="22"/>
+        </w:rPr>
+      </w:pPr>
+      <w:r>
+        <w:rPr>
+          <w:rFonts w:ascii="Calibri" w:hAnsi="Calibri"/>
+          <w:color w:val="000000" w:themeColor="text1"/>
+          <w:sz w:val="22"/>
+          <w:szCs w:val="22"/>
+        </w:rPr>
+        <w:t xml:space="preserve"/>
+      </w:r>
+    </w:p>
+    <w:p>
+      <w:pPr>
+        <w:suppressAutoHyphens/>
+        <w:jc w:val="both"/>
+        <w:rPr>
+          <w:rFonts w:ascii="Calibri" w:hAnsi="Calibri"/>
+          <w:b/>
+          <w:bCs/>
+          <w:color w:val="000000" w:themeColor="text1"/>
+          <w:sz w:val="22"/>
+          <w:szCs w:val="22"/>
+        </w:rPr>
+      </w:pPr>
+      <w:r>
+        <w:rPr>
+          <w:rFonts w:ascii="Calibri" w:hAnsi="Calibri"/>
+          <w:b/>
+          <w:bCs/>
+          <w:color w:val="000000" w:themeColor="text1"/>
+          <w:sz w:val="22"/>
+          <w:szCs w:val="22"/>
+        </w:rPr>
+        <w:t xml:space="preserve">04/2007-10/2008 | </w:t>
+      </w:r>
+    </w:p>
+    <w:p>
+      <w:pPr>
+        <w:suppressAutoHyphens/>
+        <w:jc w:val="both"/>
+        <w:rPr>
+          <w:rFonts w:ascii="Calibri" w:hAnsi="Calibri"/>
+          <w:b/>
+          <w:bCs/>
+          <w:color w:val="000000" w:themeColor="text1"/>
+          <w:sz w:val="22"/>
+          <w:szCs w:val="22"/>
+        </w:rPr>
+      </w:pPr>
+      <w:r>
+        <w:rPr>
+          <w:rFonts w:ascii="Calibri" w:hAnsi="Calibri"/>
+          <w:b/>
+          <w:bCs/>
+          <w:color w:val="000000" w:themeColor="text1"/>
+          <w:sz w:val="22"/>
+          <w:szCs w:val="22"/>
+        </w:rPr>
+        <w:t xml:space="preserve"/>
+      </w:r>
+      <w:r>
+        <w:rPr>
+          <w:rFonts w:ascii="Calibri" w:hAnsi="Calibri"/>
+          <w:b/>
+          <w:bCs/>
+          <w:color w:val="000000" w:themeColor="text1"/>
+          <w:sz w:val="22"/>
+          <w:szCs w:val="22"/>
+        </w:rPr>
+        <w:t xml:space="preserve"> | Engineering Technical Lead</w:t>
+      </w:r>
+    </w:p>
+    <w:p>
+      <w:pPr>
+        <w:suppressAutoHyphens/>
+        <w:jc w:val="both"/>
+        <w:rPr>
+          <w:rFonts w:ascii="Calibri" w:hAnsi="Calibri"/>
+          <w:color w:val="000000" w:themeColor="text1"/>
+          <w:sz w:val="22"/>
+          <w:szCs w:val="22"/>
+        </w:rPr>
+      </w:pPr>
+    </w:p>
+    <w:p>
+      <w:pPr>
+        <w:suppressAutoHyphens/>
+        <w:jc w:val="both"/>
+        <w:rPr>
+          <w:rFonts w:ascii="Calibri" w:hAnsi="Calibri"/>
+          <w:color w:val="000000" w:themeColor="text1"/>
+          <w:sz w:val="22"/>
+          <w:szCs w:val="22"/>
+        </w:rPr>
+      </w:pPr>
+      <w:r>
+        <w:rPr>
+          <w:rFonts w:ascii="Calibri" w:hAnsi="Calibri"/>
+          <w:color w:val="000000" w:themeColor="text1"/>
+          <w:sz w:val="22"/>
+          <w:szCs w:val="22"/>
+        </w:rPr>
+        <w:t xml:space="preserve">Project description/summary: Offshore role reporting to the Program Manager (A400M HMI projects). </w:t>
+      </w:r>
+    </w:p>
+    <w:p>
+      <w:pPr>
+        <w:suppressAutoHyphens/>
+        <w:jc w:val="both"/>
+        <w:rPr>
+          <w:rFonts w:ascii="Calibri" w:hAnsi="Calibri"/>
+          <w:color w:val="000000" w:themeColor="text1"/>
+          <w:sz w:val="22"/>
+          <w:szCs w:val="22"/>
+        </w:rPr>
+      </w:pPr>
+      <w:r>
+        <w:rPr>
+          <w:rFonts w:ascii="Calibri" w:hAnsi="Calibri"/>
+          <w:color w:val="000000" w:themeColor="text1"/>
+          <w:sz w:val="22"/>
+          <w:szCs w:val="22"/>
+        </w:rPr>
+        <w:t xml:space="preserve">Company’s role in the Project: </w:t>
+      </w:r>
+    </w:p>
+    <w:p>
+      <w:pPr>
+        <w:suppressAutoHyphens/>
+        <w:jc w:val="both"/>
+        <w:rPr>
+          <w:rFonts w:ascii="Calibri" w:hAnsi="Calibri"/>
+          <w:color w:val="000000" w:themeColor="text1"/>
+          <w:sz w:val="22"/>
+          <w:szCs w:val="22"/>
+        </w:rPr>
+      </w:pPr>
+      <w:r>
+        <w:rPr>
+          <w:rFonts w:ascii="Calibri" w:hAnsi="Calibri"/>
+          <w:color w:val="000000" w:themeColor="text1"/>
+          <w:sz w:val="22"/>
+          <w:szCs w:val="22"/>
+        </w:rPr>
+        <w:t xml:space="preserve">Value: </w:t>
+      </w:r>
+      <w:r>
+        <w:rPr>
+          <w:rFonts w:ascii="Calibri" w:hAnsi="Calibri"/>
+          <w:color w:val="000000" w:themeColor="text1"/>
+          <w:sz w:val="22"/>
+          <w:szCs w:val="22"/>
+        </w:rPr>
+        <w:t xml:space="preserve"/>
+      </w:r>
+    </w:p>
+    <w:p>
+      <w:pPr>
+        <w:suppressAutoHyphens/>
+        <w:jc w:val="both"/>
+        <w:rPr>
+          <w:rFonts w:ascii="Calibri" w:hAnsi="Calibri"/>
+          <w:color w:val="000000" w:themeColor="text1"/>
+          <w:sz w:val="22"/>
+          <w:szCs w:val="22"/>
+        </w:rPr>
+      </w:pPr>
+    </w:p>
+    <w:p>
+      <w:pPr>
+        <w:suppressAutoHyphens/>
+        <w:jc w:val="both"/>
+        <w:rPr>
+          <w:rFonts w:ascii="Calibri" w:hAnsi="Calibri"/>
+          <w:b/>
+          <w:bCs/>
+          <w:color w:val="000000" w:themeColor="text1"/>
+          <w:sz w:val="22"/>
+          <w:szCs w:val="22"/>
+        </w:rPr>
+      </w:pPr>
+      <w:r>
+        <w:rPr>
+          <w:rFonts w:ascii="Calibri" w:hAnsi="Calibri"/>
+          <w:b/>
+          <w:bCs/>
+          <w:color w:val="000000" w:themeColor="text1"/>
+          <w:sz w:val="22"/>
+          <w:szCs w:val="22"/>
+        </w:rPr>
+        <w:t>Responsibilities/Tasks:</w:t>
+      </w:r>
+    </w:p>
+    <w:p>
+      <w:pPr>
+        <w:suppressAutoHyphens/>
+        <w:jc w:val="both"/>
+        <w:rPr>
+          <w:rFonts w:ascii="Calibri" w:hAnsi="Calibri"/>
+          <w:color w:val="000000" w:themeColor="text1"/>
+          <w:sz w:val="22"/>
+          <w:szCs w:val="22"/>
+        </w:rPr>
+      </w:pPr>
+      <w:r>
+        <w:rPr>
+          <w:rFonts w:ascii="Calibri" w:hAnsi="Calibri"/>
+          <w:color w:val="000000" w:themeColor="text1"/>
+          <w:sz w:val="22"/>
+          <w:szCs w:val="22"/>
+        </w:rPr>
+        <w:t xml:space="preserve"/>
+      </w:r>
+    </w:p>
+    <w:p>
+      <w:pPr>
+        <w:pStyle w:val="ListParagraph"/>
+        <w:numPr>
+          <w:ilvl w:val="0"/>
+          <w:numId w:val="8"/>
+        </w:numPr>
+        <w:suppressAutoHyphens/>
+        <w:jc w:val="both"/>
+        <w:rPr>
+          <w:rFonts w:ascii="Calibri" w:hAnsi="Calibri"/>
+          <w:color w:val="000000" w:themeColor="text1"/>
+          <w:sz w:val="22"/>
+          <w:szCs w:val="22"/>
+        </w:rPr>
+      </w:pPr>
+      <w:r>
+        <w:rPr>
+          <w:rFonts w:ascii="Calibri" w:hAnsi="Calibri"/>
+          <w:color w:val="000000" w:themeColor="text1"/>
+          <w:sz w:val="22"/>
+          <w:szCs w:val="22"/>
+        </w:rPr>
+        <w:t xml:space="preserve">Project Initiation (France), planning, training (ADA language), execution, and monitoring control (client reporting).</w:t>
+      </w:r>
+    </w:p>
+    <w:p>
+      <w:pPr>
+        <w:suppressAutoHyphens/>
+        <w:jc w:val="both"/>
+        <w:rPr>
+          <w:rFonts w:ascii="Calibri" w:hAnsi="Calibri"/>
+          <w:color w:val="000000" w:themeColor="text1"/>
+          <w:sz w:val="22"/>
+          <w:szCs w:val="22"/>
+        </w:rPr>
+      </w:pPr>
+      <w:r>
+        <w:rPr>
+          <w:rFonts w:ascii="Calibri" w:hAnsi="Calibri"/>
+          <w:color w:val="000000" w:themeColor="text1"/>
+          <w:sz w:val="22"/>
+          <w:szCs w:val="22"/>
+        </w:rPr>
+        <w:t xml:space="preserve"/>
+      </w:r>
+    </w:p>
+    <w:p>
+      <w:pPr>
+        <w:pStyle w:val="ListParagraph"/>
+        <w:numPr>
+          <w:ilvl w:val="0"/>
+          <w:numId w:val="8"/>
+        </w:numPr>
+        <w:suppressAutoHyphens/>
+        <w:jc w:val="both"/>
+        <w:rPr>
+          <w:rFonts w:ascii="Calibri" w:hAnsi="Calibri"/>
+          <w:color w:val="000000" w:themeColor="text1"/>
+          <w:sz w:val="22"/>
+          <w:szCs w:val="22"/>
+        </w:rPr>
+      </w:pPr>
+      <w:r>
+        <w:rPr>
+          <w:rFonts w:ascii="Calibri" w:hAnsi="Calibri"/>
+          <w:color w:val="000000" w:themeColor="text1"/>
+          <w:sz w:val="22"/>
+          <w:szCs w:val="22"/>
+        </w:rPr>
+        <w:t xml:space="preserve">Requirement analysis, reviews, LLRs, design (CDS: HMI-GUI), coding (OOTH/DO178B), debug and unit testing.</w:t>
+      </w:r>
+    </w:p>
+    <w:p>
+      <w:pPr>
+        <w:suppressAutoHyphens/>
+        <w:jc w:val="both"/>
+        <w:rPr>
+          <w:rFonts w:ascii="Calibri" w:hAnsi="Calibri"/>
+          <w:color w:val="000000" w:themeColor="text1"/>
+          <w:sz w:val="22"/>
+          <w:szCs w:val="22"/>
+        </w:rPr>
+      </w:pPr>
+      <w:r>
+        <w:rPr>
+          <w:rFonts w:ascii="Calibri" w:hAnsi="Calibri"/>
+          <w:color w:val="000000" w:themeColor="text1"/>
+          <w:sz w:val="22"/>
+          <w:szCs w:val="22"/>
+        </w:rPr>
+        <w:t xml:space="preserve"/>
+      </w:r>
+    </w:p>
+    <w:p>
+      <w:pPr>
+        <w:pStyle w:val="ListParagraph"/>
+        <w:numPr>
+          <w:ilvl w:val="0"/>
+          <w:numId w:val="8"/>
+        </w:numPr>
+        <w:suppressAutoHyphens/>
+        <w:jc w:val="both"/>
+        <w:rPr>
+          <w:rFonts w:ascii="Calibri" w:hAnsi="Calibri"/>
+          <w:color w:val="000000" w:themeColor="text1"/>
+          <w:sz w:val="22"/>
+          <w:szCs w:val="22"/>
+        </w:rPr>
+      </w:pPr>
+      <w:r>
+        <w:rPr>
+          <w:rFonts w:ascii="Calibri" w:hAnsi="Calibri"/>
+          <w:color w:val="000000" w:themeColor="text1"/>
+          <w:sz w:val="22"/>
+          <w:szCs w:val="22"/>
+        </w:rPr>
+        <w:t xml:space="preserve">Pre- and post-delivery activities – CM audits, technical release audits (Software), RCA, KPI/Metrics and Analysis.</w:t>
+      </w:r>
+    </w:p>
+    <w:p>
+      <w:pPr>
+        <w:suppressAutoHyphens/>
+        <w:jc w:val="both"/>
+        <w:rPr>
+          <w:rFonts w:ascii="Calibri" w:hAnsi="Calibri"/>
+          <w:color w:val="000000" w:themeColor="text1"/>
+          <w:sz w:val="22"/>
+          <w:szCs w:val="22"/>
+        </w:rPr>
+      </w:pPr>
+      <w:r>
+        <w:rPr>
+          <w:rFonts w:ascii="Calibri" w:hAnsi="Calibri"/>
+          <w:color w:val="000000" w:themeColor="text1"/>
+          <w:sz w:val="22"/>
+          <w:szCs w:val="22"/>
+        </w:rPr>
+        <w:t xml:space="preserve"/>
+      </w:r>
+    </w:p>
+    <w:p>
+      <w:pPr>
+        <w:pStyle w:val="ListParagraph"/>
+        <w:numPr>
+          <w:ilvl w:val="0"/>
+          <w:numId w:val="8"/>
+        </w:numPr>
+        <w:suppressAutoHyphens/>
+        <w:jc w:val="both"/>
+        <w:rPr>
+          <w:rFonts w:ascii="Calibri" w:hAnsi="Calibri"/>
+          <w:color w:val="000000" w:themeColor="text1"/>
+          <w:sz w:val="22"/>
+          <w:szCs w:val="22"/>
+        </w:rPr>
+      </w:pPr>
+      <w:r>
+        <w:rPr>
+          <w:rFonts w:ascii="Calibri" w:hAnsi="Calibri"/>
+          <w:color w:val="000000" w:themeColor="text1"/>
+          <w:sz w:val="22"/>
+          <w:szCs w:val="22"/>
+        </w:rPr>
+        <w:t xml:space="preserve">Key member of Innovation council, Interview panel and training automation.</w:t>
+      </w:r>
+    </w:p>
+    <w:p>
+      <w:pPr>
+        <w:suppressAutoHyphens/>
+        <w:jc w:val="both"/>
+        <w:rPr>
+          <w:rFonts w:ascii="Calibri" w:hAnsi="Calibri"/>
+          <w:color w:val="000000" w:themeColor="text1"/>
+          <w:sz w:val="22"/>
+          <w:szCs w:val="22"/>
+        </w:rPr>
+      </w:pPr>
+      <w:r>
+        <w:rPr>
+          <w:rFonts w:ascii="Calibri" w:hAnsi="Calibri"/>
+          <w:color w:val="000000" w:themeColor="text1"/>
+          <w:sz w:val="22"/>
+          <w:szCs w:val="22"/>
+        </w:rPr>
+        <w:t xml:space="preserve"/>
+      </w:r>
+    </w:p>
+    <w:p>
+      <w:pPr>
+        <w:suppressAutoHyphens/>
+        <w:jc w:val="both"/>
+        <w:rPr>
+          <w:rFonts w:ascii="Calibri" w:hAnsi="Calibri"/>
+          <w:color w:val="000000" w:themeColor="text1"/>
+          <w:sz w:val="22"/>
+          <w:szCs w:val="22"/>
+        </w:rPr>
+      </w:pPr>
+      <w:r>
+        <w:rPr>
+          <w:rFonts w:ascii="Calibri" w:hAnsi="Calibri"/>
+          <w:color w:val="000000" w:themeColor="text1"/>
+          <w:sz w:val="22"/>
+          <w:szCs w:val="22"/>
+        </w:rPr>
+        <w:t xml:space="preserve"/>
+      </w:r>
+    </w:p>
+    <w:p>
+      <w:pPr>
+        <w:suppressAutoHyphens/>
+        <w:jc w:val="both"/>
+        <w:rPr>
+          <w:rFonts w:ascii="Calibri" w:hAnsi="Calibri"/>
+          <w:b/>
+          <w:bCs/>
+          <w:color w:val="000000" w:themeColor="text1"/>
+          <w:sz w:val="22"/>
+          <w:szCs w:val="22"/>
+        </w:rPr>
+      </w:pPr>
+      <w:r>
+        <w:rPr>
+          <w:rFonts w:ascii="Calibri" w:hAnsi="Calibri"/>
+          <w:b/>
+          <w:bCs/>
+          <w:color w:val="000000" w:themeColor="text1"/>
+          <w:sz w:val="22"/>
+          <w:szCs w:val="22"/>
+        </w:rPr>
+        <w:t xml:space="preserve">11/2003-03/2007 | </w:t>
+      </w:r>
+    </w:p>
+    <w:p>
+      <w:pPr>
+        <w:suppressAutoHyphens/>
+        <w:jc w:val="both"/>
+        <w:rPr>
+          <w:rFonts w:ascii="Calibri" w:hAnsi="Calibri"/>
+          <w:b/>
+          <w:bCs/>
+          <w:color w:val="000000" w:themeColor="text1"/>
+          <w:sz w:val="22"/>
+          <w:szCs w:val="22"/>
+        </w:rPr>
+      </w:pPr>
+      <w:r>
+        <w:rPr>
+          <w:rFonts w:ascii="Calibri" w:hAnsi="Calibri"/>
+          <w:b/>
+          <w:bCs/>
+          <w:color w:val="000000" w:themeColor="text1"/>
+          <w:sz w:val="22"/>
+          <w:szCs w:val="22"/>
+        </w:rPr>
+        <w:t xml:space="preserve"/>
+      </w:r>
+      <w:r>
+        <w:rPr>
+          <w:rFonts w:ascii="Calibri" w:hAnsi="Calibri"/>
+          <w:b/>
+          <w:bCs/>
+          <w:color w:val="000000" w:themeColor="text1"/>
+          <w:sz w:val="22"/>
+          <w:szCs w:val="22"/>
+        </w:rPr>
+        <w:t xml:space="preserve"> | System Engineer</w:t>
+      </w:r>
+    </w:p>
+    <w:p>
+      <w:pPr>
+        <w:suppressAutoHyphens/>
+        <w:jc w:val="both"/>
+        <w:rPr>
+          <w:rFonts w:ascii="Calibri" w:hAnsi="Calibri"/>
+          <w:color w:val="000000" w:themeColor="text1"/>
+          <w:sz w:val="22"/>
+          <w:szCs w:val="22"/>
+        </w:rPr>
+      </w:pPr>
+    </w:p>
+    <w:p>
+      <w:pPr>
+        <w:suppressAutoHyphens/>
+        <w:jc w:val="both"/>
+        <w:rPr>
+          <w:rFonts w:ascii="Calibri" w:hAnsi="Calibri"/>
+          <w:color w:val="000000" w:themeColor="text1"/>
+          <w:sz w:val="22"/>
+          <w:szCs w:val="22"/>
+        </w:rPr>
+      </w:pPr>
+      <w:r>
+        <w:rPr>
+          <w:rFonts w:ascii="Calibri" w:hAnsi="Calibri"/>
+          <w:color w:val="000000" w:themeColor="text1"/>
+          <w:sz w:val="22"/>
+          <w:szCs w:val="22"/>
+        </w:rPr>
+        <w:t xml:space="preserve">Project description/summary: System Engineer for ADA/DRDO/HAL: MMR-SDP System Testing, Signal simulator (H/W &amp; S/W) using FPGAs. </w:t>
+      </w:r>
+    </w:p>
+    <w:p>
+      <w:pPr>
+        <w:suppressAutoHyphens/>
+        <w:jc w:val="both"/>
+        <w:rPr>
+          <w:rFonts w:ascii="Calibri" w:hAnsi="Calibri"/>
+          <w:color w:val="000000" w:themeColor="text1"/>
+          <w:sz w:val="22"/>
+          <w:szCs w:val="22"/>
+        </w:rPr>
+      </w:pPr>
+      <w:r>
+        <w:rPr>
+          <w:rFonts w:ascii="Calibri" w:hAnsi="Calibri"/>
+          <w:color w:val="000000" w:themeColor="text1"/>
+          <w:sz w:val="22"/>
+          <w:szCs w:val="22"/>
+        </w:rPr>
+        <w:t xml:space="preserve">Company’s role in the Project: </w:t>
+      </w:r>
+    </w:p>
+    <w:p>
+      <w:pPr>
+        <w:suppressAutoHyphens/>
+        <w:jc w:val="both"/>
+        <w:rPr>
+          <w:rFonts w:ascii="Calibri" w:hAnsi="Calibri"/>
+          <w:color w:val="000000" w:themeColor="text1"/>
+          <w:sz w:val="22"/>
+          <w:szCs w:val="22"/>
+        </w:rPr>
+      </w:pPr>
+      <w:r>
+        <w:rPr>
+          <w:rFonts w:ascii="Calibri" w:hAnsi="Calibri"/>
+          <w:color w:val="000000" w:themeColor="text1"/>
+          <w:sz w:val="22"/>
+          <w:szCs w:val="22"/>
+        </w:rPr>
+        <w:t xml:space="preserve">Value: </w:t>
+      </w:r>
+      <w:r>
+        <w:rPr>
+          <w:rFonts w:ascii="Calibri" w:hAnsi="Calibri"/>
+          <w:color w:val="000000" w:themeColor="text1"/>
+          <w:sz w:val="22"/>
+          <w:szCs w:val="22"/>
+        </w:rPr>
+        <w:t xml:space="preserve"/>
+      </w:r>
+    </w:p>
+    <w:p>
+      <w:pPr>
+        <w:suppressAutoHyphens/>
+        <w:jc w:val="both"/>
+        <w:rPr>
+          <w:rFonts w:ascii="Calibri" w:hAnsi="Calibri"/>
+          <w:color w:val="000000" w:themeColor="text1"/>
+          <w:sz w:val="22"/>
+          <w:szCs w:val="22"/>
+        </w:rPr>
+      </w:pPr>
+    </w:p>
+    <w:p>
+      <w:pPr>
+        <w:suppressAutoHyphens/>
+        <w:jc w:val="both"/>
+        <w:rPr>
+          <w:rFonts w:ascii="Calibri" w:hAnsi="Calibri"/>
+          <w:b/>
+          <w:bCs/>
+          <w:color w:val="000000" w:themeColor="text1"/>
+          <w:sz w:val="22"/>
+          <w:szCs w:val="22"/>
+        </w:rPr>
+      </w:pPr>
+      <w:r>
+        <w:rPr>
+          <w:rFonts w:ascii="Calibri" w:hAnsi="Calibri"/>
+          <w:b/>
+          <w:bCs/>
+          <w:color w:val="000000" w:themeColor="text1"/>
+          <w:sz w:val="22"/>
+          <w:szCs w:val="22"/>
+        </w:rPr>
+        <w:t>Responsibilities/Tasks:</w:t>
+      </w:r>
+    </w:p>
+    <w:p>
+      <w:pPr>
+        <w:suppressAutoHyphens/>
+        <w:jc w:val="both"/>
+        <w:rPr>
+          <w:rFonts w:ascii="Calibri" w:hAnsi="Calibri"/>
+          <w:color w:val="000000" w:themeColor="text1"/>
+          <w:sz w:val="22"/>
+          <w:szCs w:val="22"/>
+        </w:rPr>
+      </w:pPr>
+      <w:r>
+        <w:rPr>
+          <w:rFonts w:ascii="Calibri" w:hAnsi="Calibri"/>
+          <w:color w:val="000000" w:themeColor="text1"/>
+          <w:sz w:val="22"/>
+          <w:szCs w:val="22"/>
+        </w:rPr>
+        <w:t xml:space="preserve"/>
+      </w:r>
+    </w:p>
+    <w:p>
+      <w:pPr>
+        <w:pStyle w:val="ListParagraph"/>
+        <w:numPr>
+          <w:ilvl w:val="0"/>
+          <w:numId w:val="8"/>
+        </w:numPr>
+        <w:suppressAutoHyphens/>
+        <w:jc w:val="both"/>
+        <w:rPr>
+          <w:rFonts w:ascii="Calibri" w:hAnsi="Calibri"/>
+          <w:color w:val="000000" w:themeColor="text1"/>
+          <w:sz w:val="22"/>
+          <w:szCs w:val="22"/>
+        </w:rPr>
+      </w:pPr>
+      <w:r>
+        <w:rPr>
+          <w:rFonts w:ascii="Calibri" w:hAnsi="Calibri"/>
+          <w:color w:val="000000" w:themeColor="text1"/>
+          <w:sz w:val="22"/>
+          <w:szCs w:val="22"/>
+        </w:rPr>
+        <w:t xml:space="preserve">System Engineer (Testing) for A380 Aircraft Surveillance System (IHAS-ADIS).</w:t>
+      </w:r>
+    </w:p>
+    <w:p>
+      <w:pPr>
+        <w:suppressAutoHyphens/>
+        <w:jc w:val="both"/>
+        <w:rPr>
+          <w:rFonts w:ascii="Calibri" w:hAnsi="Calibri"/>
+          <w:color w:val="000000" w:themeColor="text1"/>
+          <w:sz w:val="22"/>
+          <w:szCs w:val="22"/>
+        </w:rPr>
+      </w:pPr>
+      <w:r>
+        <w:rPr>
+          <w:rFonts w:ascii="Calibri" w:hAnsi="Calibri"/>
+          <w:color w:val="000000" w:themeColor="text1"/>
+          <w:sz w:val="22"/>
+          <w:szCs w:val="22"/>
+        </w:rPr>
+        <w:t xml:space="preserve"/>
+      </w:r>
+    </w:p>
+    <w:p>
+      <w:pPr>
+        <w:pStyle w:val="ListParagraph"/>
+        <w:numPr>
+          <w:ilvl w:val="0"/>
+          <w:numId w:val="8"/>
+        </w:numPr>
+        <w:suppressAutoHyphens/>
+        <w:jc w:val="both"/>
+        <w:rPr>
+          <w:rFonts w:ascii="Calibri" w:hAnsi="Calibri"/>
+          <w:color w:val="000000" w:themeColor="text1"/>
+          <w:sz w:val="22"/>
+          <w:szCs w:val="22"/>
+        </w:rPr>
+      </w:pPr>
+      <w:r>
+        <w:rPr>
+          <w:rFonts w:ascii="Calibri" w:hAnsi="Calibri"/>
+          <w:color w:val="000000" w:themeColor="text1"/>
+          <w:sz w:val="22"/>
+          <w:szCs w:val="22"/>
+        </w:rPr>
+        <w:t xml:space="preserve">System Engineer (Testing) for Radar SDP - Light Combat Aircraft (Tejas).</w:t>
       </w:r>
     </w:p>
     <w:p>

</xml_diff>

<commit_message>
final commit for branch
</commit_message>
<xml_diff>
--- a/outputs/Kiran_CV.docx
+++ b/outputs/Kiran_CV.docx
@@ -563,7 +563,7 @@
               <w:rPr>
                 <w:color w:val="000000" w:themeColor="text1"/>
               </w:rPr>
-              <w:t xml:space="preserve">Pune, Qatar, France, Italy, Portugal, USA, Middle-East, China, India</w:t>
+              <w:t xml:space="preserve">Pune, Qatar, France, Italy, Portugal, USA, China, India</w:t>
             </w:r>
           </w:p>
         </w:tc>
@@ -713,6 +713,22 @@
               <w:rPr>
                 <w:color w:val="000000" w:themeColor="text1"/>
               </w:rPr>
+              <w:t xml:space="preserve">ISO 14K/45K Certifications</w:t>
+            </w:r>
+          </w:p>
+          <w:p>
+            <w:pPr>
+              <w:pStyle w:val="SideBarText"/>
+              <w:spacing w:line="240" w:lineRule="auto"/>
+              <w:jc w:val="both"/>
+              <w:rPr>
+                <w:color w:val="000000" w:themeColor="text1"/>
+              </w:rPr>
+            </w:pPr>
+            <w:r>
+              <w:rPr>
+                <w:color w:val="000000" w:themeColor="text1"/>
+              </w:rPr>
               <w:t xml:space="preserve">ASQ Membership, American Society for Quality</w:t>
             </w:r>
           </w:p>
@@ -825,7 +841,7 @@
           <w:sz w:val="22"/>
           <w:szCs w:val="22"/>
         </w:rPr>
-        <w:t xml:space="preserve">22 years of experience in Transportation (Metro Rail Systems) and Avionics Systems (Defence). 7+ years in Metro Rail projects, including 5 years in Pune as Senior QAQC Expert for Pune Metro Rail Project. 13 years in Avionics projects. Significant achievements include leading over 150 IMS audits and implementing corporate QMS and standards specified by ISO 9000.</w:t>
+        <w:t xml:space="preserve">22 years of experience in Transportation (Metro Rail Systems) and Avionics Systems (Defence). 7+ years in Metro Rail projects, including 5 years in Pune as Senior QAQC Expert for Pune Metro Rail Project. 13 years in Avionics projects with significant roles in quality assurance and control. Proven track record in leading quality teams and driving organizational QHSE initiatives across various projects.</w:t>
       </w:r>
     </w:p>
     <w:p>
@@ -905,7 +921,7 @@
           <w:sz w:val="22"/>
           <w:szCs w:val="22"/>
         </w:rPr>
-        <w:t xml:space="preserve">10/2024 till date | </w:t>
+        <w:t xml:space="preserve">10`2024 till date | </w:t>
       </w:r>
     </w:p>
     <w:p>
@@ -974,7 +990,7 @@
           <w:sz w:val="22"/>
           <w:szCs w:val="22"/>
         </w:rPr>
-        <w:t xml:space="preserve">Project description/summary: Quality Assurance Specialist for PMC, Supplier, Transport/Avionics Project related activities. </w:t>
+        <w:t xml:space="preserve">Project description/summary: Freelancer - PMC, Supplier, Transport/Avionics Project related activities. </w:t>
       </w:r>
     </w:p>
     <w:p>
@@ -1223,7 +1239,7 @@
           <w:sz w:val="22"/>
           <w:szCs w:val="22"/>
         </w:rPr>
-        <w:t xml:space="preserve">09/2019-09/2024 | Pune Metro Rail</w:t>
+        <w:t xml:space="preserve">09'2019-09'2024 | Pune Metro Rail</w:t>
       </w:r>
     </w:p>
     <w:p>
@@ -1427,7 +1443,7 @@
           <w:sz w:val="22"/>
           <w:szCs w:val="22"/>
         </w:rPr>
-        <w:t xml:space="preserve">Customer facing role with 14+ Contractor Quality teams to manage (Initialise, Monitoring &amp; Control).</w:t>
+        <w:t xml:space="preserve">Customer facing role with 14+ Contractor Quality teams to manage (Initialize, Monitoring &amp; Control).</w:t>
       </w:r>
     </w:p>
     <w:p>
@@ -1474,7 +1490,7 @@
           <w:sz w:val="22"/>
           <w:szCs w:val="22"/>
         </w:rPr>
-        <w:t xml:space="preserve">Established, Tailored &amp; Maintain internal QMS(Manual); Approved Contractors' QMS, Mentor/Trained teams.</w:t>
+        <w:t xml:space="preserve">Established, Tailored &amp; Maintain internal QMS (Manual); Approved Contractors' QMS, Mentor/Trained teams.</w:t>
       </w:r>
     </w:p>
     <w:p>
@@ -1521,7 +1537,7 @@
           <w:sz w:val="22"/>
           <w:szCs w:val="22"/>
         </w:rPr>
-        <w:t xml:space="preserve">Approved QA/QC plans(+MS/ITP/Checklists), QA/QC resources based on expertise review.</w:t>
+        <w:t xml:space="preserve">Approved QA/QC plans (+MS/ITP/Checklists), QA/QC resources based on expertise review.</w:t>
       </w:r>
     </w:p>
     <w:p>
@@ -1823,7 +1839,7 @@
           <w:sz w:val="22"/>
           <w:szCs w:val="22"/>
         </w:rPr>
-        <w:t xml:space="preserve">03/2018-08/2019 | </w:t>
+        <w:t xml:space="preserve">03'2018-08'2019 | </w:t>
       </w:r>
     </w:p>
     <w:p>
@@ -2188,7 +2204,7 @@
           <w:sz w:val="22"/>
           <w:szCs w:val="22"/>
         </w:rPr>
-        <w:t xml:space="preserve">01/2016-02/2018 | Lusail Rail</w:t>
+        <w:t xml:space="preserve">01'2016-02'2018 | Lusail Rail</w:t>
       </w:r>
     </w:p>
     <w:p>
@@ -2788,7 +2804,7 @@
           <w:sz w:val="22"/>
           <w:szCs w:val="22"/>
         </w:rPr>
-        <w:t xml:space="preserve">07/2012-01/2016 | Mirage 2000 Aircraft Upgrade</w:t>
+        <w:t xml:space="preserve">07'2012-01'2016 | Avionics Project (M2K upgrade)</w:t>
       </w:r>
     </w:p>
     <w:p>
@@ -3294,7 +3310,7 @@
           <w:sz w:val="22"/>
           <w:szCs w:val="22"/>
         </w:rPr>
-        <w:t xml:space="preserve">10/2008-06/2012 | </w:t>
+        <w:t xml:space="preserve">10'2008-06'2012 | Avionics Project Portfolio</w:t>
       </w:r>
     </w:p>
     <w:p>
@@ -3753,7 +3769,7 @@
           <w:sz w:val="22"/>
           <w:szCs w:val="22"/>
         </w:rPr>
-        <w:t xml:space="preserve">04/2007-10/2008 | </w:t>
+        <w:t xml:space="preserve">04'2007-10'2008 | A400M HMI projects</w:t>
       </w:r>
     </w:p>
     <w:p>
@@ -3822,7 +3838,7 @@
           <w:sz w:val="22"/>
           <w:szCs w:val="22"/>
         </w:rPr>
-        <w:t xml:space="preserve">Project description/summary: Offshore role reporting to the Program Manager (A400M HMI projects). </w:t>
+        <w:t xml:space="preserve">Project description/summary: Offshore role reporting to the Program Manager. </w:t>
       </w:r>
     </w:p>
     <w:p>
@@ -4165,7 +4181,7 @@
           <w:sz w:val="22"/>
           <w:szCs w:val="22"/>
         </w:rPr>
-        <w:t xml:space="preserve">11/2003-03/2007 | </w:t>
+        <w:t xml:space="preserve">11'2003-03'2007 | A380 Aircraft Surveillance System</w:t>
       </w:r>
     </w:p>
     <w:p>
@@ -4234,7 +4250,7 @@
           <w:sz w:val="22"/>
           <w:szCs w:val="22"/>
         </w:rPr>
-        <w:t xml:space="preserve">Project description/summary: System Engineer for ADA/DRDO/HAL: MMR-SDP System Testing, Signal simulator (H/W &amp; S/W) using FPGAs. </w:t>
+        <w:t xml:space="preserve">Project description/summary: System Engineer (Testing) for A380 Aircraft Surveillance System (IHAS-ADIS). </w:t>
       </w:r>
     </w:p>
     <w:p>
@@ -4323,53 +4339,6 @@
           <w:szCs w:val="22"/>
         </w:rPr>
         <w:t>Responsibilities/Tasks:</w:t>
-      </w:r>
-    </w:p>
-    <w:p>
-      <w:pPr>
-        <w:suppressAutoHyphens/>
-        <w:jc w:val="both"/>
-        <w:rPr>
-          <w:rFonts w:ascii="Calibri" w:hAnsi="Calibri"/>
-          <w:color w:val="000000" w:themeColor="text1"/>
-          <w:sz w:val="22"/>
-          <w:szCs w:val="22"/>
-        </w:rPr>
-      </w:pPr>
-      <w:r>
-        <w:rPr>
-          <w:rFonts w:ascii="Calibri" w:hAnsi="Calibri"/>
-          <w:color w:val="000000" w:themeColor="text1"/>
-          <w:sz w:val="22"/>
-          <w:szCs w:val="22"/>
-        </w:rPr>
-        <w:t xml:space="preserve"/>
-      </w:r>
-    </w:p>
-    <w:p>
-      <w:pPr>
-        <w:pStyle w:val="ListParagraph"/>
-        <w:numPr>
-          <w:ilvl w:val="0"/>
-          <w:numId w:val="8"/>
-        </w:numPr>
-        <w:suppressAutoHyphens/>
-        <w:jc w:val="both"/>
-        <w:rPr>
-          <w:rFonts w:ascii="Calibri" w:hAnsi="Calibri"/>
-          <w:color w:val="000000" w:themeColor="text1"/>
-          <w:sz w:val="22"/>
-          <w:szCs w:val="22"/>
-        </w:rPr>
-      </w:pPr>
-      <w:r>
-        <w:rPr>
-          <w:rFonts w:ascii="Calibri" w:hAnsi="Calibri"/>
-          <w:color w:val="000000" w:themeColor="text1"/>
-          <w:sz w:val="22"/>
-          <w:szCs w:val="22"/>
-        </w:rPr>
-        <w:t xml:space="preserve">System Engineer (Testing) for A380 Aircraft Surveillance System (IHAS-ADIS).</w:t>
       </w:r>
     </w:p>
     <w:p>

</xml_diff>

<commit_message>
batch processor - 2
</commit_message>
<xml_diff>
--- a/outputs/Kiran_CV.docx
+++ b/outputs/Kiran_CV.docx
@@ -563,7 +563,7 @@
               <w:rPr>
                 <w:color w:val="000000" w:themeColor="text1"/>
               </w:rPr>
-              <w:t xml:space="preserve">Pune, Qatar, France, Italy, Portugal, USA, China, India</w:t>
+              <w:t xml:space="preserve">Pune, Qatar, France, Italy, Portugal, USA, Middle-East, China, India</w:t>
             </w:r>
           </w:p>
         </w:tc>
@@ -713,22 +713,6 @@
               <w:rPr>
                 <w:color w:val="000000" w:themeColor="text1"/>
               </w:rPr>
-              <w:t xml:space="preserve">ISO 14K/45K Certifications</w:t>
-            </w:r>
-          </w:p>
-          <w:p>
-            <w:pPr>
-              <w:pStyle w:val="SideBarText"/>
-              <w:spacing w:line="240" w:lineRule="auto"/>
-              <w:jc w:val="both"/>
-              <w:rPr>
-                <w:color w:val="000000" w:themeColor="text1"/>
-              </w:rPr>
-            </w:pPr>
-            <w:r>
-              <w:rPr>
-                <w:color w:val="000000" w:themeColor="text1"/>
-              </w:rPr>
               <w:t xml:space="preserve">ASQ Membership, American Society for Quality</w:t>
             </w:r>
           </w:p>
@@ -841,7 +825,7 @@
           <w:sz w:val="22"/>
           <w:szCs w:val="22"/>
         </w:rPr>
-        <w:t xml:space="preserve">22 years of experience in Transportation (Metro Rail Systems) and Avionics Systems (Defence). 7+ years in Metro Rail projects, including 5 years in Pune as Senior QAQC Expert for Pune Metro Rail Project. 13 years in Avionics projects with significant roles in quality assurance and control. Proven track record in leading quality teams and driving organizational QHSE initiatives across various projects.</w:t>
+        <w:t xml:space="preserve">22 years of experience in Transportation (Metro Rail Systems) and Avionics Systems (Defence). 7+ years in Metro Rail projects, including 5 years in Pune as Senior QAQC Expert for Pune Metro Rail Project. 13 years in Avionics projects. Proven track record in leading quality teams and driving organizational QHSE initiatives. Recognized for quality awards from Thales group and Honeywell.</w:t>
       </w:r>
     </w:p>
     <w:p>
@@ -990,28 +974,28 @@
           <w:sz w:val="22"/>
           <w:szCs w:val="22"/>
         </w:rPr>
-        <w:t xml:space="preserve">Project description/summary: Freelancer - PMC, Supplier, Transport/Avionics Project related activities. </w:t>
-      </w:r>
-    </w:p>
-    <w:p>
-      <w:pPr>
-        <w:suppressAutoHyphens/>
-        <w:jc w:val="both"/>
-        <w:rPr>
-          <w:rFonts w:ascii="Calibri" w:hAnsi="Calibri"/>
-          <w:color w:val="000000" w:themeColor="text1"/>
-          <w:sz w:val="22"/>
-          <w:szCs w:val="22"/>
-        </w:rPr>
-      </w:pPr>
-      <w:r>
-        <w:rPr>
-          <w:rFonts w:ascii="Calibri" w:hAnsi="Calibri"/>
-          <w:color w:val="000000" w:themeColor="text1"/>
-          <w:sz w:val="22"/>
-          <w:szCs w:val="22"/>
-        </w:rPr>
-        <w:t xml:space="preserve">Company’s role in the Project: </w:t>
+        <w:t xml:space="preserve">Project description/summary: Involved in PMC, Supplier, Transport/Avionics project-related activities. </w:t>
+      </w:r>
+    </w:p>
+    <w:p>
+      <w:pPr>
+        <w:suppressAutoHyphens/>
+        <w:jc w:val="both"/>
+        <w:rPr>
+          <w:rFonts w:ascii="Calibri" w:hAnsi="Calibri"/>
+          <w:color w:val="000000" w:themeColor="text1"/>
+          <w:sz w:val="22"/>
+          <w:szCs w:val="22"/>
+        </w:rPr>
+      </w:pPr>
+      <w:r>
+        <w:rPr>
+          <w:rFonts w:ascii="Calibri" w:hAnsi="Calibri"/>
+          <w:color w:val="000000" w:themeColor="text1"/>
+          <w:sz w:val="22"/>
+          <w:szCs w:val="22"/>
+        </w:rPr>
+        <w:t xml:space="preserve">Company’s role in the Project: PMC</w:t>
       </w:r>
     </w:p>
     <w:p>
@@ -1275,7 +1259,7 @@
           <w:sz w:val="22"/>
           <w:szCs w:val="22"/>
         </w:rPr>
-        <w:t xml:space="preserve"> | Senior Quality Assurance Expert (SQAE)</w:t>
+        <w:t xml:space="preserve"> | Senior QA/QC Expert (Systems)</w:t>
       </w:r>
     </w:p>
     <w:p>
@@ -1490,7 +1474,7 @@
           <w:sz w:val="22"/>
           <w:szCs w:val="22"/>
         </w:rPr>
-        <w:t xml:space="preserve">Established, Tailored &amp; Maintain internal QMS (Manual); Approved Contractors' QMS, Mentor/Trained teams.</w:t>
+        <w:t xml:space="preserve">Established, tailored &amp; maintained internal QMS (Manual); Approved Contractors' QMS, Mentor/Trained teams.</w:t>
       </w:r>
     </w:p>
     <w:p>
@@ -1908,28 +1892,28 @@
           <w:sz w:val="22"/>
           <w:szCs w:val="22"/>
         </w:rPr>
-        <w:t xml:space="preserve">Project description/summary: Organisational Quality and Customer Excellence role, reporting to the Managing Director. </w:t>
-      </w:r>
-    </w:p>
-    <w:p>
-      <w:pPr>
-        <w:suppressAutoHyphens/>
-        <w:jc w:val="both"/>
-        <w:rPr>
-          <w:rFonts w:ascii="Calibri" w:hAnsi="Calibri"/>
-          <w:color w:val="000000" w:themeColor="text1"/>
-          <w:sz w:val="22"/>
-          <w:szCs w:val="22"/>
-        </w:rPr>
-      </w:pPr>
-      <w:r>
-        <w:rPr>
-          <w:rFonts w:ascii="Calibri" w:hAnsi="Calibri"/>
-          <w:color w:val="000000" w:themeColor="text1"/>
-          <w:sz w:val="22"/>
-          <w:szCs w:val="22"/>
-        </w:rPr>
-        <w:t xml:space="preserve">Company’s role in the Project: </w:t>
+        <w:t xml:space="preserve">Project description/summary: Organizational Quality and Customer Excellence role, reporting to the Managing Director. </w:t>
+      </w:r>
+    </w:p>
+    <w:p>
+      <w:pPr>
+        <w:suppressAutoHyphens/>
+        <w:jc w:val="both"/>
+        <w:rPr>
+          <w:rFonts w:ascii="Calibri" w:hAnsi="Calibri"/>
+          <w:color w:val="000000" w:themeColor="text1"/>
+          <w:sz w:val="22"/>
+          <w:szCs w:val="22"/>
+        </w:rPr>
+      </w:pPr>
+      <w:r>
+        <w:rPr>
+          <w:rFonts w:ascii="Calibri" w:hAnsi="Calibri"/>
+          <w:color w:val="000000" w:themeColor="text1"/>
+          <w:sz w:val="22"/>
+          <w:szCs w:val="22"/>
+        </w:rPr>
+        <w:t xml:space="preserve">Company’s role in the Project: Startup Venture</w:t>
       </w:r>
     </w:p>
     <w:p>
@@ -2294,7 +2278,7 @@
           <w:sz w:val="22"/>
           <w:szCs w:val="22"/>
         </w:rPr>
-        <w:t xml:space="preserve">Company’s role in the Project: </w:t>
+        <w:t xml:space="preserve">Company’s role in the Project: Offshore-Onshore</w:t>
       </w:r>
     </w:p>
     <w:p>
@@ -2804,7 +2788,7 @@
           <w:sz w:val="22"/>
           <w:szCs w:val="22"/>
         </w:rPr>
-        <w:t xml:space="preserve">07'2012-01'2016 | Avionics Project (M2K upgrade)</w:t>
+        <w:t xml:space="preserve">07'2012-01'2016 | Mirage 2000 Aircraft Upgrade</w:t>
       </w:r>
     </w:p>
     <w:p>
@@ -2894,7 +2878,7 @@
           <w:sz w:val="22"/>
           <w:szCs w:val="22"/>
         </w:rPr>
-        <w:t xml:space="preserve">Company’s role in the Project: </w:t>
+        <w:t xml:space="preserve">Company’s role in the Project: Onshore</w:t>
       </w:r>
     </w:p>
     <w:p>
@@ -3310,7 +3294,7 @@
           <w:sz w:val="22"/>
           <w:szCs w:val="22"/>
         </w:rPr>
-        <w:t xml:space="preserve">10'2008-06'2012 | Avionics Project Portfolio</w:t>
+        <w:t xml:space="preserve">10'2008-06'2012 | </w:t>
       </w:r>
     </w:p>
     <w:p>
@@ -3400,7 +3384,7 @@
           <w:sz w:val="22"/>
           <w:szCs w:val="22"/>
         </w:rPr>
-        <w:t xml:space="preserve">Company’s role in the Project: </w:t>
+        <w:t xml:space="preserve">Company’s role in the Project: Onshore</w:t>
       </w:r>
     </w:p>
     <w:p>
@@ -3769,7 +3753,7 @@
           <w:sz w:val="22"/>
           <w:szCs w:val="22"/>
         </w:rPr>
-        <w:t xml:space="preserve">04'2007-10'2008 | A400M HMI projects</w:t>
+        <w:t xml:space="preserve">04'2007-10'2008 | </w:t>
       </w:r>
     </w:p>
     <w:p>
@@ -3838,28 +3822,28 @@
           <w:sz w:val="22"/>
           <w:szCs w:val="22"/>
         </w:rPr>
-        <w:t xml:space="preserve">Project description/summary: Offshore role reporting to the Program Manager. </w:t>
-      </w:r>
-    </w:p>
-    <w:p>
-      <w:pPr>
-        <w:suppressAutoHyphens/>
-        <w:jc w:val="both"/>
-        <w:rPr>
-          <w:rFonts w:ascii="Calibri" w:hAnsi="Calibri"/>
-          <w:color w:val="000000" w:themeColor="text1"/>
-          <w:sz w:val="22"/>
-          <w:szCs w:val="22"/>
-        </w:rPr>
-      </w:pPr>
-      <w:r>
-        <w:rPr>
-          <w:rFonts w:ascii="Calibri" w:hAnsi="Calibri"/>
-          <w:color w:val="000000" w:themeColor="text1"/>
-          <w:sz w:val="22"/>
-          <w:szCs w:val="22"/>
-        </w:rPr>
-        <w:t xml:space="preserve">Company’s role in the Project: </w:t>
+        <w:t xml:space="preserve">Project description/summary: Offshore role reporting to the Program Manager (A400M HMI projects). </w:t>
+      </w:r>
+    </w:p>
+    <w:p>
+      <w:pPr>
+        <w:suppressAutoHyphens/>
+        <w:jc w:val="both"/>
+        <w:rPr>
+          <w:rFonts w:ascii="Calibri" w:hAnsi="Calibri"/>
+          <w:color w:val="000000" w:themeColor="text1"/>
+          <w:sz w:val="22"/>
+          <w:szCs w:val="22"/>
+        </w:rPr>
+      </w:pPr>
+      <w:r>
+        <w:rPr>
+          <w:rFonts w:ascii="Calibri" w:hAnsi="Calibri"/>
+          <w:color w:val="000000" w:themeColor="text1"/>
+          <w:sz w:val="22"/>
+          <w:szCs w:val="22"/>
+        </w:rPr>
+        <w:t xml:space="preserve">Company’s role in the Project: Offshore</w:t>
       </w:r>
     </w:p>
     <w:p>
@@ -4181,7 +4165,7 @@
           <w:sz w:val="22"/>
           <w:szCs w:val="22"/>
         </w:rPr>
-        <w:t xml:space="preserve">11'2003-03'2007 | A380 Aircraft Surveillance System</w:t>
+        <w:t xml:space="preserve">11'2003-03'2007 | </w:t>
       </w:r>
     </w:p>
     <w:p>
@@ -4250,7 +4234,7 @@
           <w:sz w:val="22"/>
           <w:szCs w:val="22"/>
         </w:rPr>
-        <w:t xml:space="preserve">Project description/summary: System Engineer (Testing) for A380 Aircraft Surveillance System (IHAS-ADIS). </w:t>
+        <w:t xml:space="preserve">Project description/summary: System Engineer for ADA/DRDO/HAL: MMR-SDP System Testing, Signal simulator (H/W &amp; S/W) using FPGAs. </w:t>
       </w:r>
     </w:p>
     <w:p>
@@ -4339,6 +4323,53 @@
           <w:szCs w:val="22"/>
         </w:rPr>
         <w:t>Responsibilities/Tasks:</w:t>
+      </w:r>
+    </w:p>
+    <w:p>
+      <w:pPr>
+        <w:suppressAutoHyphens/>
+        <w:jc w:val="both"/>
+        <w:rPr>
+          <w:rFonts w:ascii="Calibri" w:hAnsi="Calibri"/>
+          <w:color w:val="000000" w:themeColor="text1"/>
+          <w:sz w:val="22"/>
+          <w:szCs w:val="22"/>
+        </w:rPr>
+      </w:pPr>
+      <w:r>
+        <w:rPr>
+          <w:rFonts w:ascii="Calibri" w:hAnsi="Calibri"/>
+          <w:color w:val="000000" w:themeColor="text1"/>
+          <w:sz w:val="22"/>
+          <w:szCs w:val="22"/>
+        </w:rPr>
+        <w:t xml:space="preserve"/>
+      </w:r>
+    </w:p>
+    <w:p>
+      <w:pPr>
+        <w:pStyle w:val="ListParagraph"/>
+        <w:numPr>
+          <w:ilvl w:val="0"/>
+          <w:numId w:val="8"/>
+        </w:numPr>
+        <w:suppressAutoHyphens/>
+        <w:jc w:val="both"/>
+        <w:rPr>
+          <w:rFonts w:ascii="Calibri" w:hAnsi="Calibri"/>
+          <w:color w:val="000000" w:themeColor="text1"/>
+          <w:sz w:val="22"/>
+          <w:szCs w:val="22"/>
+        </w:rPr>
+      </w:pPr>
+      <w:r>
+        <w:rPr>
+          <w:rFonts w:ascii="Calibri" w:hAnsi="Calibri"/>
+          <w:color w:val="000000" w:themeColor="text1"/>
+          <w:sz w:val="22"/>
+          <w:szCs w:val="22"/>
+        </w:rPr>
+        <w:t xml:space="preserve">System Engineer (Testing) for A380 Aircraft Surveillance System (IHAS-ADIS).</w:t>
       </w:r>
     </w:p>
     <w:p>

</xml_diff>